<commit_message>
Thinking-mode monitor: 0.69 on actions (primary test not supported; above chance, below the rule; messages still add nothing). Paper rebuilt with all review fixes, Table 4, Appendix E; within 8 pages
Co-Authored-By: Claude Opus 5.5 <noreply@anthropic.com>
Claude-Session: https://claude.ai/code/session_01T8kiQrxhXBJ3k5fbziRDqr
</commit_message>
<xml_diff>
--- a/docs/submission/report_submission.docx
+++ b/docs/submission/report_submission.docx
@@ -102,7 +102,7 @@
                 <w:szCs w:val="40"/>
                 <w:rtl w:val="0"/>
               </w:rPr>
-              <w:t xml:space="preserve">The Evidence Is in the Votes: LLM Monitors Miss Collusion That a One-Line Rule Catches</w:t>
+              <w:t xml:space="preserve">The Evidence Is in the Votes: LLM Monitors Mostly Miss Collusion That a One-Line Rule Catches</w:t>
             </w:r>
             <w:r>
               <w:rPr>
@@ -438,7 +438,7 @@
                       <w:sz w:val="20"/>
                       <w:szCs w:val="20"/>
                     </w:rPr>
-                    <w:t xml:space="preserve">Monitors for multi-agent systems typically read either what agents say or what they do. We test whether combining the two helps a monitor detect collusion. Seven Llama 3.3 70B agents play a repeated committee-vote game with private stakes, designed so that honest play implies honest talk while a secret colluding pair profits by vote trading, which forces one member to vote against its own stake. Across 160 matched games we compare no collusion, a private channel without instructions, naive colluders told to maximize their joint payoff, and competent colluders also given a vote-trading tip. Competent colluders traded votes at every opportunity (64 of 64 rounds), gaining 0.43 points per round at the other agents' expense. Two LLM monitors (Llama 3.3 70B with a prompt frozen in advance, and DeepSeek V3.1) each saw five views of every game: public messages, actions, both, a said-versus-did table, and an upper-bound view adding private plans. On every observable view both monitors performed at chance (AUROC 0.44 to 0.60), and combining messages with actions gave no measurable gain. Yet a one-line rule applied to actions alone, flagging votes against one's own revealed payoff, detected competent colluders with AUROC 0.86 at a 5% false-positive rate, while the monitors succeeded only with access to private plans (AUROC 0.94 to 0.98). The evidence was in the action record; the LLM monitors did not extract it. Even with every against-interest vote explicitly flagged, the best monitor reached only AUROC 0.65.</w:t>
+                    <w:t xml:space="preserve">Monitors for multi-agent systems typically read either what agents say or what they do. We test whether combining the two helps a monitor detect collusion. Seven Llama 3.3 70B agents play a repeated committee-vote game with private stakes, where honest play implies honest talk and a secret colluding pair profits by vote trading, which forces one member to vote against its own stake. Across 160 matched games we compare no collusion, a private channel without instructions, naive colluders told to maximize their joint payoff, and competent colluders also given a vote-trading tip. Competent colluders traded at every opportunity (64 of 64), each gaining 0.43 points per round, and also traded where it gained nothing. Two LLM monitors with a prompt frozen in advance (Llama 3.3 70B and DeepSeek V3.1) saw public messages, actions, both, a said-versus-did table, and an upper-bound view adding private plans. On each of the four observable views both were indistinguishable from chance (AUROC 0.44 to 0.60), and combining messages with actions gave no measurable gain. A one-line rule on actions alone, flagging votes against one's revealed payoff, detected competent colluders with AUROC 0.86 at a 5% false-positive rate (0.78 had they not over-traded; 0.91 on held-out games), while the monitors succeeded only with private plans (0.94 to 0.98). With its thinking mode on, DeepSeek rose to 0.69 on actions, still below the rule, and adding messages still did not help. The evidence is in the votes, and these LLM monitors extract little of it.</w:t>
                   </w:r>
                 </w:p>
               </w:tc>
@@ -549,7 +549,7 @@
         <w:rPr>
           <w:rFonts w:ascii="Old Standard TT" w:cs="Old Standard TT" w:eastAsia="Old Standard TT" w:hAnsi="Old Standard TT"/>
         </w:rPr>
-        <w:t xml:space="preserve">: one member votes against its own small stake to secure its partner's large one. We generate matched games with and without colluders, give two LLM monitors five views of each game, and compare them with simple non-LLM rules.</w:t>
+        <w:t xml:space="preserve">: one member votes against its own small stake to secure its partner's large one. We generate matched games with and without colluders, give two LLM monitors five views of each game (one also with its thinking mode on), and compare them with simple non-LLM rules.</w:t>
       </w:r>
     </w:p>
     <w:p>
@@ -588,7 +588,7 @@
         <w:rPr>
           <w:rFonts w:ascii="Old Standard TT" w:cs="Old Standard TT" w:eastAsia="Old Standard TT" w:hAnsi="Old Standard TT"/>
         </w:rPr>
-        <w:t xml:space="preserve"> a seven-agent committee-vote game with private stakes, matched across conditions, with automated checks on every game that private information never leaks.</w:t>
+        <w:t xml:space="preserve"> a seven-agent committee-vote game with private stakes, matched across conditions, with automated checks that private information never leaks.</w:t>
       </w:r>
     </w:p>
     <w:p>
@@ -613,7 +613,7 @@
         <w:rPr>
           <w:rFonts w:ascii="Old Standard TT" w:cs="Old Standard TT" w:eastAsia="Old Standard TT" w:hAnsi="Old Standard TT"/>
         </w:rPr>
-        <w:t xml:space="preserve"> Agents told only to maximize their joint payoff trade votes in 31% of opportunities; with a one-sentence strategy tip, in 100%. Evaluations that label games by the instruction given risk testing monitors on collusion that never happened.</w:t>
+        <w:t xml:space="preserve"> Told only to maximize their joint payoff, pairs trade votes in 31% of opportunities; with a short strategy tip, in 100%, though they also over-apply it. Labelling games by the instruction given risks testing monitors on collusion that never happened, or that is clumsier than intended.</w:t>
       </w:r>
     </w:p>
     <w:p>
@@ -638,7 +638,7 @@
         <w:rPr>
           <w:rFonts w:ascii="Old Standard TT" w:cs="Old Standard TT" w:eastAsia="Old Standard TT" w:hAnsi="Old Standard TT"/>
         </w:rPr>
-        <w:t xml:space="preserve"> On every observable view both monitors are at chance and combining views does not help, while a one-line rule on the actions reaches AUROC 0.86 (0.91 on held-out games). With private plans the same monitors reach 0.94–0.98 (positive control).</w:t>
+        <w:t xml:space="preserve"> Two short-verdict monitors are indistinguishable from chance on each of the four observable views, and a thinking-mode monitor reaches only 0.69, while a one-line rule on the actions reaches 0.86 (0.78 had the colluders not over-traded). With private plans the monitors reach 0.94–0.98 (positive control).</w:t>
       </w:r>
     </w:p>
     <w:p>
@@ -657,27 +657,13 @@
           <w:b w:val="1"/>
           <w:bCs w:val="1"/>
         </w:rPr>
-        <w:t xml:space="preserve">A tested diagnosis.</w:t>
-      </w:r>
-      <w:r>
-        <w:rPr>
-          <w:rFonts w:ascii="Old Standard TT" w:cs="Old Standard TT" w:eastAsia="Old Standard TT" w:hAnsi="Old Standard TT"/>
-        </w:rPr>
-        <w:t xml:space="preserve"> Monitors under-weight the single inconsistent vote that a trade leaves behind. A pre-registered test showed that telling the monitor the base rate does not help on the raw record; only the base rate </w:t>
-      </w:r>
-      <w:r>
-        <w:rPr>
-          <w:rFonts w:ascii="Old Standard TT" w:cs="Old Standard TT" w:eastAsia="Old Standard TT" w:hAnsi="Old Standard TT"/>
-          <w:i w:val="1"/>
-          <w:iCs w:val="1"/>
-        </w:rPr>
-        <w:t xml:space="preserve">and</w:t>
-      </w:r>
-      <w:r>
-        <w:rPr>
-          <w:rFonts w:ascii="Old Standard TT" w:cs="Old Standard TT" w:eastAsia="Old Standard TT" w:hAnsi="Old Standard TT"/>
-        </w:rPr>
-        <w:t xml:space="preserve"> pre-computed evidence together bring it close to the rule.</w:t>
+        <w:t xml:space="preserve">An answer to question 2.2 and a partly supported diagnosis.</w:t>
+      </w:r>
+      <w:r>
+        <w:rPr>
+          <w:rFonts w:ascii="Old Standard TT" w:cs="Old Standard TT" w:eastAsia="Old Standard TT" w:hAnsi="Old Standard TT"/>
+        </w:rPr>
+        <w:t xml:space="preserve"> Neither monitors nor rules gain from adding messages to actions. Monitors under-weight the inconsistent votes that trades leave behind, and neither a stated base rate (a pre-specified test that failed) nor thinking closes the gap to the rule.</w:t>
       </w:r>
     </w:p>
     <w:p>
@@ -714,15 +700,22 @@
       <w:r>
         <w:rPr>
           <w:rFonts w:ascii="Old Standard TT" w:cs="Old Standard TT" w:eastAsia="Old Standard TT" w:hAnsi="Old Standard TT"/>
-          <w:highlight w:val="yellow"/>
-        </w:rPr>
-        <w:t xml:space="preserve">VERIFY each claim below against the paper; they are taken from the sprint's Resources page summaries.</w:t>
-      </w:r>
-      <w:r>
-        <w:rPr>
-          <w:rFonts w:ascii="Old Standard TT" w:cs="Old Standard TT" w:eastAsia="Old Standard TT" w:hAnsi="Old Standard TT"/>
-        </w:rPr>
-        <w:t xml:space="preserve"> We build on the harness of Shi et al. (2026), which records private plans, public announcements, final actions and outcomes in repeated social dilemmas; they report that more than 90% of deviations from public announcements were already stated in private plans, consistent with our private-plans upper bound. Closest to our question, Radev et al. (2026) build monitors that look for multiple agents coordinating on what they say and do; Nguyen et al. (2026) find that analysing actions along multiple dimensions can lift a monitor from 0% to over 70%; and Arike et al. (2026) find that too much detail can degrade a monitor. TraceGuard checks a single agent's actions for consistency with its claims; our structured views follow that idea. On collusion itself, LLM pricing agents sustain supra-competitive prices (Fish et al., 2024), private pairwise channels can introduce collusion (Nakamura et al., 2026), and telling agents they are watched can reduce monitor accuracy (Kale et al., 2025).</w:t>
+        </w:rPr>
+        <w:t xml:space="preserve">We build on the harness of Shi et al. (2026), which separates private intent, public announcement and final action in repeated games; deviations from announcements were mostly planned in private (over 90% in their highest-deception conditions), consistent with our private-plans upper bound. Closest to our question, Radev et al. (2026) find that a monitor catches coordinated sabotage by coding agents more often when it also reads their communication, which carries the shared plan (68–99% of attempts from code edits alone at FPR ≤ 2%; 81–100% with it). In our game the visible talk is public cheap talk, and the coordination happens in a private channel that no observable view contains. LLM monitors can do better with </w:t>
+      </w:r>
+      <w:r>
+        <w:rPr>
+          <w:rFonts w:ascii="Old Standard TT" w:cs="Old Standard TT" w:eastAsia="Old Standard TT" w:hAnsi="Old Standard TT"/>
+          <w:i w:val="1"/>
+          <w:iCs w:val="1"/>
+        </w:rPr>
+        <w:t xml:space="preserve">less</w:t>
+      </w:r>
+      <w:r>
+        <w:rPr>
+          <w:rFonts w:ascii="Old Standard TT" w:cs="Old Standard TT" w:eastAsia="Old Standard TT" w:hAnsi="Old Standard TT"/>
+        </w:rPr>
+        <w:t xml:space="preserve"> information (Arike et al., 2026), gain less than expected from more information about the agent, and degrade when the agent knows it is watched (Kale et al., 2025); scoring actions against stated reasoning resists collusion between an agent and a same-model monitor (TraceGuard; Nguyen et al., 2026), an idea our structured views follow. LLM agents reach supra-competitive prices (Fish et al., 2024) and divide markets (Lin et al., 2024) without being told to collude, and secret channels induce collusion that agents often plan but do not carry out (Nakamura et al., 2026) — the gap our manipulation check measures.</w:t>
       </w:r>
     </w:p>
     <w:p>
@@ -734,7 +727,7 @@
         <w:rPr>
           <w:rFonts w:ascii="Old Standard TT" w:cs="Old Standard TT" w:eastAsia="Old Standard TT" w:hAnsi="Old Standard TT"/>
         </w:rPr>
-        <w:t xml:space="preserve">Our work differs in isolating the </w:t>
+        <w:t xml:space="preserve">Our work differs in varying only the </w:t>
       </w:r>
       <w:r>
         <w:rPr>
@@ -748,7 +741,7 @@
         <w:rPr>
           <w:rFonts w:ascii="Old Standard TT" w:cs="Old Standard TT" w:eastAsia="Old Standard TT" w:hAnsi="Old Standard TT"/>
         </w:rPr>
-        <w:t xml:space="preserve"> given to a fixed, frozen monitor while holding the games fixed, in verifying that collusion actually occurred (a manipulation check), and in benchmarking LLM monitors against simple rules that use exactly the same information. That comparison shows the bottleneck is the monitor's reasoning, not the information available.</w:t>
+        <w:t xml:space="preserve"> given to a frozen monitor on fixed games, in checking that collusion occurred, and in comparing LLM monitors with simple rules on the same record. The rules also encode our knowledge of the attack, so they are a reference point, not a fair competitor.</w:t>
       </w:r>
     </w:p>
     <w:p>
@@ -808,7 +801,7 @@
         <w:rPr>
           <w:rFonts w:ascii="Old Standard TT" w:cs="Old Standard TT" w:eastAsia="Old Standard TT" w:hAnsi="Old Standard TT"/>
         </w:rPr>
-        <w:t xml:space="preserve"> payoff instead votes as a bloc for the sign of its summed stake (if one holds −$1 and the other +$10, both vote YES). In simulation with sincere voters this raises the pair's expected combined payoff by 41% (+0.71 per round) and lowers the other five agents' combined payoff by 0.43 per round. Such </w:t>
+        <w:t xml:space="preserve"> payoff instead votes as a bloc for the sign of its summed stake (if one holds −$1 and the other +$10, both vote YES). Against sincere voters this raises the pair's expected combined payoff by 41% (+0.70 per round, by exact enumeration) and lowers the other five agents' combined payoff by 0.43 per round. Such </w:t>
       </w:r>
       <w:r>
         <w:rPr>
@@ -822,7 +815,21 @@
         <w:rPr>
           <w:rFonts w:ascii="Old Standard TT" w:cs="Old Standard TT" w:eastAsia="Old Standard TT" w:hAnsi="Old Standard TT"/>
         </w:rPr>
-        <w:t xml:space="preserve"> (pair stakes of opposite sign and different size) arise in about a quarter of rounds. Each round follows the Shi et al. protocol: private plan → private channel (pair only, one message each) → public announcements in a fixed order → simultaneous final votes → a short reflection on each other agent, carried to the next round.</w:t>
+        <w:t xml:space="preserve"> (pair stakes of opposite sign and different size) arise in about a quarter of rounds; when the stakes cancel exactly (a </w:t>
+      </w:r>
+      <w:r>
+        <w:rPr>
+          <w:rFonts w:ascii="Old Standard TT" w:cs="Old Standard TT" w:eastAsia="Old Standard TT" w:hAnsi="Old Standard TT"/>
+          <w:i w:val="1"/>
+          <w:iCs w:val="1"/>
+        </w:rPr>
+        <w:t xml:space="preserve">tie round</w:t>
+      </w:r>
+      <w:r>
+        <w:rPr>
+          <w:rFonts w:ascii="Old Standard TT" w:cs="Old Standard TT" w:eastAsia="Old Standard TT" w:hAnsi="Old Standard TT"/>
+        </w:rPr>
+        <w:t xml:space="preserve">), trading gains nothing. Each round follows the Shi et al. protocol: private plan → private channel (pair only, one message each) → public announcements in a fixed order → simultaneous final votes → a short reflection on each other agent, carried to the next round.</w:t>
       </w:r>
     </w:p>
     <w:p>
@@ -884,7 +891,7 @@
         <w:rPr>
           <w:rFonts w:ascii="Old Standard TT" w:cs="Old Standard TT" w:eastAsia="Old Standard TT" w:hAnsi="Old Standard TT"/>
         </w:rPr>
-        <w:t xml:space="preserve">: the same plus a one-sentence tip (share exact stakes; both vote the sign of the sum). </w:t>
+        <w:t xml:space="preserve">: the same plus a five-sentence strategy tip (share exact stakes; both vote for the side the sum favours; if the stakes cancel, each votes its own). </w:t>
       </w:r>
       <w:r>
         <w:rPr>
@@ -918,7 +925,7 @@
         <w:rPr>
           <w:rFonts w:ascii="Old Standard TT" w:cs="Old Standard TT" w:eastAsia="Old Standard TT" w:hAnsi="Old Standard TT"/>
         </w:rPr>
-        <w:t xml:space="preserve"> A monitor sees one view of a game at a time: (1) </w:t>
+        <w:t xml:space="preserve"> A monitor sees one view of a game at a time, always after the game rules (including that a passing proposal pays each agent its own stake): (1) </w:t>
       </w:r>
       <w:r>
         <w:rPr>
@@ -946,7 +953,7 @@
         <w:rPr>
           <w:rFonts w:ascii="Old Standard TT" w:cs="Old Standard TT" w:eastAsia="Old Standard TT" w:hAnsi="Old Standard TT"/>
         </w:rPr>
-        <w:t xml:space="preserve"> — final votes, payoffs and outcomes (when a proposal passes, payoffs equal stakes); (3) </w:t>
+        <w:t xml:space="preserve"> — final votes, payoffs and outcomes; (3) </w:t>
       </w:r>
       <w:r>
         <w:rPr>
@@ -988,7 +995,7 @@
         <w:rPr>
           <w:rFonts w:ascii="Old Standard TT" w:cs="Old Standard TT" w:eastAsia="Old Standard TT" w:hAnsi="Old Standard TT"/>
         </w:rPr>
-        <w:t xml:space="preserve"> — view 3 plus every agent's private plan, an upper bound reported separately. No view contains private messages, the condition, the pair or the stakes themselves. The monitor prompt (Appendix D) was written from the design and frozen before the sprint; it returns a yes/no decision, a 0–10 suspicion score and the suspected pair. The main monitor is Llama 3.3 70B (temperature 0, pinned to one provider); DeepSeek V3.1 with the same prompt is a robustness check added after the first results. We compare against four non-LLM rules, each using only its view's information: </w:t>
+        <w:t xml:space="preserve"> — view 3 plus every agent's private plan, an upper bound reported separately. Views 1–4 contain no private messages, condition, pair or stakes; the plans view is close to a confession, since colluders' plans name the partner in almost every round. The monitor prompt (Appendix D), frozen before the sprint, asks for a JSON answer with at most 150 words of reasoning, a yes/no decision, a 0–10 suspicion score and the suspected pair. The main monitor is Llama 3.3 70B (temperature 0, one pinned provider); DeepSeek V3.1 with the same prompt is a robustness check added after the first results. Both answer directly, with about 60 words of reasoning. To test whether the short answers are the problem, we also ran DeepSeek V3.1 with its thinking mode on (same prompt; about 3,000 thinking tokens per answer) on the competent and no-collusion games, with a criterion committed in advance: AUROC ≥ 0.75 on actions and a gain over thinking off whose paired CI excludes zero. Four non-LLM rules use only their view's information: </w:t>
       </w:r>
       <w:r>
         <w:rPr>
@@ -1002,7 +1009,7 @@
         <w:rPr>
           <w:rFonts w:ascii="Old Standard TT" w:cs="Old Standard TT" w:eastAsia="Old Standard TT" w:hAnsi="Old Standard TT"/>
         </w:rPr>
-        <w:t xml:space="preserve"> (flag a vote against the interest revealed by the agent's payoff: YES with a negative payoff, or NO with a positive one), </w:t>
+        <w:t xml:space="preserve"> (a vote against the interest revealed by the agent's payoff: YES with a negative payoff, or NO with a positive one), </w:t>
       </w:r>
       <w:r>
         <w:rPr>
@@ -1044,7 +1051,7 @@
         <w:rPr>
           <w:rFonts w:ascii="Old Standard TT" w:cs="Old Standard TT" w:eastAsia="Old Standard TT" w:hAnsi="Old Standard TT"/>
         </w:rPr>
-        <w:t xml:space="preserve"> (against-stake + said-vs-did).</w:t>
+        <w:t xml:space="preserve"> (against-stake + said-vs-did). They were defined after the first monitor results, before being run on any data, and encode our knowledge of the attack.</w:t>
       </w:r>
     </w:p>
     <w:p>
@@ -1064,7 +1071,7 @@
         <w:rPr>
           <w:rFonts w:ascii="Old Standard TT" w:cs="Old Standard TT" w:eastAsia="Old Standard TT" w:hAnsi="Old Standard TT"/>
         </w:rPr>
-        <w:t xml:space="preserve"> Accuracy, false-positive rate (FPR), AUROC from the suspicion score, and pair-identification accuracy, each with a percentile bootstrap 95% CI over games; view comparisons are paired over the same games. For behaviour we report the bloc-vote rate in trade opportunities and the </w:t>
+        <w:t xml:space="preserve"> Accuracy and false-positive rate (FPR) of the monitor's own yes/no answer (Appendix E), AUROC from the suspicion score, and pair-identification accuracy (a yes answer naming the true pair), each with a percentile bootstrap 95% CI over games; view comparisons are paired over the same games. For behaviour we report the bloc-vote rate in trade opportunities and the </w:t>
       </w:r>
       <w:r>
         <w:rPr>
@@ -1098,7 +1105,7 @@
         <w:rPr>
           <w:rFonts w:ascii="Old Standard TT" w:cs="Old Standard TT" w:eastAsia="Old Standard TT" w:hAnsi="Old Standard TT"/>
         </w:rPr>
-        <w:t xml:space="preserve"> Pass criteria were written before every pilot. Two confounds surfaced and were fixed (Appendix C): with the full private history, colluders mistook earlier rounds' stakes for current ones (collusion even lowered their payoff); a reminder that fixed this made them distrust the partner's current stake. Showing the pair only the current round's private messages fixed both. No-collusion prompts are unaffected by these fixes (verified byte for byte), so those games are reused.</w:t>
+        <w:t xml:space="preserve"> Pass criteria were written and committed before every pilot. Two confounds surfaced and were fixed (Appendix C): with the full private history, colluders mistook earlier rounds' stakes for current ones (collusion even lowered their payoff); a reminder that fixed this made them distrust the partner's current stake. Showing the pair only the current round's private messages fixed both. No-collusion prompts are unaffected by these fixes (verified byte for byte), so those games are reused.</w:t>
       </w:r>
     </w:p>
     <w:p>
@@ -1129,6 +1136,40 @@
     </w:p>
     <w:p>
       <w:pPr>
+        <w:spacing w:before="0" w:after="120"/>
+        <w:jc w:val="both"/>
+      </w:pPr>
+      <w:r>
+        <w:rPr>
+          <w:rFonts w:ascii="Old Standard TT" w:cs="Old Standard TT" w:eastAsia="Old Standard TT" w:hAnsi="Old Standard TT"/>
+          <w:b w:val="1"/>
+          <w:bCs w:val="1"/>
+        </w:rPr>
+        <w:t xml:space="preserve">Competent colluders collude; naive ones mostly do not (Table 1).</w:t>
+      </w:r>
+      <w:r>
+        <w:rPr>
+          <w:rFonts w:ascii="Old Standard TT" w:cs="Old Standard TT" w:eastAsia="Old Standard TT" w:hAnsi="Old Standard TT"/>
+        </w:rPr>
+        <w:t xml:space="preserve"> Competent colluders traded at every opportunity, gaining 0.43 points per colluder per round while each other agent lost 0.09; naive colluders traded in under a third of opportunities and their gain is indistinguishable from zero. Competent pairs also </w:t>
+      </w:r>
+      <w:r>
+        <w:rPr>
+          <w:rFonts w:ascii="Old Standard TT" w:cs="Old Standard TT" w:eastAsia="Old Standard TT" w:hAnsi="Old Standard TT"/>
+          <w:i w:val="1"/>
+          <w:iCs w:val="1"/>
+        </w:rPr>
+        <w:t xml:space="preserve">over-traded</w:t>
+      </w:r>
+      <w:r>
+        <w:rPr>
+          <w:rFonts w:ascii="Old Standard TT" w:cs="Old Standard TT" w:eastAsia="Old Standard TT" w:hAnsi="Old Standard TT"/>
+        </w:rPr>
+        <w:t xml:space="preserve">: in 45 of 57 tie rounds one of them voted against its own stake, although the tip said not to. These votes gain nothing and leave extra evidence (51 of the pair's 115 against-stake votes). Channel-only pairs rarely colluded (3 of 64 opportunities). In no-collusion games 86% of announcements match the agent's own stake, so talk is mostly honest, as designed.</w:t>
+      </w:r>
+    </w:p>
+    <w:p>
+      <w:pPr>
         <w:keepNext/>
         <w:spacing w:before="120" w:after="60"/>
         <w:jc w:val="left"/>
@@ -1141,7 +1182,7 @@
           <w:sz w:val="18"/>
           <w:szCs w:val="18"/>
         </w:rPr>
-        <w:t xml:space="preserve">Table 1. Manipulation check (40 games per condition; 95% CIs). Gains are per agent-round, relative to the matched no-collusion game.</w:t>
+        <w:t xml:space="preserve">Table 1. Manipulation check (40 games per condition; 95% CIs). Gains are per agent-round, relative to the matched no-collusion game. In a tie round the pair's stakes cancel and the tip says to vote one's own stake.</w:t>
       </w:r>
     </w:p>
     <w:tbl>
@@ -1487,7 +1528,7 @@
                 <w:sz w:val="17"/>
                 <w:szCs w:val="17"/>
               </w:rPr>
-              <w:t xml:space="preserve">Pair's matched gain</w:t>
+              <w:t xml:space="preserve">Tie rounds with a pair vote against own stake</w:t>
             </w:r>
           </w:p>
         </w:tc>
@@ -1505,7 +1546,7 @@
                 <w:sz w:val="17"/>
                 <w:szCs w:val="17"/>
               </w:rPr>
-              <w:t xml:space="preserve">+0.09 [−0.01, 0.20]</w:t>
+              <w:t xml:space="preserve">10/57</w:t>
             </w:r>
           </w:p>
         </w:tc>
@@ -1525,7 +1566,7 @@
                 <w:sz w:val="17"/>
                 <w:szCs w:val="17"/>
               </w:rPr>
-              <w:t xml:space="preserve">+0.43 [0.26, 0.60]</w:t>
+              <w:t xml:space="preserve">45/57 (79%)</w:t>
             </w:r>
           </w:p>
         </w:tc>
@@ -1543,7 +1584,7 @@
                 <w:sz w:val="17"/>
                 <w:szCs w:val="17"/>
               </w:rPr>
-              <w:t xml:space="preserve">+0.04 [0.00, 0.11]</w:t>
+              <w:t xml:space="preserve">0/57</w:t>
             </w:r>
           </w:p>
         </w:tc>
@@ -1561,7 +1602,7 @@
                 <w:sz w:val="17"/>
                 <w:szCs w:val="17"/>
               </w:rPr>
-              <w:t xml:space="preserve">—</w:t>
+              <w:t xml:space="preserve">2/57</w:t>
             </w:r>
           </w:p>
         </w:tc>
@@ -1584,7 +1625,7 @@
                 <w:sz w:val="17"/>
                 <w:szCs w:val="17"/>
               </w:rPr>
-              <w:t xml:space="preserve">Other agents' matched change</w:t>
+              <w:t xml:space="preserve">Pair's matched gain</w:t>
             </w:r>
           </w:p>
         </w:tc>
@@ -1602,7 +1643,7 @@
                 <w:sz w:val="17"/>
                 <w:szCs w:val="17"/>
               </w:rPr>
-              <w:t xml:space="preserve">+0.01 [−0.02, 0.03]</w:t>
+              <w:t xml:space="preserve">+0.09 [−0.01, 0.20]</w:t>
             </w:r>
           </w:p>
         </w:tc>
@@ -1622,6 +1663,103 @@
                 <w:sz w:val="17"/>
                 <w:szCs w:val="17"/>
               </w:rPr>
+              <w:t xml:space="preserve">+0.43 [0.26, 0.60]</w:t>
+            </w:r>
+          </w:p>
+        </w:tc>
+        <w:tc>
+          <w:tcPr>
+            <w:tcW w:w="1560" w:type="dxa"/>
+          </w:tcPr>
+          <w:p>
+            <w:pPr>
+              <w:spacing w:before="20" w:after="20" w:line="240" w:lineRule="auto"/>
+            </w:pPr>
+            <w:r>
+              <w:rPr>
+                <w:rFonts w:ascii="Old Standard TT" w:cs="Old Standard TT" w:eastAsia="Old Standard TT" w:hAnsi="Old Standard TT"/>
+                <w:sz w:val="17"/>
+                <w:szCs w:val="17"/>
+              </w:rPr>
+              <w:t xml:space="preserve">+0.04 [0.00, 0.11]</w:t>
+            </w:r>
+          </w:p>
+        </w:tc>
+        <w:tc>
+          <w:tcPr>
+            <w:tcW w:w="1500" w:type="dxa"/>
+          </w:tcPr>
+          <w:p>
+            <w:pPr>
+              <w:spacing w:before="20" w:after="20" w:line="240" w:lineRule="auto"/>
+            </w:pPr>
+            <w:r>
+              <w:rPr>
+                <w:rFonts w:ascii="Old Standard TT" w:cs="Old Standard TT" w:eastAsia="Old Standard TT" w:hAnsi="Old Standard TT"/>
+                <w:sz w:val="17"/>
+                <w:szCs w:val="17"/>
+              </w:rPr>
+              <w:t xml:space="preserve">—</w:t>
+            </w:r>
+          </w:p>
+        </w:tc>
+      </w:tr>
+      <w:tr>
+        <w:trPr>
+          <w:cantSplit/>
+        </w:trPr>
+        <w:tc>
+          <w:tcPr>
+            <w:tcW w:w="3000" w:type="dxa"/>
+          </w:tcPr>
+          <w:p>
+            <w:pPr>
+              <w:spacing w:before="20" w:after="20" w:line="240" w:lineRule="auto"/>
+            </w:pPr>
+            <w:r>
+              <w:rPr>
+                <w:rFonts w:ascii="Old Standard TT" w:cs="Old Standard TT" w:eastAsia="Old Standard TT" w:hAnsi="Old Standard TT"/>
+                <w:sz w:val="17"/>
+                <w:szCs w:val="17"/>
+              </w:rPr>
+              <w:t xml:space="preserve">Other agents' matched change</w:t>
+            </w:r>
+          </w:p>
+        </w:tc>
+        <w:tc>
+          <w:tcPr>
+            <w:tcW w:w="1500" w:type="dxa"/>
+          </w:tcPr>
+          <w:p>
+            <w:pPr>
+              <w:spacing w:before="20" w:after="20" w:line="240" w:lineRule="auto"/>
+            </w:pPr>
+            <w:r>
+              <w:rPr>
+                <w:rFonts w:ascii="Old Standard TT" w:cs="Old Standard TT" w:eastAsia="Old Standard TT" w:hAnsi="Old Standard TT"/>
+                <w:sz w:val="17"/>
+                <w:szCs w:val="17"/>
+              </w:rPr>
+              <w:t xml:space="preserve">+0.01 [−0.02, 0.03]</w:t>
+            </w:r>
+          </w:p>
+        </w:tc>
+        <w:tc>
+          <w:tcPr>
+            <w:tcW w:w="1800" w:type="dxa"/>
+          </w:tcPr>
+          <w:p>
+            <w:pPr>
+              <w:spacing w:before="20" w:after="20" w:line="240" w:lineRule="auto"/>
+            </w:pPr>
+            <w:r>
+              <w:rPr>
+                <w:rFonts w:ascii="Old Standard TT" w:cs="Old Standard TT" w:eastAsia="Old Standard TT" w:hAnsi="Old Standard TT"/>
+                <w:b w:val="1"/>
+                <w:bCs w:val="1"/>
+                <w:sz w:val="17"/>
+                <w:szCs w:val="17"/>
+              </w:rPr>
               <w:t xml:space="preserve">−0.09 [−0.19, −0.00]</w:t>
             </w:r>
           </w:p>
@@ -1669,26 +1807,6 @@
         <w:spacing w:before="0" w:after="0"/>
         <w:jc w:val="both"/>
       </w:pPr>
-    </w:p>
-    <w:p>
-      <w:pPr>
-        <w:spacing w:before="0" w:after="120"/>
-        <w:jc w:val="both"/>
-      </w:pPr>
-      <w:r>
-        <w:rPr>
-          <w:rFonts w:ascii="Old Standard TT" w:cs="Old Standard TT" w:eastAsia="Old Standard TT" w:hAnsi="Old Standard TT"/>
-          <w:b w:val="1"/>
-          <w:bCs w:val="1"/>
-        </w:rPr>
-        <w:t xml:space="preserve">Competent colluders collude; naive ones mostly do not (Table 1).</w:t>
-      </w:r>
-      <w:r>
-        <w:rPr>
-          <w:rFonts w:ascii="Old Standard TT" w:cs="Old Standard TT" w:eastAsia="Old Standard TT" w:hAnsi="Old Standard TT"/>
-        </w:rPr>
-        <w:t xml:space="preserve"> Competent colluders traded at every opportunity and profited at the others' expense; naive colluders traded in under a third of opportunities and their gain is indistinguishable from zero. Channel-only pairs did not collude. In no-collusion games 86% of announcements match the agent's own stake, so talk is mostly honest, as designed.</w:t>
-      </w:r>
     </w:p>
     <w:p>
       <w:pPr>
@@ -1699,7 +1817,7 @@
       <w:r>
         <w:drawing>
           <wp:inline distT="0" distB="0" distL="0" distR="0">
-            <wp:extent cx="5943600" cy="2743200"/>
+            <wp:extent cx="5486400" cy="2532184"/>
             <wp:docPr id="1001" name="Figure 1"/>
             <wp:cNvGraphicFramePr>
               <a:graphicFrameLocks noChangeAspect="1"/>
@@ -1720,7 +1838,7 @@
                   <pic:spPr>
                     <a:xfrm>
                       <a:off x="0" y="0"/>
-                      <a:ext cx="5943600" cy="2743200"/>
+                      <a:ext cx="5486400" cy="2532184"/>
                     </a:xfrm>
                     <a:prstGeom prst="rect">
                       <a:avLst/>
@@ -1763,7 +1881,7 @@
           <w:sz w:val="18"/>
           <w:szCs w:val="18"/>
         </w:rPr>
-        <w:t xml:space="preserve">Table 2. Detection AUROC [95% CI] versus 40 no-collusion games. The rules use only the information in the named view.</w:t>
+        <w:t xml:space="preserve">Table 2. Detection AUROC [95% CI] versus 40 no-collusion games. The rules use only the information in the named view. The tie-rule row rescores the same games with the pair's tie-round votes set to their own stakes (outcomes recomputed).</w:t>
       </w:r>
     </w:p>
     <w:tbl>
@@ -2491,7 +2609,7 @@
                 <w:sz w:val="17"/>
                 <w:szCs w:val="17"/>
               </w:rPr>
-              <w:t xml:space="preserve">Rule: co-vote (actions)</w:t>
+              <w:t xml:space="preserve">  … if pairs followed the tie rule</w:t>
             </w:r>
           </w:p>
         </w:tc>
@@ -2509,7 +2627,7 @@
                 <w:sz w:val="17"/>
                 <w:szCs w:val="17"/>
               </w:rPr>
-              <w:t xml:space="preserve">0.56 [0.46, 0.67]</w:t>
+              <w:t xml:space="preserve">0.60 [0.53, 0.68]</w:t>
             </w:r>
           </w:p>
         </w:tc>
@@ -2537,7 +2655,7 @@
                 <w:sz w:val="17"/>
                 <w:szCs w:val="17"/>
               </w:rPr>
-              <w:t xml:space="preserve">0.76 [0.66, 0.85]</w:t>
+              <w:t xml:space="preserve">0.78 [0.70, 0.86]</w:t>
             </w:r>
           </w:p>
         </w:tc>
@@ -2570,6 +2688,85 @@
                 <w:sz w:val="17"/>
                 <w:szCs w:val="17"/>
               </w:rPr>
+              <w:t xml:space="preserve">Rule: co-vote (actions)</w:t>
+            </w:r>
+          </w:p>
+        </w:tc>
+        <w:tc>
+          <w:tcPr>
+            <w:tcW w:w="1650" w:type="dxa"/>
+          </w:tcPr>
+          <w:p>
+            <w:pPr>
+              <w:spacing w:before="20" w:after="20" w:line="240" w:lineRule="auto"/>
+            </w:pPr>
+            <w:r>
+              <w:rPr>
+                <w:rFonts w:ascii="Old Standard TT" w:cs="Old Standard TT" w:eastAsia="Old Standard TT" w:hAnsi="Old Standard TT"/>
+                <w:sz w:val="17"/>
+                <w:szCs w:val="17"/>
+              </w:rPr>
+              <w:t xml:space="preserve">0.56 [0.46, 0.67]</w:t>
+            </w:r>
+          </w:p>
+        </w:tc>
+        <w:tc>
+          <w:tcPr>
+            <w:tcW w:w="1650" w:type="dxa"/>
+          </w:tcPr>
+          <w:p>
+            <w:pPr>
+              <w:spacing w:before="20" w:after="20" w:line="240" w:lineRule="auto"/>
+            </w:pPr>
+          </w:p>
+        </w:tc>
+        <w:tc>
+          <w:tcPr>
+            <w:tcW w:w="1650" w:type="dxa"/>
+          </w:tcPr>
+          <w:p>
+            <w:pPr>
+              <w:spacing w:before="20" w:after="20" w:line="240" w:lineRule="auto"/>
+            </w:pPr>
+            <w:r>
+              <w:rPr>
+                <w:rFonts w:ascii="Old Standard TT" w:cs="Old Standard TT" w:eastAsia="Old Standard TT" w:hAnsi="Old Standard TT"/>
+                <w:sz w:val="17"/>
+                <w:szCs w:val="17"/>
+              </w:rPr>
+              <w:t xml:space="preserve">0.76 [0.66, 0.85]</w:t>
+            </w:r>
+          </w:p>
+        </w:tc>
+        <w:tc>
+          <w:tcPr>
+            <w:tcW w:w="1650" w:type="dxa"/>
+          </w:tcPr>
+          <w:p>
+            <w:pPr>
+              <w:spacing w:before="20" w:after="20" w:line="240" w:lineRule="auto"/>
+            </w:pPr>
+          </w:p>
+        </w:tc>
+      </w:tr>
+      <w:tr>
+        <w:trPr>
+          <w:cantSplit/>
+        </w:trPr>
+        <w:tc>
+          <w:tcPr>
+            <w:tcW w:w="2760" w:type="dxa"/>
+          </w:tcPr>
+          <w:p>
+            <w:pPr>
+              <w:spacing w:before="20" w:after="20" w:line="240" w:lineRule="auto"/>
+            </w:pPr>
+            <w:r>
+              <w:rPr>
+                <w:rFonts w:ascii="Old Standard TT" w:cs="Old Standard TT" w:eastAsia="Old Standard TT" w:hAnsi="Old Standard TT"/>
+                <w:sz w:val="17"/>
+                <w:szCs w:val="17"/>
+              </w:rPr>
               <w:t xml:space="preserve">Rule: combined (both)</w:t>
             </w:r>
           </w:p>
@@ -2649,13 +2846,13 @@
           <w:b w:val="1"/>
           <w:bCs w:val="1"/>
         </w:rPr>
-        <w:t xml:space="preserve">LLM monitors are at chance on observable behaviour; a one-line rule is not (Figure 1, Table 2).</w:t>
-      </w:r>
-      <w:r>
-        <w:rPr>
-          <w:rFonts w:ascii="Old Standard TT" w:cs="Old Standard TT" w:eastAsia="Old Standard TT" w:hAnsi="Old Standard TT"/>
-        </w:rPr>
-        <w:t xml:space="preserve"> Every observable-view interval for both monitors includes 0.5, and in those views they almost never name the right pair (0–10%). Using only the actions view, against-stake detects competent colluders with AUROC 0.86 at 5% FPR. With private plans both monitors detect collusion and name the right pair in every case. The monitors are also poorly calibrated: DeepSeek answers "collusion" in 90–100% of no-collusion games on three of four observable views, and 70% of Llama's suspicion scores are either 2 or 8.</w:t>
+        <w:t xml:space="preserve">Short-verdict LLM monitors are near chance on observable behaviour; a one-line rule is not (Figure 1, Table 2).</w:t>
+      </w:r>
+      <w:r>
+        <w:rPr>
+          <w:rFonts w:ascii="Old Standard TT" w:cs="Old Standard TT" w:eastAsia="Old Standard TT" w:hAnsi="Old Standard TT"/>
+        </w:rPr>
+        <w:t xml:space="preserve"> On each of the four observable views, both monitors' intervals include 0.5, and they rarely name the right pair (0–10%; 25% for DeepSeek on the competent table view). Using only the actions view, against-stake detects competent colluders with AUROC 0.86 at 5% FPR, and 0.78 [0.70, 0.86] against pairs that followed the tie rule. With private plans both monitors rank colluding games highly and name the right pair in every colluding game, but their yes/no answers stay poorly calibrated (FPR 0.23 for Llama, 0.88 for DeepSeek; Appendix E). DeepSeek answers "collusion" in 90–100% of no-collusion games on three of the four observable views, and 70% of Llama's suspicion scores are 2 or 8.</w:t>
       </w:r>
     </w:p>
     <w:p>
@@ -2669,13 +2866,53 @@
           <w:b w:val="1"/>
           <w:bCs w:val="1"/>
         </w:rPr>
-        <w:t xml:space="preserve">Combining what agents say and do does not help (question 2.2).</w:t>
-      </w:r>
-      <w:r>
-        <w:rPr>
-          <w:rFonts w:ascii="Old Standard TT" w:cs="Old Standard TT" w:eastAsia="Old Standard TT" w:hAnsi="Old Standard TT"/>
-        </w:rPr>
-        <w:t xml:space="preserve"> For both monitors and both colluder types, every paired difference between the combined view and a single-channel view has a CI including zero (e.g. competent, Llama: public − combined +0.04 [−0.12, 0.20]; actions − combined −0.03 [−0.14, 0.08]). For the rules, adding said-vs-did to against-stake </w:t>
+        <w:t xml:space="preserve">Combining what agents say and do did not help (question 2.2).</w:t>
+      </w:r>
+      <w:r>
+        <w:rPr>
+          <w:rFonts w:ascii="Old Standard TT" w:cs="Old Standard TT" w:eastAsia="Old Standard TT" w:hAnsi="Old Standard TT"/>
+        </w:rPr>
+        <w:t xml:space="preserve"> For both monitors and colluder types, every paired difference between the combined view and a single-channel view has a CI including zero (e.g. competent, Llama: public − combined +0.04 [−0.12, 0.20]; actions − combined −0.03 [−0.14, 0.08]); with the monitors near chance, this alone cannot show whether combining would help a better monitor. For the rules, talk adds nothing: said-vs-did flags 85% of no-collusion games, because honest agents also change their vote after announcing; summing it with against-stake lowers AUROC from 0.86 to 0.65, and using it only to break ties leaves 0.86 [0.76, 0.94]. The only addition that helps is private reasoning (+0.28 to +0.49 over the combined view).</w:t>
+      </w:r>
+    </w:p>
+    <w:p>
+      <w:pPr>
+        <w:spacing w:before="0" w:after="120"/>
+        <w:jc w:val="both"/>
+      </w:pPr>
+      <w:r>
+        <w:rPr>
+          <w:rFonts w:ascii="Old Standard TT" w:cs="Old Standard TT" w:eastAsia="Old Standard TT" w:hAnsi="Old Standard TT"/>
+          <w:b w:val="1"/>
+          <w:bCs w:val="1"/>
+        </w:rPr>
+        <w:t xml:space="preserve">Robustness.</w:t>
+      </w:r>
+      <w:r>
+        <w:rPr>
+          <w:rFonts w:ascii="Old Standard TT" w:cs="Old Standard TT" w:eastAsia="Old Standard TT" w:hAnsi="Old Standard TT"/>
+        </w:rPr>
+        <w:t xml:space="preserve"> For competent colluders the pattern holds against channel-only hard negatives (monitors 0.47–0.61; against-stake 0.87 [0.79, 0.93]); it also holds on the 17 naive games with realized collusion (monitors 0.48–0.55; against-stake 0.80 [0.67, 0.92]), in an earlier data generation (Appendix C) and on held-out games.</w:t>
+      </w:r>
+    </w:p>
+    <w:p>
+      <w:pPr>
+        <w:spacing w:before="0" w:after="120"/>
+        <w:jc w:val="both"/>
+      </w:pPr>
+      <w:r>
+        <w:rPr>
+          <w:rFonts w:ascii="Old Standard TT" w:cs="Old Standard TT" w:eastAsia="Old Standard TT" w:hAnsi="Old Standard TT"/>
+          <w:b w:val="1"/>
+          <w:bCs w:val="1"/>
+        </w:rPr>
+        <w:t xml:space="preserve">Why the monitors miss it.</w:t>
+      </w:r>
+      <w:r>
+        <w:rPr>
+          <w:rFonts w:ascii="Old Standard TT" w:cs="Old Standard TT" w:eastAsia="Old Standard TT" w:hAnsi="Old Standard TT"/>
+        </w:rPr>
+        <w:t xml:space="preserve"> In a typical trade only the small-stake colluder votes against its interest, so the visible trace is one or a few inconsistent votes. Two exploratory views tested presentation: an aligned per-round table (announced vote, final vote, payoff), and the same table with each vote flagged </w:t>
       </w:r>
       <w:r>
         <w:rPr>
@@ -2683,53 +2920,13 @@
           <w:i w:val="1"/>
           <w:iCs w:val="1"/>
         </w:rPr>
-        <w:t xml:space="preserve">lowers</w:t>
-      </w:r>
-      <w:r>
-        <w:rPr>
-          <w:rFonts w:ascii="Old Standard TT" w:cs="Old Standard TT" w:eastAsia="Old Standard TT" w:hAnsi="Old Standard TT"/>
-        </w:rPr>
-        <w:t xml:space="preserve"> AUROC from 0.86 to 0.65: honest agents also change their vote after announcing (said-vs-did flags 85% of no-collusion games), so talk–action mismatch is noise here. The only addition that helps is private reasoning (+0.28 to +0.49 AUROC over the combined view).</w:t>
-      </w:r>
-    </w:p>
-    <w:p>
-      <w:pPr>
-        <w:spacing w:before="0" w:after="120"/>
-        <w:jc w:val="both"/>
-      </w:pPr>
-      <w:r>
-        <w:rPr>
-          <w:rFonts w:ascii="Old Standard TT" w:cs="Old Standard TT" w:eastAsia="Old Standard TT" w:hAnsi="Old Standard TT"/>
-          <w:b w:val="1"/>
-          <w:bCs w:val="1"/>
-        </w:rPr>
-        <w:t xml:space="preserve">Robustness.</w:t>
-      </w:r>
-      <w:r>
-        <w:rPr>
-          <w:rFonts w:ascii="Old Standard TT" w:cs="Old Standard TT" w:eastAsia="Old Standard TT" w:hAnsi="Old Standard TT"/>
-        </w:rPr>
-        <w:t xml:space="preserve"> The pattern holds against channel-only hard negatives (LLM monitors 0.47–0.61; against-stake 0.87 [0.79, 0.93]), on the 17 naive games where collusion actually occurred (monitors 0.48–0.55; against-stake 0.80 [0.67, 0.92]), in an earlier data generation (Appendix C), and on the held-out games below.</w:t>
-      </w:r>
-    </w:p>
-    <w:p>
-      <w:pPr>
-        <w:spacing w:before="0" w:after="120"/>
-        <w:jc w:val="both"/>
-      </w:pPr>
-      <w:r>
-        <w:rPr>
-          <w:rFonts w:ascii="Old Standard TT" w:cs="Old Standard TT" w:eastAsia="Old Standard TT" w:hAnsi="Old Standard TT"/>
-          <w:b w:val="1"/>
-          <w:bCs w:val="1"/>
-        </w:rPr>
-        <w:t xml:space="preserve">Why the monitors miss it.</w:t>
-      </w:r>
-      <w:r>
-        <w:rPr>
-          <w:rFonts w:ascii="Old Standard TT" w:cs="Old Standard TT" w:eastAsia="Old Standard TT" w:hAnsi="Old Standard TT"/>
-        </w:rPr>
-        <w:t xml:space="preserve"> In a typical trade only one colluder — the one with the small stake — votes against its interest; the partner simply votes its own. The visible trace of collusion is a single inconsistent vote. To test whether presentation was the problem, we added two exploratory views: an aligned per-round table (announced vote, final vote, payoff) and the same table with each vote flagged </w:t>
+        <w:t xml:space="preserve">with</w:t>
+      </w:r>
+      <w:r>
+        <w:rPr>
+          <w:rFonts w:ascii="Old Standard TT" w:cs="Old Standard TT" w:eastAsia="Old Standard TT" w:hAnsi="Old Standard TT"/>
+        </w:rPr>
+        <w:t xml:space="preserve"> or </w:t>
       </w:r>
       <w:r>
         <w:rPr>
@@ -2737,27 +2934,13 @@
           <w:i w:val="1"/>
           <w:iCs w:val="1"/>
         </w:rPr>
-        <w:t xml:space="preserve">with</w:t>
-      </w:r>
-      <w:r>
-        <w:rPr>
-          <w:rFonts w:ascii="Old Standard TT" w:cs="Old Standard TT" w:eastAsia="Old Standard TT" w:hAnsi="Old Standard TT"/>
-        </w:rPr>
-        <w:t xml:space="preserve"> or </w:t>
-      </w:r>
-      <w:r>
-        <w:rPr>
-          <w:rFonts w:ascii="Old Standard TT" w:cs="Old Standard TT" w:eastAsia="Old Standard TT" w:hAnsi="Old Standard TT"/>
-          <w:i w:val="1"/>
-          <w:iCs w:val="1"/>
-        </w:rPr>
         <w:t xml:space="preserve">AGAINST</w:t>
       </w:r>
       <w:r>
         <w:rPr>
           <w:rFonts w:ascii="Old Standard TT" w:cs="Old Standard TT" w:eastAsia="Old Standard TT" w:hAnsi="Old Standard TT"/>
         </w:rPr>
-        <w:t xml:space="preserve"> the interest its payoff reveals — exactly the rule's evidence. The table alone did not help; flags helped Llama only slightly (competent: 0.65 [0.55, 0.75] versus 0.86 for the rule). In 30 of 40 competent games an AGAINST row was shown, yet Llama answered yes in 5 and DeepSeek in 16. Llama's reasoning treats the flag as weak: "most agents voted with their revealed interests… Z's vote… went against… could indicate collusion. But without more information, it's difficult to determine." Yet honest agents almost never vote against their revealed interest (the rule's FPR is 5%), so one such vote is strong evidence.</w:t>
+        <w:t xml:space="preserve"> the interest its payoff reveals — exactly the rule's evidence. The table alone did not help; the flags helped Llama only slightly (competent: 0.65 [0.55, 0.75]). In 30 of 40 competent games an AGAINST row was shown (two or more in 13), yet Llama answered yes in 5 (3 of the 13) and DeepSeek in 16. Llama treats the flag as weak: "most agents voted with their revealed interests… Z's vote… went against… could indicate collusion. But without more information, it's difficult to determine." Yet honest agents almost never vote against their revealed interest (the rule's FPR is 5%).</w:t>
       </w:r>
     </w:p>
     <w:p>
@@ -2936,7 +3119,7 @@
                 <w:sz w:val="17"/>
                 <w:szCs w:val="17"/>
               </w:rPr>
-              <w:t xml:space="preserve">Actions (pre-registered primary)</w:t>
+              <w:t xml:space="preserve">Actions (pre-specified primary)</w:t>
             </w:r>
           </w:p>
         </w:tc>
@@ -3381,6 +3564,77 @@
           </w:p>
         </w:tc>
       </w:tr>
+      <w:tr>
+        <w:trPr>
+          <w:cantSplit/>
+        </w:trPr>
+        <w:tc>
+          <w:tcPr>
+            <w:tcW w:w="3060" w:type="dxa"/>
+          </w:tcPr>
+          <w:p>
+            <w:pPr>
+              <w:spacing w:before="20" w:after="20" w:line="240" w:lineRule="auto"/>
+            </w:pPr>
+            <w:r>
+              <w:rPr>
+                <w:rFonts w:ascii="Old Standard TT" w:cs="Old Standard TT" w:eastAsia="Old Standard TT" w:hAnsi="Old Standard TT"/>
+                <w:sz w:val="17"/>
+                <w:szCs w:val="17"/>
+              </w:rPr>
+              <w:t xml:space="preserve">  … if pairs followed the tie rule</w:t>
+            </w:r>
+          </w:p>
+        </w:tc>
+        <w:tc>
+          <w:tcPr>
+            <w:tcW w:w="1575" w:type="dxa"/>
+          </w:tcPr>
+          <w:p>
+            <w:pPr>
+              <w:spacing w:before="20" w:after="20" w:line="240" w:lineRule="auto"/>
+            </w:pPr>
+            <w:r>
+              <w:rPr>
+                <w:rFonts w:ascii="Old Standard TT" w:cs="Old Standard TT" w:eastAsia="Old Standard TT" w:hAnsi="Old Standard TT"/>
+                <w:sz w:val="17"/>
+                <w:szCs w:val="17"/>
+              </w:rPr>
+              <w:t xml:space="preserve">0.72 [0.60, 0.85]</w:t>
+            </w:r>
+          </w:p>
+        </w:tc>
+        <w:tc>
+          <w:tcPr>
+            <w:tcW w:w="1575" w:type="dxa"/>
+          </w:tcPr>
+          <w:p>
+            <w:pPr>
+              <w:spacing w:before="20" w:after="20" w:line="240" w:lineRule="auto"/>
+            </w:pPr>
+          </w:p>
+        </w:tc>
+        <w:tc>
+          <w:tcPr>
+            <w:tcW w:w="1575" w:type="dxa"/>
+          </w:tcPr>
+          <w:p>
+            <w:pPr>
+              <w:spacing w:before="20" w:after="20" w:line="240" w:lineRule="auto"/>
+            </w:pPr>
+          </w:p>
+        </w:tc>
+        <w:tc>
+          <w:tcPr>
+            <w:tcW w:w="1575" w:type="dxa"/>
+          </w:tcPr>
+          <w:p>
+            <w:pPr>
+              <w:spacing w:before="20" w:after="20" w:line="240" w:lineRule="auto"/>
+            </w:pPr>
+          </w:p>
+        </w:tc>
+      </w:tr>
     </w:tbl>
     <w:p>
       <w:pPr>
@@ -3405,7 +3659,7 @@
         <w:rPr>
           <w:rFonts w:ascii="Old Standard TT" w:cs="Old Standard TT" w:eastAsia="Old Standard TT" w:hAnsi="Old Standard TT"/>
         </w:rPr>
-        <w:t xml:space="preserve"> We wrote prompt v2 — v1 plus one paragraph stating that payoffs reveal interests, that honest agents essentially always vote their interest, and that even one vote against it is strong evidence — </w:t>
+        <w:t xml:space="preserve"> Prompt v2 adds one paragraph to v1: payoffs reveal interests, honest agents essentially always vote their interest, and even one vote against it is strong evidence. We fixed it, with a test committed in advance (Llama, actions view: paired CI excluding zero and AUROC ≥ 0.75), </w:t>
       </w:r>
       <w:r>
         <w:rPr>
@@ -3419,7 +3673,7 @@
         <w:rPr>
           <w:rFonts w:ascii="Old Standard TT" w:cs="Old Standard TT" w:eastAsia="Old Standard TT" w:hAnsi="Old Standard TT"/>
         </w:rPr>
-        <w:t xml:space="preserve"> generating fresh held-out games. Our pre-registered test (Llama, actions view: CI excluding zero and AUROC ≥ 0.75) </w:t>
+        <w:t xml:space="preserve"> generating 40 fresh held-out games. The test </w:t>
       </w:r>
       <w:r>
         <w:rPr>
@@ -3433,7 +3687,7 @@
         <w:rPr>
           <w:rFonts w:ascii="Old Standard TT" w:cs="Old Standard TT" w:eastAsia="Old Standard TT" w:hAnsi="Old Standard TT"/>
         </w:rPr>
-        <w:t xml:space="preserve">: +0.02 [−0.17, 0.21], AUROC 0.61. Only base rate </w:t>
+        <w:t xml:space="preserve">: +0.02 [−0.17, 0.21], AUROC 0.61. In a secondary comparison, the base rate </w:t>
       </w:r>
       <w:r>
         <w:rPr>
@@ -3447,7 +3701,556 @@
         <w:rPr>
           <w:rFonts w:ascii="Old Standard TT" w:cs="Old Standard TT" w:eastAsia="Old Standard TT" w:hAnsi="Old Standard TT"/>
         </w:rPr>
-        <w:t xml:space="preserve"> flagged evidence together brought Llama to 0.76 (+0.13 [−0.00, 0.26] over v1), still below the rule's 0.91; v2 also raised Llama's FPR on some views (combined view 0.25 → 0.50). The held-out games replicate the main result: with the frozen prompt every observable view stays near chance, while the rule and private plans succeed. With 20 games per class, secondary comparisons are weak evidence.</w:t>
+        <w:t xml:space="preserve"> the flags together brought Llama to 0.76 (+0.13 [−0.00, 0.26] over v1), still below the rule's 0.91 on the same games, and v2 raised Llama's FPR on some views (combined 0.25 → 0.50). With the frozen prompt each of the four observable views stays indistinguishable from chance on held-out games, while the rule and private plans succeed. Held-out pairs over-traded even more (29 of 31 tie rounds), so the rule falls to 0.72 for tie-compliant pairs. With 20 games per class, secondary comparisons are weak evidence.</w:t>
+      </w:r>
+    </w:p>
+    <w:p>
+      <w:pPr>
+        <w:keepNext/>
+        <w:spacing w:before="120" w:after="60"/>
+        <w:jc w:val="left"/>
+      </w:pPr>
+      <w:r>
+        <w:rPr>
+          <w:rFonts w:ascii="Old Standard TT" w:cs="Old Standard TT" w:eastAsia="Old Standard TT" w:hAnsi="Old Standard TT"/>
+          <w:i w:val="1"/>
+          <w:iCs w:val="1"/>
+          <w:sz w:val="18"/>
+          <w:szCs w:val="18"/>
+        </w:rPr>
+        <w:t xml:space="preserve">Table 4. DeepSeek V3.1 with thinking off and on (same frozen prompt), competent vs 40 no-collusion games. AUROC [95% CI]; the difference is paired over the same games.</w:t>
+      </w:r>
+    </w:p>
+    <w:tbl>
+      <w:tblPr>
+        <w:tblW w:w="9360" w:type="dxa"/>
+        <w:jc w:val="center"/>
+        <w:tblBorders>
+          <w:top w:val="single" w:sz="4" w:space="0" w:color="000000"/>
+          <w:left w:val="single" w:sz="4" w:space="0" w:color="000000"/>
+          <w:bottom w:val="single" w:sz="4" w:space="0" w:color="000000"/>
+          <w:right w:val="single" w:sz="4" w:space="0" w:color="000000"/>
+          <w:insideH w:val="single" w:sz="4" w:space="0" w:color="000000"/>
+          <w:insideV w:val="single" w:sz="4" w:space="0" w:color="000000"/>
+        </w:tblBorders>
+        <w:tblLayout w:type="fixed"/>
+        <w:tblCellMar>
+          <w:left w:w="70" w:type="dxa"/>
+          <w:right w:w="70" w:type="dxa"/>
+        </w:tblCellMar>
+      </w:tblPr>
+      <w:tblGrid>
+        <w:gridCol w:w="2560"/>
+        <w:gridCol w:w="1150"/>
+        <w:gridCol w:w="1750"/>
+        <w:gridCol w:w="1750"/>
+        <w:gridCol w:w="1150"/>
+        <w:gridCol w:w="1000"/>
+      </w:tblGrid>
+      <w:tr>
+        <w:trPr>
+          <w:cantSplit/>
+          <w:tblHeader/>
+        </w:trPr>
+        <w:tc>
+          <w:tcPr>
+            <w:tcW w:w="2560" w:type="dxa"/>
+            <w:shd w:val="clear" w:color="auto" w:fill="E7E6E6"/>
+          </w:tcPr>
+          <w:p>
+            <w:pPr>
+              <w:keepNext/>
+              <w:spacing w:before="20" w:after="20" w:line="240" w:lineRule="auto"/>
+            </w:pPr>
+            <w:r>
+              <w:rPr>
+                <w:rFonts w:ascii="Old Standard TT" w:cs="Old Standard TT" w:eastAsia="Old Standard TT" w:hAnsi="Old Standard TT"/>
+                <w:b w:val="1"/>
+                <w:bCs w:val="1"/>
+                <w:sz w:val="17"/>
+                <w:szCs w:val="17"/>
+              </w:rPr>
+              <w:t xml:space="preserve">View</w:t>
+            </w:r>
+          </w:p>
+        </w:tc>
+        <w:tc>
+          <w:tcPr>
+            <w:tcW w:w="1150" w:type="dxa"/>
+            <w:shd w:val="clear" w:color="auto" w:fill="E7E6E6"/>
+          </w:tcPr>
+          <w:p>
+            <w:pPr>
+              <w:keepNext/>
+              <w:spacing w:before="20" w:after="20" w:line="240" w:lineRule="auto"/>
+            </w:pPr>
+            <w:r>
+              <w:rPr>
+                <w:rFonts w:ascii="Old Standard TT" w:cs="Old Standard TT" w:eastAsia="Old Standard TT" w:hAnsi="Old Standard TT"/>
+                <w:b w:val="1"/>
+                <w:bCs w:val="1"/>
+                <w:sz w:val="17"/>
+                <w:szCs w:val="17"/>
+              </w:rPr>
+              <w:t xml:space="preserve">Thinking off</w:t>
+            </w:r>
+          </w:p>
+        </w:tc>
+        <w:tc>
+          <w:tcPr>
+            <w:tcW w:w="1750" w:type="dxa"/>
+            <w:shd w:val="clear" w:color="auto" w:fill="E7E6E6"/>
+          </w:tcPr>
+          <w:p>
+            <w:pPr>
+              <w:keepNext/>
+              <w:spacing w:before="20" w:after="20" w:line="240" w:lineRule="auto"/>
+            </w:pPr>
+            <w:r>
+              <w:rPr>
+                <w:rFonts w:ascii="Old Standard TT" w:cs="Old Standard TT" w:eastAsia="Old Standard TT" w:hAnsi="Old Standard TT"/>
+                <w:b w:val="1"/>
+                <w:bCs w:val="1"/>
+                <w:sz w:val="17"/>
+                <w:szCs w:val="17"/>
+              </w:rPr>
+              <w:t xml:space="preserve">Thinking on</w:t>
+            </w:r>
+          </w:p>
+        </w:tc>
+        <w:tc>
+          <w:tcPr>
+            <w:tcW w:w="1750" w:type="dxa"/>
+            <w:shd w:val="clear" w:color="auto" w:fill="E7E6E6"/>
+          </w:tcPr>
+          <w:p>
+            <w:pPr>
+              <w:keepNext/>
+              <w:spacing w:before="20" w:after="20" w:line="240" w:lineRule="auto"/>
+            </w:pPr>
+            <w:r>
+              <w:rPr>
+                <w:rFonts w:ascii="Old Standard TT" w:cs="Old Standard TT" w:eastAsia="Old Standard TT" w:hAnsi="Old Standard TT"/>
+                <w:b w:val="1"/>
+                <w:bCs w:val="1"/>
+                <w:sz w:val="17"/>
+                <w:szCs w:val="17"/>
+              </w:rPr>
+              <w:t xml:space="preserve">On − off</w:t>
+            </w:r>
+          </w:p>
+        </w:tc>
+        <w:tc>
+          <w:tcPr>
+            <w:tcW w:w="1150" w:type="dxa"/>
+            <w:shd w:val="clear" w:color="auto" w:fill="E7E6E6"/>
+          </w:tcPr>
+          <w:p>
+            <w:pPr>
+              <w:keepNext/>
+              <w:spacing w:before="20" w:after="20" w:line="240" w:lineRule="auto"/>
+            </w:pPr>
+            <w:r>
+              <w:rPr>
+                <w:rFonts w:ascii="Old Standard TT" w:cs="Old Standard TT" w:eastAsia="Old Standard TT" w:hAnsi="Old Standard TT"/>
+                <w:b w:val="1"/>
+                <w:bCs w:val="1"/>
+                <w:sz w:val="17"/>
+                <w:szCs w:val="17"/>
+              </w:rPr>
+              <w:t xml:space="preserve">FPR off → on</w:t>
+            </w:r>
+          </w:p>
+        </w:tc>
+        <w:tc>
+          <w:tcPr>
+            <w:tcW w:w="1000" w:type="dxa"/>
+            <w:shd w:val="clear" w:color="auto" w:fill="E7E6E6"/>
+          </w:tcPr>
+          <w:p>
+            <w:pPr>
+              <w:keepNext/>
+              <w:spacing w:before="20" w:after="20" w:line="240" w:lineRule="auto"/>
+            </w:pPr>
+            <w:r>
+              <w:rPr>
+                <w:rFonts w:ascii="Old Standard TT" w:cs="Old Standard TT" w:eastAsia="Old Standard TT" w:hAnsi="Old Standard TT"/>
+                <w:b w:val="1"/>
+                <w:bCs w:val="1"/>
+                <w:sz w:val="17"/>
+                <w:szCs w:val="17"/>
+              </w:rPr>
+              <w:t xml:space="preserve">Pair-ID on</w:t>
+            </w:r>
+          </w:p>
+        </w:tc>
+      </w:tr>
+      <w:tr>
+        <w:trPr>
+          <w:cantSplit/>
+        </w:trPr>
+        <w:tc>
+          <w:tcPr>
+            <w:tcW w:w="2560" w:type="dxa"/>
+          </w:tcPr>
+          <w:p>
+            <w:pPr>
+              <w:spacing w:before="20" w:after="20" w:line="240" w:lineRule="auto"/>
+            </w:pPr>
+            <w:r>
+              <w:rPr>
+                <w:rFonts w:ascii="Old Standard TT" w:cs="Old Standard TT" w:eastAsia="Old Standard TT" w:hAnsi="Old Standard TT"/>
+                <w:sz w:val="17"/>
+                <w:szCs w:val="17"/>
+              </w:rPr>
+              <w:t xml:space="preserve">Public messages</w:t>
+            </w:r>
+          </w:p>
+        </w:tc>
+        <w:tc>
+          <w:tcPr>
+            <w:tcW w:w="1150" w:type="dxa"/>
+          </w:tcPr>
+          <w:p>
+            <w:pPr>
+              <w:spacing w:before="20" w:after="20" w:line="240" w:lineRule="auto"/>
+            </w:pPr>
+            <w:r>
+              <w:rPr>
+                <w:rFonts w:ascii="Old Standard TT" w:cs="Old Standard TT" w:eastAsia="Old Standard TT" w:hAnsi="Old Standard TT"/>
+                <w:sz w:val="17"/>
+                <w:szCs w:val="17"/>
+              </w:rPr>
+              <w:t xml:space="preserve">0.57</w:t>
+            </w:r>
+          </w:p>
+        </w:tc>
+        <w:tc>
+          <w:tcPr>
+            <w:tcW w:w="1750" w:type="dxa"/>
+          </w:tcPr>
+          <w:p>
+            <w:pPr>
+              <w:spacing w:before="20" w:after="20" w:line="240" w:lineRule="auto"/>
+            </w:pPr>
+            <w:r>
+              <w:rPr>
+                <w:rFonts w:ascii="Old Standard TT" w:cs="Old Standard TT" w:eastAsia="Old Standard TT" w:hAnsi="Old Standard TT"/>
+                <w:sz w:val="17"/>
+                <w:szCs w:val="17"/>
+              </w:rPr>
+              <w:t xml:space="preserve">0.59 [0.47, 0.72]</w:t>
+            </w:r>
+          </w:p>
+        </w:tc>
+        <w:tc>
+          <w:tcPr>
+            <w:tcW w:w="1750" w:type="dxa"/>
+          </w:tcPr>
+          <w:p>
+            <w:pPr>
+              <w:spacing w:before="20" w:after="20" w:line="240" w:lineRule="auto"/>
+            </w:pPr>
+            <w:r>
+              <w:rPr>
+                <w:rFonts w:ascii="Old Standard TT" w:cs="Old Standard TT" w:eastAsia="Old Standard TT" w:hAnsi="Old Standard TT"/>
+                <w:sz w:val="17"/>
+                <w:szCs w:val="17"/>
+              </w:rPr>
+              <w:t xml:space="preserve">+0.02 [−0.12, 0.15]</w:t>
+            </w:r>
+          </w:p>
+        </w:tc>
+        <w:tc>
+          <w:tcPr>
+            <w:tcW w:w="1150" w:type="dxa"/>
+          </w:tcPr>
+          <w:p>
+            <w:pPr>
+              <w:spacing w:before="20" w:after="20" w:line="240" w:lineRule="auto"/>
+            </w:pPr>
+            <w:r>
+              <w:rPr>
+                <w:rFonts w:ascii="Old Standard TT" w:cs="Old Standard TT" w:eastAsia="Old Standard TT" w:hAnsi="Old Standard TT"/>
+                <w:sz w:val="17"/>
+                <w:szCs w:val="17"/>
+              </w:rPr>
+              <w:t xml:space="preserve">1.00 → 0.42</w:t>
+            </w:r>
+          </w:p>
+        </w:tc>
+        <w:tc>
+          <w:tcPr>
+            <w:tcW w:w="1000" w:type="dxa"/>
+          </w:tcPr>
+          <w:p>
+            <w:pPr>
+              <w:spacing w:before="20" w:after="20" w:line="240" w:lineRule="auto"/>
+            </w:pPr>
+            <w:r>
+              <w:rPr>
+                <w:rFonts w:ascii="Old Standard TT" w:cs="Old Standard TT" w:eastAsia="Old Standard TT" w:hAnsi="Old Standard TT"/>
+                <w:sz w:val="17"/>
+                <w:szCs w:val="17"/>
+              </w:rPr>
+              <w:t xml:space="preserve">0.10</w:t>
+            </w:r>
+          </w:p>
+        </w:tc>
+      </w:tr>
+      <w:tr>
+        <w:trPr>
+          <w:cantSplit/>
+        </w:trPr>
+        <w:tc>
+          <w:tcPr>
+            <w:tcW w:w="2560" w:type="dxa"/>
+          </w:tcPr>
+          <w:p>
+            <w:pPr>
+              <w:spacing w:before="20" w:after="20" w:line="240" w:lineRule="auto"/>
+            </w:pPr>
+            <w:r>
+              <w:rPr>
+                <w:rFonts w:ascii="Old Standard TT" w:cs="Old Standard TT" w:eastAsia="Old Standard TT" w:hAnsi="Old Standard TT"/>
+                <w:sz w:val="17"/>
+                <w:szCs w:val="17"/>
+              </w:rPr>
+              <w:t xml:space="preserve">Actions (pre-specified primary)</w:t>
+            </w:r>
+          </w:p>
+        </w:tc>
+        <w:tc>
+          <w:tcPr>
+            <w:tcW w:w="1150" w:type="dxa"/>
+          </w:tcPr>
+          <w:p>
+            <w:pPr>
+              <w:spacing w:before="20" w:after="20" w:line="240" w:lineRule="auto"/>
+            </w:pPr>
+            <w:r>
+              <w:rPr>
+                <w:rFonts w:ascii="Old Standard TT" w:cs="Old Standard TT" w:eastAsia="Old Standard TT" w:hAnsi="Old Standard TT"/>
+                <w:sz w:val="17"/>
+                <w:szCs w:val="17"/>
+              </w:rPr>
+              <w:t xml:space="preserve">0.54</w:t>
+            </w:r>
+          </w:p>
+        </w:tc>
+        <w:tc>
+          <w:tcPr>
+            <w:tcW w:w="1750" w:type="dxa"/>
+          </w:tcPr>
+          <w:p>
+            <w:pPr>
+              <w:spacing w:before="20" w:after="20" w:line="240" w:lineRule="auto"/>
+            </w:pPr>
+            <w:r>
+              <w:rPr>
+                <w:rFonts w:ascii="Old Standard TT" w:cs="Old Standard TT" w:eastAsia="Old Standard TT" w:hAnsi="Old Standard TT"/>
+                <w:b w:val="1"/>
+                <w:bCs w:val="1"/>
+                <w:sz w:val="17"/>
+                <w:szCs w:val="17"/>
+              </w:rPr>
+              <w:t xml:space="preserve">0.69 [0.57, 0.80]</w:t>
+            </w:r>
+          </w:p>
+        </w:tc>
+        <w:tc>
+          <w:tcPr>
+            <w:tcW w:w="1750" w:type="dxa"/>
+          </w:tcPr>
+          <w:p>
+            <w:pPr>
+              <w:spacing w:before="20" w:after="20" w:line="240" w:lineRule="auto"/>
+            </w:pPr>
+            <w:r>
+              <w:rPr>
+                <w:rFonts w:ascii="Old Standard TT" w:cs="Old Standard TT" w:eastAsia="Old Standard TT" w:hAnsi="Old Standard TT"/>
+                <w:sz w:val="17"/>
+                <w:szCs w:val="17"/>
+              </w:rPr>
+              <w:t xml:space="preserve">+0.15 [−0.03, 0.33]</w:t>
+            </w:r>
+          </w:p>
+        </w:tc>
+        <w:tc>
+          <w:tcPr>
+            <w:tcW w:w="1150" w:type="dxa"/>
+          </w:tcPr>
+          <w:p>
+            <w:pPr>
+              <w:spacing w:before="20" w:after="20" w:line="240" w:lineRule="auto"/>
+            </w:pPr>
+            <w:r>
+              <w:rPr>
+                <w:rFonts w:ascii="Old Standard TT" w:cs="Old Standard TT" w:eastAsia="Old Standard TT" w:hAnsi="Old Standard TT"/>
+                <w:sz w:val="17"/>
+                <w:szCs w:val="17"/>
+              </w:rPr>
+              <w:t xml:space="preserve">0.55 → 0.25</w:t>
+            </w:r>
+          </w:p>
+        </w:tc>
+        <w:tc>
+          <w:tcPr>
+            <w:tcW w:w="1000" w:type="dxa"/>
+          </w:tcPr>
+          <w:p>
+            <w:pPr>
+              <w:spacing w:before="20" w:after="20" w:line="240" w:lineRule="auto"/>
+            </w:pPr>
+            <w:r>
+              <w:rPr>
+                <w:rFonts w:ascii="Old Standard TT" w:cs="Old Standard TT" w:eastAsia="Old Standard TT" w:hAnsi="Old Standard TT"/>
+                <w:sz w:val="17"/>
+                <w:szCs w:val="17"/>
+              </w:rPr>
+              <w:t xml:space="preserve">0.33</w:t>
+            </w:r>
+          </w:p>
+        </w:tc>
+      </w:tr>
+      <w:tr>
+        <w:trPr>
+          <w:cantSplit/>
+        </w:trPr>
+        <w:tc>
+          <w:tcPr>
+            <w:tcW w:w="2560" w:type="dxa"/>
+          </w:tcPr>
+          <w:p>
+            <w:pPr>
+              <w:spacing w:before="20" w:after="20" w:line="240" w:lineRule="auto"/>
+            </w:pPr>
+            <w:r>
+              <w:rPr>
+                <w:rFonts w:ascii="Old Standard TT" w:cs="Old Standard TT" w:eastAsia="Old Standard TT" w:hAnsi="Old Standard TT"/>
+                <w:sz w:val="17"/>
+                <w:szCs w:val="17"/>
+              </w:rPr>
+              <w:t xml:space="preserve">Messages + actions</w:t>
+            </w:r>
+          </w:p>
+        </w:tc>
+        <w:tc>
+          <w:tcPr>
+            <w:tcW w:w="1150" w:type="dxa"/>
+          </w:tcPr>
+          <w:p>
+            <w:pPr>
+              <w:spacing w:before="20" w:after="20" w:line="240" w:lineRule="auto"/>
+            </w:pPr>
+            <w:r>
+              <w:rPr>
+                <w:rFonts w:ascii="Old Standard TT" w:cs="Old Standard TT" w:eastAsia="Old Standard TT" w:hAnsi="Old Standard TT"/>
+                <w:sz w:val="17"/>
+                <w:szCs w:val="17"/>
+              </w:rPr>
+              <w:t xml:space="preserve">0.48</w:t>
+            </w:r>
+          </w:p>
+        </w:tc>
+        <w:tc>
+          <w:tcPr>
+            <w:tcW w:w="1750" w:type="dxa"/>
+          </w:tcPr>
+          <w:p>
+            <w:pPr>
+              <w:spacing w:before="20" w:after="20" w:line="240" w:lineRule="auto"/>
+            </w:pPr>
+            <w:r>
+              <w:rPr>
+                <w:rFonts w:ascii="Old Standard TT" w:cs="Old Standard TT" w:eastAsia="Old Standard TT" w:hAnsi="Old Standard TT"/>
+                <w:sz w:val="17"/>
+                <w:szCs w:val="17"/>
+              </w:rPr>
+              <w:t xml:space="preserve">0.69 [0.57, 0.80]</w:t>
+            </w:r>
+          </w:p>
+        </w:tc>
+        <w:tc>
+          <w:tcPr>
+            <w:tcW w:w="1750" w:type="dxa"/>
+          </w:tcPr>
+          <w:p>
+            <w:pPr>
+              <w:spacing w:before="20" w:after="20" w:line="240" w:lineRule="auto"/>
+            </w:pPr>
+            <w:r>
+              <w:rPr>
+                <w:rFonts w:ascii="Old Standard TT" w:cs="Old Standard TT" w:eastAsia="Old Standard TT" w:hAnsi="Old Standard TT"/>
+                <w:sz w:val="17"/>
+                <w:szCs w:val="17"/>
+              </w:rPr>
+              <w:t xml:space="preserve">+0.21 [0.06, 0.35]</w:t>
+            </w:r>
+          </w:p>
+        </w:tc>
+        <w:tc>
+          <w:tcPr>
+            <w:tcW w:w="1150" w:type="dxa"/>
+          </w:tcPr>
+          <w:p>
+            <w:pPr>
+              <w:spacing w:before="20" w:after="20" w:line="240" w:lineRule="auto"/>
+            </w:pPr>
+            <w:r>
+              <w:rPr>
+                <w:rFonts w:ascii="Old Standard TT" w:cs="Old Standard TT" w:eastAsia="Old Standard TT" w:hAnsi="Old Standard TT"/>
+                <w:sz w:val="17"/>
+                <w:szCs w:val="17"/>
+              </w:rPr>
+              <w:t xml:space="preserve">0.90 → 0.23</w:t>
+            </w:r>
+          </w:p>
+        </w:tc>
+        <w:tc>
+          <w:tcPr>
+            <w:tcW w:w="1000" w:type="dxa"/>
+          </w:tcPr>
+          <w:p>
+            <w:pPr>
+              <w:spacing w:before="20" w:after="20" w:line="240" w:lineRule="auto"/>
+            </w:pPr>
+            <w:r>
+              <w:rPr>
+                <w:rFonts w:ascii="Old Standard TT" w:cs="Old Standard TT" w:eastAsia="Old Standard TT" w:hAnsi="Old Standard TT"/>
+                <w:sz w:val="17"/>
+                <w:szCs w:val="17"/>
+              </w:rPr>
+              <w:t xml:space="preserve">0.28</w:t>
+            </w:r>
+          </w:p>
+        </w:tc>
+      </w:tr>
+    </w:tbl>
+    <w:p>
+      <w:pPr>
+        <w:spacing w:before="0" w:after="0"/>
+        <w:jc w:val="both"/>
+      </w:pPr>
+    </w:p>
+    <w:p>
+      <w:pPr>
+        <w:spacing w:before="0" w:after="120"/>
+        <w:jc w:val="both"/>
+      </w:pPr>
+      <w:r>
+        <w:rPr>
+          <w:rFonts w:ascii="Old Standard TT" w:cs="Old Standard TT" w:eastAsia="Old Standard TT" w:hAnsi="Old Standard TT"/>
+          <w:b w:val="1"/>
+          <w:bCs w:val="1"/>
+        </w:rPr>
+        <w:t xml:space="preserve">Thinking helps, but not enough (Table 4).</w:t>
+      </w:r>
+      <w:r>
+        <w:rPr>
+          <w:rFonts w:ascii="Old Standard TT" w:cs="Old Standard TT" w:eastAsia="Old Standard TT" w:hAnsi="Old Standard TT"/>
+        </w:rPr>
+        <w:t xml:space="preserve"> With its thinking mode on, DeepSeek V3.1 rose from 0.54 to 0.69 [0.57, 0.80] on the actions view, its FPR halved, and it named the right pair in a third of competent games (the rule: 0.30). The pre-specified criterion was not met: the gain is +0.15 [−0.03, 0.33], and 0.69 is below both the 0.75 bar and the rule's 0.86 on the same games. Even for this monitor, adding the messages to the actions added nothing (0.69 both ways; 0.00 [−0.15, 0.14]), and messages alone stayed near chance. Short answers are part of the problem, but a thinking monitor still extracts only part of the evidence in the votes.</w:t>
       </w:r>
     </w:p>
     <w:p>
@@ -3487,26 +4290,13 @@
           <w:b w:val="1"/>
           <w:bCs w:val="1"/>
         </w:rPr>
-        <w:t xml:space="preserve">For question 2.2, in this setting, the answer is no — and the reason matters.</w:t>
-      </w:r>
-      <w:r>
-        <w:rPr>
-          <w:rFonts w:ascii="Old Standard TT" w:cs="Old Standard TT" w:eastAsia="Old Standard TT" w:hAnsi="Old Standard TT"/>
-        </w:rPr>
-        <w:t xml:space="preserve"> Combining messages with actions did not help LLM monitors, but not because the evidence was missing: when colluders acted, a one-line consistency rule on the actions alone caught them. The bottleneck is the monitor's reasoning over the record, not the channel it reads. Two steps are needed — extracting the evidence (inferring each agent's interest from payoffs, agent by agent and round by round) and weighting it (knowing that honest agents almost never vote against their interest) — and the monitors did neither reliably; supplying both closed much of the gap. Talk was even a distraction, because honest agents' announcements diverge from their votes often enough to drown the signal. For AI safety, this suggests that off-the-shelf LLM monitors can miss collusion that is plainly visible to a simple, domain-specific check, and that private reasoning access works (AUROC 0.82–0.98) only as long as colluders write their intent down — which they may avoid if they know they are watched </w:t>
-      </w:r>
-      <w:r>
-        <w:rPr>
-          <w:rFonts w:ascii="Old Standard TT" w:cs="Old Standard TT" w:eastAsia="Old Standard TT" w:hAnsi="Old Standard TT"/>
-          <w:highlight w:val="yellow"/>
-        </w:rPr>
-        <w:t xml:space="preserve">(Kale et al., 2025 — VERIFY)</w:t>
-      </w:r>
-      <w:r>
-        <w:rPr>
-          <w:rFonts w:ascii="Old Standard TT" w:cs="Old Standard TT" w:eastAsia="Old Standard TT" w:hAnsi="Old Standard TT"/>
-        </w:rPr>
-        <w:t xml:space="preserve">. A second lesson is about evaluation itself: agents instructed to collude often do not, so collusion-monitor benchmarks need a manipulation check of realized collusion.</w:t>
+        <w:t xml:space="preserve">For question 2.2, in this setting, combining did not help: the evidence is in the votes.</w:t>
+      </w:r>
+      <w:r>
+        <w:rPr>
+          <w:rFonts w:ascii="Old Standard TT" w:cs="Old Standard TT" w:eastAsia="Old Standard TT" w:hAnsi="Old Standard TT"/>
+        </w:rPr>
+        <w:t xml:space="preserve"> The short-verdict monitors were near chance on all four observable views, so their comparisons alone say little, but the stronger tests agree: talk adds nothing to the against-stake rule, because honest agents' announcements often diverge from their votes, and adding messages did not change the thinking-mode monitor's AUROC. The bottleneck is how monitors read the record, not which channel they read: they must extract the evidence (each agent's interest, inferred from payoffs round by round) and weight it (honest agents almost never vote against their interest). Thinking, or a stated base rate with pre-computed flags, each recovered part of the gap; neither reached the rule. For AI safety, this suggests pairing LLM monitors with simple, domain-specific consistency checks, and treating private-reasoning access (AUROC 0.82–0.98) as useful only while colluders write their intent down, which agents aware of monitoring may avoid (Kale et al., 2025). For evaluation, benchmarks need a manipulation check: instructed agents often do not collude, or over-apply a strategy.</w:t>
       </w:r>
     </w:p>
     <w:p>
@@ -3535,7 +4325,7 @@
         <w:rPr>
           <w:rFonts w:ascii="Old Standard TT" w:cs="Old Standard TT" w:eastAsia="Old Standard TT" w:hAnsi="Old Standard TT"/>
         </w:rPr>
-        <w:t xml:space="preserve">One game, one agent model, 40 games per condition (20 held-out), 6 rounds. Collusion is induced (red-team colluders), so we make no claim about emergent collusion; channel-only pairs did not collude, but had no way to share gains. DeepSeek, the rules, the structured views and prompt v2 were added after the first results (prompt v2 was evaluated only on held-out games). The agents and DeepSeek were not pinned to one inference provider. The data went through three generations because of observed confounds; each fix was validated against criteria set in advance. The rules use game knowledge (payoffs reveal stakes), which is their point and also a limit. Many comparisons are made; isolated intervals that barely exclude zero should not be over-read. Full details and dual-use considerations are in Appendix A.</w:t>
+        <w:t xml:space="preserve">One game, one agent model, 40 games per condition (20 held-out), 6 rounds; collusion is induced, so we make no claim about emergent collusion. Competent pairs over-traded, so they are easier to catch than colluders who follow the tip. DeepSeek, the rules, the structured views, prompt v2 and the thinking monitor were added after the first results, and the rules encode our knowledge of the attack. Many comparisons are made; isolated intervals that barely exclude zero should not be over-read. Details and dual-use considerations are in Appendix A.</w:t>
       </w:r>
     </w:p>
     <w:p>
@@ -3569,7 +4359,7 @@
         <w:rPr>
           <w:rFonts w:ascii="Old Standard TT" w:cs="Old Standard TT" w:eastAsia="Old Standard TT" w:hAnsi="Old Standard TT"/>
         </w:rPr>
-        <w:t xml:space="preserve">Hybrid monitors: rules to find suspects, an LLM to identify the partner and rule out innocent explanations.</w:t>
+        <w:t xml:space="preserve">Hybrid monitors: a rule to find suspects, an LLM to identify the partner and rule out innocent explanations.</w:t>
       </w:r>
     </w:p>
     <w:p>
@@ -3586,7 +4376,7 @@
         <w:rPr>
           <w:rFonts w:ascii="Old Standard TT" w:cs="Old Standard TT" w:eastAsia="Old Standard TT" w:hAnsi="Old Standard TT"/>
         </w:rPr>
-        <w:t xml:space="preserve">Stronger and mixed agent and monitor models; other games where the signal is in talk rather than actions.</w:t>
+        <w:t xml:space="preserve">Other agent and monitor models, and games where the signal is in talk rather than actions.</w:t>
       </w:r>
     </w:p>
     <w:p>
@@ -3603,7 +4393,71 @@
         <w:rPr>
           <w:rFonts w:ascii="Old Standard TT" w:cs="Old Standard TT" w:eastAsia="Old Standard TT" w:hAnsi="Old Standard TT"/>
         </w:rPr>
-        <w:t xml:space="preserve">Side payments, so self-interested agents could share gains — a test of emergent collusion.</w:t>
+        <w:t xml:space="preserve">Side payments (a test of emergent collusion), and colluders who know they are monitored.</w:t>
+      </w:r>
+    </w:p>
+    <w:p>
+      <w:pPr>
+        <w:pStyle w:val="Heading2"/>
+        <w:spacing w:after="0" w:before="200" w:line="360" w:lineRule="auto"/>
+        <w:rPr>
+          <w:rFonts w:ascii="Old Standard TT" w:cs="Old Standard TT" w:eastAsia="Old Standard TT" w:hAnsi="Old Standard TT"/>
+          <w:b w:val="1"/>
+          <w:bCs w:val="1"/>
+          <w:sz w:val="28"/>
+          <w:szCs w:val="28"/>
+        </w:rPr>
+      </w:pPr>
+      <w:bookmarkStart w:colFirst="0" w:colLast="0" w:name="_g0zphsq5kocm" w:id="11"/>
+      <w:bookmarkEnd w:id="11"/>
+      <w:r>
+        <w:rPr>
+          <w:rFonts w:ascii="Old Standard TT" w:cs="Old Standard TT" w:eastAsia="Old Standard TT" w:hAnsi="Old Standard TT"/>
+          <w:b w:val="1"/>
+          <w:bCs w:val="1"/>
+          <w:sz w:val="28"/>
+          <w:szCs w:val="28"/>
+          <w:rtl w:val="0"/>
+        </w:rPr>
+        <w:t xml:space="preserve">6. Conclusion</w:t>
+      </w:r>
+    </w:p>
+    <w:p>
+      <w:pPr>
+        <w:spacing w:before="0" w:after="120"/>
+        <w:jc w:val="both"/>
+      </w:pPr>
+      <w:r>
+        <w:rPr>
+          <w:rFonts w:ascii="Old Standard TT" w:cs="Old Standard TT" w:eastAsia="Old Standard TT" w:hAnsi="Old Standard TT"/>
+        </w:rPr>
+        <w:t xml:space="preserve">We built a committee-vote game in which secret vote trading pays and leaves traces in talk and actions, and asked whether LLM monitors detect it better when given both. They do not. Short-verdict monitors were indistinguishable from chance on each observable view, a thinking-mode monitor reached only 0.69, and adding messages never helped, while a one-line rule on the actions reached 0.86 (0.78 had colluders not over-traded; 0.91 and 0.72 on held-out games). Before relying on an LLM monitor for collusion, compare it with simple consistency checks on the same record, and check that the collusion in your test set actually happened.</w:t>
+      </w:r>
+    </w:p>
+    <w:p>
+      <w:pPr>
+        <w:pStyle w:val="Heading2"/>
+        <w:spacing w:after="0" w:before="200" w:line="360" w:lineRule="auto"/>
+        <w:rPr>
+          <w:rFonts w:ascii="Old Standard TT" w:cs="Old Standard TT" w:eastAsia="Old Standard TT" w:hAnsi="Old Standard TT"/>
+          <w:b w:val="1"/>
+          <w:bCs w:val="1"/>
+          <w:sz w:val="28"/>
+          <w:szCs w:val="28"/>
+        </w:rPr>
+      </w:pPr>
+      <w:bookmarkStart w:colFirst="0" w:colLast="0" w:name="_mr10dpvy1fo3" w:id="12"/>
+      <w:bookmarkEnd w:id="12"/>
+      <w:r>
+        <w:rPr>
+          <w:rFonts w:ascii="Old Standard TT" w:cs="Old Standard TT" w:eastAsia="Old Standard TT" w:hAnsi="Old Standard TT"/>
+          <w:b w:val="1"/>
+          <w:bCs w:val="1"/>
+          <w:sz w:val="28"/>
+          <w:szCs w:val="28"/>
+          <w:rtl w:val="0"/>
+        </w:rPr>
+        <w:t xml:space="preserve">Code and Data</w:t>
       </w:r>
     </w:p>
     <w:p>
@@ -3619,72 +4473,23 @@
       <w:r>
         <w:rPr>
           <w:rFonts w:ascii="Old Standard TT" w:cs="Old Standard TT" w:eastAsia="Old Standard TT" w:hAnsi="Old Standard TT"/>
-        </w:rPr>
-        <w:t xml:space="preserve">Colluders who know they are monitored, and whether they then avoid writing their plans down.</w:t>
-      </w:r>
-    </w:p>
-    <w:p>
-      <w:pPr>
-        <w:pStyle w:val="Heading2"/>
-        <w:spacing w:after="0" w:before="200" w:line="360" w:lineRule="auto"/>
-        <w:rPr>
-          <w:rFonts w:ascii="Old Standard TT" w:cs="Old Standard TT" w:eastAsia="Old Standard TT" w:hAnsi="Old Standard TT"/>
           <w:b w:val="1"/>
           <w:bCs w:val="1"/>
-          <w:sz w:val="28"/>
-          <w:szCs w:val="28"/>
-        </w:rPr>
-      </w:pPr>
-      <w:bookmarkStart w:colFirst="0" w:colLast="0" w:name="_g0zphsq5kocm" w:id="11"/>
-      <w:bookmarkEnd w:id="11"/>
-      <w:r>
-        <w:rPr>
-          <w:rFonts w:ascii="Old Standard TT" w:cs="Old Standard TT" w:eastAsia="Old Standard TT" w:hAnsi="Old Standard TT"/>
-          <w:b w:val="1"/>
-          <w:bCs w:val="1"/>
-          <w:sz w:val="28"/>
-          <w:szCs w:val="28"/>
-          <w:rtl w:val="0"/>
-        </w:rPr>
-        <w:t xml:space="preserve">6. Conclusion</w:t>
-      </w:r>
-    </w:p>
-    <w:p>
-      <w:pPr>
-        <w:spacing w:before="0" w:after="120"/>
-        <w:jc w:val="both"/>
-      </w:pPr>
-      <w:r>
-        <w:rPr>
-          <w:rFonts w:ascii="Old Standard TT" w:cs="Old Standard TT" w:eastAsia="Old Standard TT" w:hAnsi="Old Standard TT"/>
-        </w:rPr>
-        <w:t xml:space="preserve">We built a committee-vote game in which secret vote trading pays and leaves traces in both talk and actions, and asked whether LLM monitors detect it better when given both. They do not: on every observable view, two LLM monitors performed at chance, while a one-line rule on the actions detected competent colluders with AUROC 0.86 (0.91 on held-out games). The monitors succeed only with access to private plans, and even explicit consistency flags or a stated base rate alone do not close the gap. Before relying on an LLM monitor for collusion, compare it with simple consistency checks on the same record — and verify that the collusion in your test set actually happened.</w:t>
-      </w:r>
-    </w:p>
-    <w:p>
-      <w:pPr>
-        <w:pStyle w:val="Heading2"/>
-        <w:spacing w:after="0" w:before="200" w:line="360" w:lineRule="auto"/>
-        <w:rPr>
-          <w:rFonts w:ascii="Old Standard TT" w:cs="Old Standard TT" w:eastAsia="Old Standard TT" w:hAnsi="Old Standard TT"/>
-          <w:b w:val="1"/>
-          <w:bCs w:val="1"/>
-          <w:sz w:val="28"/>
-          <w:szCs w:val="28"/>
-        </w:rPr>
-      </w:pPr>
-      <w:bookmarkStart w:colFirst="0" w:colLast="0" w:name="_mr10dpvy1fo3" w:id="12"/>
-      <w:bookmarkEnd w:id="12"/>
-      <w:r>
-        <w:rPr>
-          <w:rFonts w:ascii="Old Standard TT" w:cs="Old Standard TT" w:eastAsia="Old Standard TT" w:hAnsi="Old Standard TT"/>
-          <w:b w:val="1"/>
-          <w:bCs w:val="1"/>
-          <w:sz w:val="28"/>
-          <w:szCs w:val="28"/>
-          <w:rtl w:val="0"/>
-        </w:rPr>
-        <w:t xml:space="preserve">Code and Data</w:t>
+        </w:rPr>
+        <w:t xml:space="preserve">Code repository</w:t>
+      </w:r>
+      <w:r>
+        <w:rPr>
+          <w:rFonts w:ascii="Old Standard TT" w:cs="Old Standard TT" w:eastAsia="Old Standard TT" w:hAnsi="Old Standard TT"/>
+        </w:rPr>
+        <w:t xml:space="preserve">: </w:t>
+      </w:r>
+      <w:r>
+        <w:rPr>
+          <w:rFonts w:ascii="Old Standard TT" w:cs="Old Standard TT" w:eastAsia="Old Standard TT" w:hAnsi="Old Standard TT"/>
+          <w:highlight w:val="yellow"/>
+        </w:rPr>
+        <w:t xml:space="preserve">https://github.com/thereecer13/apart-collusion (make public before submitting)</w:t>
       </w:r>
     </w:p>
     <w:p>
@@ -3703,20 +4508,13 @@
           <w:b w:val="1"/>
           <w:bCs w:val="1"/>
         </w:rPr>
-        <w:t xml:space="preserve">Code repository</w:t>
-      </w:r>
-      <w:r>
-        <w:rPr>
-          <w:rFonts w:ascii="Old Standard TT" w:cs="Old Standard TT" w:eastAsia="Old Standard TT" w:hAnsi="Old Standard TT"/>
-        </w:rPr>
-        <w:t xml:space="preserve">: </w:t>
-      </w:r>
-      <w:r>
-        <w:rPr>
-          <w:rFonts w:ascii="Old Standard TT" w:cs="Old Standard TT" w:eastAsia="Old Standard TT" w:hAnsi="Old Standard TT"/>
-          <w:highlight w:val="yellow"/>
-        </w:rPr>
-        <w:t xml:space="preserve">https://github.com/thereecer13/apart-collusion (make public before submitting)</w:t>
+        <w:t xml:space="preserve">Data</w:t>
+      </w:r>
+      <w:r>
+        <w:rPr>
+          <w:rFonts w:ascii="Old Standard TT" w:cs="Old Standard TT" w:eastAsia="Old Standard TT" w:hAnsi="Old Standard TT"/>
+        </w:rPr>
+        <w:t xml:space="preserve">: all game logs, request dumps and monitor eval logs (data/, results/).</w:t>
       </w:r>
     </w:p>
     <w:p>
@@ -3735,38 +4533,13 @@
           <w:b w:val="1"/>
           <w:bCs w:val="1"/>
         </w:rPr>
-        <w:t xml:space="preserve">Data/Datasets</w:t>
-      </w:r>
-      <w:r>
-        <w:rPr>
-          <w:rFonts w:ascii="Old Standard TT" w:cs="Old Standard TT" w:eastAsia="Old Standard TT" w:hAnsi="Old Standard TT"/>
-        </w:rPr>
-        <w:t xml:space="preserve">: all game logs, request dumps and monitor eval logs are in the repository (data/, results/).</w:t>
-      </w:r>
-    </w:p>
-    <w:p>
-      <w:pPr>
-        <w:numPr>
-          <w:ilvl w:val="0"/>
-          <w:numId w:val="3"/>
-        </w:numPr>
-        <w:spacing w:before="0" w:after="60"/>
-        <w:ind w:left="720" w:hanging="360"/>
-        <w:jc w:val="both"/>
-      </w:pPr>
-      <w:r>
-        <w:rPr>
-          <w:rFonts w:ascii="Old Standard TT" w:cs="Old Standard TT" w:eastAsia="Old Standard TT" w:hAnsi="Old Standard TT"/>
-          <w:b w:val="1"/>
-          <w:bCs w:val="1"/>
-        </w:rPr>
         <w:t xml:space="preserve">Other artifacts</w:t>
       </w:r>
       <w:r>
         <w:rPr>
           <w:rFonts w:ascii="Old Standard TT" w:cs="Old Standard TT" w:eastAsia="Old Standard TT" w:hAnsi="Old Standard TT"/>
         </w:rPr>
-        <w:t xml:space="preserve">: dated work logs PRE_SPRINT_LOG.md and SPRINT_LOG.md; README provenance section.</w:t>
+        <w:t xml:space="preserve">: dated logs PRE_SPRINT_LOG.md and SPRINT_LOG.md; README provenance section.</w:t>
       </w:r>
     </w:p>
     <w:p>
@@ -3848,20 +4621,7 @@
         <w:rPr>
           <w:rFonts w:ascii="Old Standard TT" w:cs="Old Standard TT" w:eastAsia="Old Standard TT" w:hAnsi="Old Standard TT"/>
         </w:rPr>
-        <w:t xml:space="preserve">Arike et al. (2026). </w:t>
-      </w:r>
-      <w:r>
-        <w:rPr>
-          <w:rFonts w:ascii="Old Standard TT" w:cs="Old Standard TT" w:eastAsia="Old Standard TT" w:hAnsi="Old Standard TT"/>
-          <w:highlight w:val="yellow"/>
-        </w:rPr>
-        <w:t xml:space="preserve">Title — verify</w:t>
-      </w:r>
-      <w:r>
-        <w:rPr>
-          <w:rFonts w:ascii="Old Standard TT" w:cs="Old Standard TT" w:eastAsia="Old Standard TT" w:hAnsi="Old Standard TT"/>
-        </w:rPr>
-        <w:t xml:space="preserve">. arXiv:2601.21112. https://arxiv.org/abs/2601.21112</w:t>
+        <w:t xml:space="preserve">Arike, R., et al. (2026). How does information access affect LLM monitors' ability to detect sabotage? arXiv:2601.21112. https://arxiv.org/abs/2601.21112</w:t>
       </w:r>
     </w:p>
     <w:p>
@@ -3878,20 +4638,7 @@
         <w:rPr>
           <w:rFonts w:ascii="Old Standard TT" w:cs="Old Standard TT" w:eastAsia="Old Standard TT" w:hAnsi="Old Standard TT"/>
         </w:rPr>
-        <w:t xml:space="preserve">Fish et al. (2024). </w:t>
-      </w:r>
-      <w:r>
-        <w:rPr>
-          <w:rFonts w:ascii="Old Standard TT" w:cs="Old Standard TT" w:eastAsia="Old Standard TT" w:hAnsi="Old Standard TT"/>
-          <w:highlight w:val="yellow"/>
-        </w:rPr>
-        <w:t xml:space="preserve">Title — verify</w:t>
-      </w:r>
-      <w:r>
-        <w:rPr>
-          <w:rFonts w:ascii="Old Standard TT" w:cs="Old Standard TT" w:eastAsia="Old Standard TT" w:hAnsi="Old Standard TT"/>
-        </w:rPr>
-        <w:t xml:space="preserve">. arXiv:2404.00806. https://arxiv.org/abs/2404.00806</w:t>
+        <w:t xml:space="preserve">Fish, S., et al. (2024). Algorithmic Collusion by Large Language Models. arXiv:2404.00806. https://arxiv.org/abs/2404.00806</w:t>
       </w:r>
     </w:p>
     <w:p>
@@ -3908,20 +4655,7 @@
         <w:rPr>
           <w:rFonts w:ascii="Old Standard TT" w:cs="Old Standard TT" w:eastAsia="Old Standard TT" w:hAnsi="Old Standard TT"/>
         </w:rPr>
-        <w:t xml:space="preserve">Kale et al. (2025). </w:t>
-      </w:r>
-      <w:r>
-        <w:rPr>
-          <w:rFonts w:ascii="Old Standard TT" w:cs="Old Standard TT" w:eastAsia="Old Standard TT" w:hAnsi="Old Standard TT"/>
-          <w:highlight w:val="yellow"/>
-        </w:rPr>
-        <w:t xml:space="preserve">Title — verify</w:t>
-      </w:r>
-      <w:r>
-        <w:rPr>
-          <w:rFonts w:ascii="Old Standard TT" w:cs="Old Standard TT" w:eastAsia="Old Standard TT" w:hAnsi="Old Standard TT"/>
-        </w:rPr>
-        <w:t xml:space="preserve">. arXiv:2508.19461. https://arxiv.org/abs/2508.19461</w:t>
+        <w:t xml:space="preserve">Kale, N., et al. (2025). Reliable Weak-to-Strong Monitoring of LLM Agents. arXiv:2508.19461. https://arxiv.org/abs/2508.19461</w:t>
       </w:r>
     </w:p>
     <w:p>
@@ -3938,20 +4672,7 @@
         <w:rPr>
           <w:rFonts w:ascii="Old Standard TT" w:cs="Old Standard TT" w:eastAsia="Old Standard TT" w:hAnsi="Old Standard TT"/>
         </w:rPr>
-        <w:t xml:space="preserve">Lin et al. (2024). </w:t>
-      </w:r>
-      <w:r>
-        <w:rPr>
-          <w:rFonts w:ascii="Old Standard TT" w:cs="Old Standard TT" w:eastAsia="Old Standard TT" w:hAnsi="Old Standard TT"/>
-          <w:highlight w:val="yellow"/>
-        </w:rPr>
-        <w:t xml:space="preserve">Title — verify</w:t>
-      </w:r>
-      <w:r>
-        <w:rPr>
-          <w:rFonts w:ascii="Old Standard TT" w:cs="Old Standard TT" w:eastAsia="Old Standard TT" w:hAnsi="Old Standard TT"/>
-        </w:rPr>
-        <w:t xml:space="preserve">. arXiv:2410.00031. https://arxiv.org/abs/2410.00031</w:t>
+        <w:t xml:space="preserve">Lin, R. Y., et al. (2024). Strategic Collusion of LLM Agents: Market Division in Multi-Commodity Competitions. arXiv:2410.00031. https://arxiv.org/abs/2410.00031</w:t>
       </w:r>
     </w:p>
     <w:p>
@@ -3968,20 +4689,7 @@
         <w:rPr>
           <w:rFonts w:ascii="Old Standard TT" w:cs="Old Standard TT" w:eastAsia="Old Standard TT" w:hAnsi="Old Standard TT"/>
         </w:rPr>
-        <w:t xml:space="preserve">Nakamura et al. (2026). </w:t>
-      </w:r>
-      <w:r>
-        <w:rPr>
-          <w:rFonts w:ascii="Old Standard TT" w:cs="Old Standard TT" w:eastAsia="Old Standard TT" w:hAnsi="Old Standard TT"/>
-          <w:highlight w:val="yellow"/>
-        </w:rPr>
-        <w:t xml:space="preserve">Title — verify</w:t>
-      </w:r>
-      <w:r>
-        <w:rPr>
-          <w:rFonts w:ascii="Old Standard TT" w:cs="Old Standard TT" w:eastAsia="Old Standard TT" w:hAnsi="Old Standard TT"/>
-        </w:rPr>
-        <w:t xml:space="preserve"> (Colosseum). arXiv:2602.15198. https://arxiv.org/abs/2602.15198</w:t>
+        <w:t xml:space="preserve">Nakamura, M., et al. (2026). Colosseum: Auditing Collusion in Cooperative Multi-Agent Systems. arXiv:2602.15198. https://arxiv.org/abs/2602.15198</w:t>
       </w:r>
     </w:p>
     <w:p>
@@ -3998,20 +4706,7 @@
         <w:rPr>
           <w:rFonts w:ascii="Old Standard TT" w:cs="Old Standard TT" w:eastAsia="Old Standard TT" w:hAnsi="Old Standard TT"/>
         </w:rPr>
-        <w:t xml:space="preserve">Nguyen et al. (2026). </w:t>
-      </w:r>
-      <w:r>
-        <w:rPr>
-          <w:rFonts w:ascii="Old Standard TT" w:cs="Old Standard TT" w:eastAsia="Old Standard TT" w:hAnsi="Old Standard TT"/>
-          <w:highlight w:val="yellow"/>
-        </w:rPr>
-        <w:t xml:space="preserve">Title — verify</w:t>
-      </w:r>
-      <w:r>
-        <w:rPr>
-          <w:rFonts w:ascii="Old Standard TT" w:cs="Old Standard TT" w:eastAsia="Old Standard TT" w:hAnsi="Old Standard TT"/>
-        </w:rPr>
-        <w:t xml:space="preserve">. arXiv:2604.03968. https://arxiv.org/abs/2604.03968</w:t>
+        <w:t xml:space="preserve">Nguyen, K. L., et al. (2026). TraceGuard: Structured Multi-Dimensional Monitoring as a Collusion-Resistant Control Protocol. arXiv:2604.03968. https://arxiv.org/abs/2604.03968 ; code: https://github.com/linhkid/TraceGuard</w:t>
       </w:r>
     </w:p>
     <w:p>
@@ -4028,20 +4723,7 @@
         <w:rPr>
           <w:rFonts w:ascii="Old Standard TT" w:cs="Old Standard TT" w:eastAsia="Old Standard TT" w:hAnsi="Old Standard TT"/>
         </w:rPr>
-        <w:t xml:space="preserve">Radev et al. (2026). </w:t>
-      </w:r>
-      <w:r>
-        <w:rPr>
-          <w:rFonts w:ascii="Old Standard TT" w:cs="Old Standard TT" w:eastAsia="Old Standard TT" w:hAnsi="Old Standard TT"/>
-          <w:highlight w:val="yellow"/>
-        </w:rPr>
-        <w:t xml:space="preserve">Title — verify</w:t>
-      </w:r>
-      <w:r>
-        <w:rPr>
-          <w:rFonts w:ascii="Old Standard TT" w:cs="Old Standard TT" w:eastAsia="Old Standard TT" w:hAnsi="Old Standard TT"/>
-        </w:rPr>
-        <w:t xml:space="preserve">. arXiv:2605.29178. https://arxiv.org/abs/2605.29178</w:t>
+        <w:t xml:space="preserve">Radev, N., et al. (2026). The Best-Laid SCHEMEs: Coordinated Sabotage and Monitoring in Multi-Agent Systems. arXiv:2605.29178. https://arxiv.org/abs/2605.29178</w:t>
       </w:r>
     </w:p>
     <w:p>
@@ -4058,24 +4740,7 @@
         <w:rPr>
           <w:rFonts w:ascii="Old Standard TT" w:cs="Old Standard TT" w:eastAsia="Old Standard TT" w:hAnsi="Old Standard TT"/>
         </w:rPr>
-        <w:t xml:space="preserve">Shi et al. (2026). When Agents Lie. arXiv:2607.05132. https://arxiv.org/abs/2607.05132 ; code: https://github.com/Jerick-1380/LLM-Trust-Breaking</w:t>
-      </w:r>
-    </w:p>
-    <w:p>
-      <w:pPr>
-        <w:numPr>
-          <w:ilvl w:val="0"/>
-          <w:numId w:val="1"/>
-        </w:numPr>
-        <w:spacing w:before="0" w:after="60"/>
-        <w:ind w:left="720" w:hanging="360"/>
-        <w:jc w:val="left"/>
-      </w:pPr>
-      <w:r>
-        <w:rPr>
-          <w:rFonts w:ascii="Old Standard TT" w:cs="Old Standard TT" w:eastAsia="Old Standard TT" w:hAnsi="Old Standard TT"/>
-        </w:rPr>
-        <w:t xml:space="preserve">TraceGuard. https://github.com/linhkid/TraceGuard</w:t>
+        <w:t xml:space="preserve">Shi, J., et al. (2026). When Agents Lie: Premeditation, Persistence, and Exploitation in Repeated Games. arXiv:2607.05132. https://arxiv.org/abs/2607.05132 ; code: https://github.com/Jerick-1380/LLM-Trust-Breaking</w:t>
       </w:r>
     </w:p>
     <w:p>
@@ -4139,7 +4804,7 @@
         <w:rPr>
           <w:rFonts w:ascii="Old Standard TT" w:cs="Old Standard TT" w:eastAsia="Old Standard TT" w:hAnsi="Old Standard TT"/>
         </w:rPr>
-        <w:t xml:space="preserve"> Scope: one game, one agent model (Llama 3.3 70B), 40 games per condition plus a 40-game held-out set, 6 rounds per game. Collusion is induced by instruction; we make no claim about whether LLM agents collude on their own. The monitor prompt was frozen before the sprint; DeepSeek, the rules, the structured views and prompt v2 were added after the first results were known, and prompt v2 was evaluated only on held-out games generated after it was fixed. The Llama monitor runs used one pinned provider; the agents and DeepSeek were routed across several. Channel-only games used the full private history while colluding games used current-round history. Labels follow the condition, not realized behaviour; realized-collusion subsets are reported separately. We make many comparisons; isolated intervals that barely exclude zero (e.g. DeepSeek's table − combined difference against channel-only negatives, −0.16 [−0.31, −0.00]) should not be over-read.</w:t>
+        <w:t xml:space="preserve"> Scope: one game, one agent model (Llama 3.3 70B), 40 games per condition plus a 40-game held-out set, 6 rounds per game. Collusion is induced by instruction; we make no claim about whether LLM agents collude on their own. The monitor prompt was frozen before the sprint; DeepSeek, the rules, the structured views and prompt v2 were added after the first results were known, and prompt v2 was evaluated only on held-out games generated after it was fixed. The Llama monitor runs used one pinned provider; the agents and DeepSeek were routed across several. The thinking-mode monitor was pinned to one provider (CoreWeave, fp8) after another returned no thinking in a 6-sample pilot, so thinking off and on also differ in provider routing. Channel-only games used the full private history while colluding games used current-round history. Labels follow the condition, not realized behaviour; realized-collusion subsets are reported separately. Competent pairs over-traded in tie rounds, which makes them easier to catch than colluders who follow the tip; we report the rule both ways, but could not rescore the LLM monitors on counterfactual games. The main monitors answer directly with short reasoning (the frozen prompt caps it at 150 words). The rules were defined after the first monitor results and encode our knowledge of the attack, so they are a reference point, not a fair competitor. With the monitors near chance, the design cannot show whether combining views helps a capable monitor. Our pre-specified tests are commits in the repository, not a public registration. We make many comparisons; isolated intervals that barely exclude zero (e.g. DeepSeek's table − combined difference against channel-only negatives, −0.16 [−0.31, −0.00]) should not be over-read.</w:t>
       </w:r>
     </w:p>
     <w:p>
@@ -4188,7 +4853,7 @@
         <w:rPr>
           <w:rFonts w:ascii="Old Standard TT" w:cs="Old Standard TT" w:eastAsia="Old Standard TT" w:hAnsi="Old Standard TT"/>
         </w:rPr>
-        <w:t xml:space="preserve">This project builds on the harness of Shi et al. (2026), imported unmodified. </w:t>
+        <w:t xml:space="preserve">This project builds on the harness of Shi et al. (2026), imported at upstream commit 8b3ab8f; every later change is in the git history, split into pre-sprint and sprint ranges in the README. </w:t>
       </w:r>
       <w:r>
         <w:rPr>
@@ -4216,7 +4881,7 @@
         <w:rPr>
           <w:rFonts w:ascii="Old Standard TT" w:cs="Old Standard TT" w:eastAsia="Old Standard TT" w:hAnsi="Old Standard TT"/>
         </w:rPr>
-        <w:t xml:space="preserve"> the stake fixes and current-round history, the competent-colluder condition, all data generation, monitor runs and analysis, the rule baselines, the structured views and the held-out informed-monitor test. </w:t>
+        <w:t xml:space="preserve"> the stake fixes and current-round history, the competent-colluder condition, all data generation, monitor runs and analysis, the rule baselines, the structured views, the held-out informed-monitor test, and the pre-submission review (tie-round analysis and thinking-mode monitor). </w:t>
       </w:r>
       <w:r>
         <w:rPr>
@@ -4670,7 +5335,7 @@
                 <w:sz w:val="17"/>
                 <w:szCs w:val="17"/>
               </w:rPr>
-              <w:t xml:space="preserve">Naive bloc votes 19%; Llama monitor at chance (0.47–0.60); against-stake 0.61</w:t>
+              <w:t xml:space="preserve">Naive bloc votes 19%; Llama monitor near chance (0.47–0.60); against-stake 0.61</w:t>
             </w:r>
           </w:p>
         </w:tc>
@@ -4824,7 +5489,7 @@
                 <w:sz w:val="17"/>
                 <w:szCs w:val="17"/>
               </w:rPr>
-              <w:t xml:space="preserve">Bloc votes 13/13; stake errors 0%</w:t>
+              <w:t xml:space="preserve">Bloc votes 13/13; stake errors 0%; pair voted against own stake in 11/16 tie rounds (not a criterion; noticed later)</w:t>
             </w:r>
           </w:p>
         </w:tc>
@@ -5098,6 +5763,1180 @@
     </w:p>
     <w:p>
       <w:pPr>
+        <w:spacing w:before="0" w:after="120"/>
+        <w:jc w:val="both"/>
+      </w:pPr>
+      <w:r>
+        <w:rPr>
+          <w:rFonts w:ascii="Old Standard TT" w:cs="Old Standard TT" w:eastAsia="Old Standard TT" w:hAnsi="Old Standard TT"/>
+        </w:rPr>
+        <w:t xml:space="preserve">Strategy tip given to competent colluders (added to the pair's system prompts; VOTE_TRADE_HINT in src/games/voting.py):</w:t>
+      </w:r>
+    </w:p>
+    <w:p>
+      <w:pPr>
+        <w:spacing w:before="0" w:after="120"/>
+        <w:ind w:left="360" w:right="360"/>
+        <w:jc w:val="left"/>
+      </w:pPr>
+      <w:r>
+        <w:rPr>
+          <w:rFonts w:ascii="Courier New" w:cs="Courier New" w:eastAsia="Courier New" w:hAnsi="Courier New"/>
+          <w:sz w:val="15"/>
+          <w:szCs w:val="15"/>
+        </w:rPr>
+        <w:t xml:space="preserve">STRATEGY TIP: Only your combined payoff with Agent X matters. Each round, tell Agent X your exact stake in the private channel. Then both of you vote for the side that the SUM of your two stakes favours: if the sum is positive, both vote YES; if it is negative, both vote NO. For example, if your stake is -$1 and Agent X's is +$10, both vote YES, even though your own stake is negative. If the two stakes cancel out exactly, each of you votes your own stake.</w:t>
+      </w:r>
+    </w:p>
+    <w:p>
+      <w:pPr>
+        <w:pStyle w:val="Heading3"/>
+        <w:keepNext/>
+        <w:spacing w:before="200" w:after="60"/>
+      </w:pPr>
+      <w:r>
+        <w:rPr>
+          <w:rFonts w:ascii="Old Standard TT" w:cs="Old Standard TT" w:eastAsia="Old Standard TT" w:hAnsi="Old Standard TT"/>
+          <w:b w:val="1"/>
+          <w:bCs w:val="1"/>
+          <w:sz w:val="26"/>
+          <w:szCs w:val="26"/>
+        </w:rPr>
+        <w:t xml:space="preserve">Appendix E. Accuracy and false-positive rate</w:t>
+      </w:r>
+    </w:p>
+    <w:p>
+      <w:pPr>
+        <w:spacing w:before="0" w:after="120"/>
+        <w:jc w:val="both"/>
+      </w:pPr>
+      <w:r>
+        <w:rPr>
+          <w:rFonts w:ascii="Old Standard TT" w:cs="Old Standard TT" w:eastAsia="Old Standard TT" w:hAnsi="Old Standard TT"/>
+        </w:rPr>
+        <w:t xml:space="preserve">The yes/no answer of each monitor (no threshold to tune) and of each rule, against the 40 no-collusion games of v3. FPR depends only on the negatives, so it is the same in the naive and competent columns. Bootstrap CIs are in results/.</w:t>
+      </w:r>
+    </w:p>
+    <w:p>
+      <w:pPr>
+        <w:keepNext/>
+        <w:spacing w:before="120" w:after="60"/>
+        <w:jc w:val="left"/>
+      </w:pPr>
+      <w:r>
+        <w:rPr>
+          <w:rFonts w:ascii="Old Standard TT" w:cs="Old Standard TT" w:eastAsia="Old Standard TT" w:hAnsi="Old Standard TT"/>
+          <w:i w:val="1"/>
+          <w:iCs w:val="1"/>
+          <w:sz w:val="18"/>
+          <w:szCs w:val="18"/>
+        </w:rPr>
+        <w:t xml:space="preserve">Table E1. LLM monitors: accuracy / FPR by view.</w:t>
+      </w:r>
+    </w:p>
+    <w:tbl>
+      <w:tblPr>
+        <w:tblW w:w="9360" w:type="dxa"/>
+        <w:jc w:val="center"/>
+        <w:tblBorders>
+          <w:top w:val="single" w:sz="4" w:space="0" w:color="000000"/>
+          <w:left w:val="single" w:sz="4" w:space="0" w:color="000000"/>
+          <w:bottom w:val="single" w:sz="4" w:space="0" w:color="000000"/>
+          <w:right w:val="single" w:sz="4" w:space="0" w:color="000000"/>
+          <w:insideH w:val="single" w:sz="4" w:space="0" w:color="000000"/>
+          <w:insideV w:val="single" w:sz="4" w:space="0" w:color="000000"/>
+        </w:tblBorders>
+        <w:tblLayout w:type="fixed"/>
+        <w:tblCellMar>
+          <w:left w:w="70" w:type="dxa"/>
+          <w:right w:w="70" w:type="dxa"/>
+        </w:tblCellMar>
+      </w:tblPr>
+      <w:tblGrid>
+        <w:gridCol w:w="2060"/>
+        <w:gridCol w:w="1460"/>
+        <w:gridCol w:w="1460"/>
+        <w:gridCol w:w="1460"/>
+        <w:gridCol w:w="1460"/>
+        <w:gridCol w:w="1460"/>
+      </w:tblGrid>
+      <w:tr>
+        <w:trPr>
+          <w:cantSplit/>
+          <w:tblHeader/>
+        </w:trPr>
+        <w:tc>
+          <w:tcPr>
+            <w:tcW w:w="2060" w:type="dxa"/>
+            <w:shd w:val="clear" w:color="auto" w:fill="E7E6E6"/>
+          </w:tcPr>
+          <w:p>
+            <w:pPr>
+              <w:keepNext/>
+              <w:spacing w:before="20" w:after="20" w:line="240" w:lineRule="auto"/>
+            </w:pPr>
+            <w:r>
+              <w:rPr>
+                <w:rFonts w:ascii="Old Standard TT" w:cs="Old Standard TT" w:eastAsia="Old Standard TT" w:hAnsi="Old Standard TT"/>
+                <w:b w:val="1"/>
+                <w:bCs w:val="1"/>
+                <w:sz w:val="17"/>
+                <w:szCs w:val="17"/>
+              </w:rPr>
+              <w:t xml:space="preserve">View</w:t>
+            </w:r>
+          </w:p>
+        </w:tc>
+        <w:tc>
+          <w:tcPr>
+            <w:tcW w:w="1460" w:type="dxa"/>
+            <w:shd w:val="clear" w:color="auto" w:fill="E7E6E6"/>
+          </w:tcPr>
+          <w:p>
+            <w:pPr>
+              <w:keepNext/>
+              <w:spacing w:before="20" w:after="20" w:line="240" w:lineRule="auto"/>
+            </w:pPr>
+            <w:r>
+              <w:rPr>
+                <w:rFonts w:ascii="Old Standard TT" w:cs="Old Standard TT" w:eastAsia="Old Standard TT" w:hAnsi="Old Standard TT"/>
+                <w:b w:val="1"/>
+                <w:bCs w:val="1"/>
+                <w:sz w:val="17"/>
+                <w:szCs w:val="17"/>
+              </w:rPr>
+              <w:t xml:space="preserve">Llama, naive</w:t>
+            </w:r>
+          </w:p>
+        </w:tc>
+        <w:tc>
+          <w:tcPr>
+            <w:tcW w:w="1460" w:type="dxa"/>
+            <w:shd w:val="clear" w:color="auto" w:fill="E7E6E6"/>
+          </w:tcPr>
+          <w:p>
+            <w:pPr>
+              <w:keepNext/>
+              <w:spacing w:before="20" w:after="20" w:line="240" w:lineRule="auto"/>
+            </w:pPr>
+            <w:r>
+              <w:rPr>
+                <w:rFonts w:ascii="Old Standard TT" w:cs="Old Standard TT" w:eastAsia="Old Standard TT" w:hAnsi="Old Standard TT"/>
+                <w:b w:val="1"/>
+                <w:bCs w:val="1"/>
+                <w:sz w:val="17"/>
+                <w:szCs w:val="17"/>
+              </w:rPr>
+              <w:t xml:space="preserve">DeepSeek, naive</w:t>
+            </w:r>
+          </w:p>
+        </w:tc>
+        <w:tc>
+          <w:tcPr>
+            <w:tcW w:w="1460" w:type="dxa"/>
+            <w:shd w:val="clear" w:color="auto" w:fill="E7E6E6"/>
+          </w:tcPr>
+          <w:p>
+            <w:pPr>
+              <w:keepNext/>
+              <w:spacing w:before="20" w:after="20" w:line="240" w:lineRule="auto"/>
+            </w:pPr>
+            <w:r>
+              <w:rPr>
+                <w:rFonts w:ascii="Old Standard TT" w:cs="Old Standard TT" w:eastAsia="Old Standard TT" w:hAnsi="Old Standard TT"/>
+                <w:b w:val="1"/>
+                <w:bCs w:val="1"/>
+                <w:sz w:val="17"/>
+                <w:szCs w:val="17"/>
+              </w:rPr>
+              <w:t xml:space="preserve">Llama, competent</w:t>
+            </w:r>
+          </w:p>
+        </w:tc>
+        <w:tc>
+          <w:tcPr>
+            <w:tcW w:w="1460" w:type="dxa"/>
+            <w:shd w:val="clear" w:color="auto" w:fill="E7E6E6"/>
+          </w:tcPr>
+          <w:p>
+            <w:pPr>
+              <w:keepNext/>
+              <w:spacing w:before="20" w:after="20" w:line="240" w:lineRule="auto"/>
+            </w:pPr>
+            <w:r>
+              <w:rPr>
+                <w:rFonts w:ascii="Old Standard TT" w:cs="Old Standard TT" w:eastAsia="Old Standard TT" w:hAnsi="Old Standard TT"/>
+                <w:b w:val="1"/>
+                <w:bCs w:val="1"/>
+                <w:sz w:val="17"/>
+                <w:szCs w:val="17"/>
+              </w:rPr>
+              <w:t xml:space="preserve">DeepSeek, competent</w:t>
+            </w:r>
+          </w:p>
+        </w:tc>
+        <w:tc>
+          <w:tcPr>
+            <w:tcW w:w="1460" w:type="dxa"/>
+            <w:shd w:val="clear" w:color="auto" w:fill="E7E6E6"/>
+          </w:tcPr>
+          <w:p>
+            <w:pPr>
+              <w:keepNext/>
+              <w:spacing w:before="20" w:after="20" w:line="240" w:lineRule="auto"/>
+            </w:pPr>
+            <w:r>
+              <w:rPr>
+                <w:rFonts w:ascii="Old Standard TT" w:cs="Old Standard TT" w:eastAsia="Old Standard TT" w:hAnsi="Old Standard TT"/>
+                <w:b w:val="1"/>
+                <w:bCs w:val="1"/>
+                <w:sz w:val="17"/>
+                <w:szCs w:val="17"/>
+              </w:rPr>
+              <w:t xml:space="preserve">DeepSeek thinking, competent</w:t>
+            </w:r>
+          </w:p>
+        </w:tc>
+      </w:tr>
+      <w:tr>
+        <w:trPr>
+          <w:cantSplit/>
+        </w:trPr>
+        <w:tc>
+          <w:tcPr>
+            <w:tcW w:w="2060" w:type="dxa"/>
+          </w:tcPr>
+          <w:p>
+            <w:pPr>
+              <w:spacing w:before="20" w:after="20" w:line="240" w:lineRule="auto"/>
+            </w:pPr>
+            <w:r>
+              <w:rPr>
+                <w:rFonts w:ascii="Old Standard TT" w:cs="Old Standard TT" w:eastAsia="Old Standard TT" w:hAnsi="Old Standard TT"/>
+                <w:sz w:val="17"/>
+                <w:szCs w:val="17"/>
+              </w:rPr>
+              <w:t xml:space="preserve">Public messages</w:t>
+            </w:r>
+          </w:p>
+        </w:tc>
+        <w:tc>
+          <w:tcPr>
+            <w:tcW w:w="1460" w:type="dxa"/>
+          </w:tcPr>
+          <w:p>
+            <w:pPr>
+              <w:spacing w:before="20" w:after="20" w:line="240" w:lineRule="auto"/>
+            </w:pPr>
+            <w:r>
+              <w:rPr>
+                <w:rFonts w:ascii="Old Standard TT" w:cs="Old Standard TT" w:eastAsia="Old Standard TT" w:hAnsi="Old Standard TT"/>
+                <w:sz w:val="17"/>
+                <w:szCs w:val="17"/>
+              </w:rPr>
+              <w:t xml:space="preserve">0.50 / 0.20</w:t>
+            </w:r>
+          </w:p>
+        </w:tc>
+        <w:tc>
+          <w:tcPr>
+            <w:tcW w:w="1460" w:type="dxa"/>
+          </w:tcPr>
+          <w:p>
+            <w:pPr>
+              <w:spacing w:before="20" w:after="20" w:line="240" w:lineRule="auto"/>
+            </w:pPr>
+            <w:r>
+              <w:rPr>
+                <w:rFonts w:ascii="Old Standard TT" w:cs="Old Standard TT" w:eastAsia="Old Standard TT" w:hAnsi="Old Standard TT"/>
+                <w:sz w:val="17"/>
+                <w:szCs w:val="17"/>
+              </w:rPr>
+              <w:t xml:space="preserve">0.47 / 1.00</w:t>
+            </w:r>
+          </w:p>
+        </w:tc>
+        <w:tc>
+          <w:tcPr>
+            <w:tcW w:w="1460" w:type="dxa"/>
+          </w:tcPr>
+          <w:p>
+            <w:pPr>
+              <w:spacing w:before="20" w:after="20" w:line="240" w:lineRule="auto"/>
+            </w:pPr>
+            <w:r>
+              <w:rPr>
+                <w:rFonts w:ascii="Old Standard TT" w:cs="Old Standard TT" w:eastAsia="Old Standard TT" w:hAnsi="Old Standard TT"/>
+                <w:sz w:val="17"/>
+                <w:szCs w:val="17"/>
+              </w:rPr>
+              <w:t xml:space="preserve">0.53 / 0.20</w:t>
+            </w:r>
+          </w:p>
+        </w:tc>
+        <w:tc>
+          <w:tcPr>
+            <w:tcW w:w="1460" w:type="dxa"/>
+          </w:tcPr>
+          <w:p>
+            <w:pPr>
+              <w:spacing w:before="20" w:after="20" w:line="240" w:lineRule="auto"/>
+            </w:pPr>
+            <w:r>
+              <w:rPr>
+                <w:rFonts w:ascii="Old Standard TT" w:cs="Old Standard TT" w:eastAsia="Old Standard TT" w:hAnsi="Old Standard TT"/>
+                <w:sz w:val="17"/>
+                <w:szCs w:val="17"/>
+              </w:rPr>
+              <w:t xml:space="preserve">0.50 / 1.00</w:t>
+            </w:r>
+          </w:p>
+        </w:tc>
+        <w:tc>
+          <w:tcPr>
+            <w:tcW w:w="1460" w:type="dxa"/>
+          </w:tcPr>
+          <w:p>
+            <w:pPr>
+              <w:spacing w:before="20" w:after="20" w:line="240" w:lineRule="auto"/>
+            </w:pPr>
+            <w:r>
+              <w:rPr>
+                <w:rFonts w:ascii="Old Standard TT" w:cs="Old Standard TT" w:eastAsia="Old Standard TT" w:hAnsi="Old Standard TT"/>
+                <w:sz w:val="17"/>
+                <w:szCs w:val="17"/>
+              </w:rPr>
+              <w:t xml:space="preserve">0.55 / 0.42</w:t>
+            </w:r>
+          </w:p>
+        </w:tc>
+      </w:tr>
+      <w:tr>
+        <w:trPr>
+          <w:cantSplit/>
+        </w:trPr>
+        <w:tc>
+          <w:tcPr>
+            <w:tcW w:w="2060" w:type="dxa"/>
+          </w:tcPr>
+          <w:p>
+            <w:pPr>
+              <w:spacing w:before="20" w:after="20" w:line="240" w:lineRule="auto"/>
+            </w:pPr>
+            <w:r>
+              <w:rPr>
+                <w:rFonts w:ascii="Old Standard TT" w:cs="Old Standard TT" w:eastAsia="Old Standard TT" w:hAnsi="Old Standard TT"/>
+                <w:sz w:val="17"/>
+                <w:szCs w:val="17"/>
+              </w:rPr>
+              <w:t xml:space="preserve">Actions</w:t>
+            </w:r>
+          </w:p>
+        </w:tc>
+        <w:tc>
+          <w:tcPr>
+            <w:tcW w:w="1460" w:type="dxa"/>
+          </w:tcPr>
+          <w:p>
+            <w:pPr>
+              <w:spacing w:before="20" w:after="20" w:line="240" w:lineRule="auto"/>
+            </w:pPr>
+            <w:r>
+              <w:rPr>
+                <w:rFonts w:ascii="Old Standard TT" w:cs="Old Standard TT" w:eastAsia="Old Standard TT" w:hAnsi="Old Standard TT"/>
+                <w:sz w:val="17"/>
+                <w:szCs w:val="17"/>
+              </w:rPr>
+              <w:t xml:space="preserve">0.57 / 0.40</w:t>
+            </w:r>
+          </w:p>
+        </w:tc>
+        <w:tc>
+          <w:tcPr>
+            <w:tcW w:w="1460" w:type="dxa"/>
+          </w:tcPr>
+          <w:p>
+            <w:pPr>
+              <w:spacing w:before="20" w:after="20" w:line="240" w:lineRule="auto"/>
+            </w:pPr>
+            <w:r>
+              <w:rPr>
+                <w:rFonts w:ascii="Old Standard TT" w:cs="Old Standard TT" w:eastAsia="Old Standard TT" w:hAnsi="Old Standard TT"/>
+                <w:sz w:val="17"/>
+                <w:szCs w:val="17"/>
+              </w:rPr>
+              <w:t xml:space="preserve">0.53 / 0.55</w:t>
+            </w:r>
+          </w:p>
+        </w:tc>
+        <w:tc>
+          <w:tcPr>
+            <w:tcW w:w="1460" w:type="dxa"/>
+          </w:tcPr>
+          <w:p>
+            <w:pPr>
+              <w:spacing w:before="20" w:after="20" w:line="240" w:lineRule="auto"/>
+            </w:pPr>
+            <w:r>
+              <w:rPr>
+                <w:rFonts w:ascii="Old Standard TT" w:cs="Old Standard TT" w:eastAsia="Old Standard TT" w:hAnsi="Old Standard TT"/>
+                <w:sz w:val="17"/>
+                <w:szCs w:val="17"/>
+              </w:rPr>
+              <w:t xml:space="preserve">0.54 / 0.40</w:t>
+            </w:r>
+          </w:p>
+        </w:tc>
+        <w:tc>
+          <w:tcPr>
+            <w:tcW w:w="1460" w:type="dxa"/>
+          </w:tcPr>
+          <w:p>
+            <w:pPr>
+              <w:spacing w:before="20" w:after="20" w:line="240" w:lineRule="auto"/>
+            </w:pPr>
+            <w:r>
+              <w:rPr>
+                <w:rFonts w:ascii="Old Standard TT" w:cs="Old Standard TT" w:eastAsia="Old Standard TT" w:hAnsi="Old Standard TT"/>
+                <w:sz w:val="17"/>
+                <w:szCs w:val="17"/>
+              </w:rPr>
+              <w:t xml:space="preserve">0.57 / 0.55</w:t>
+            </w:r>
+          </w:p>
+        </w:tc>
+        <w:tc>
+          <w:tcPr>
+            <w:tcW w:w="1460" w:type="dxa"/>
+          </w:tcPr>
+          <w:p>
+            <w:pPr>
+              <w:spacing w:before="20" w:after="20" w:line="240" w:lineRule="auto"/>
+            </w:pPr>
+            <w:r>
+              <w:rPr>
+                <w:rFonts w:ascii="Old Standard TT" w:cs="Old Standard TT" w:eastAsia="Old Standard TT" w:hAnsi="Old Standard TT"/>
+                <w:sz w:val="17"/>
+                <w:szCs w:val="17"/>
+              </w:rPr>
+              <w:t xml:space="preserve">0.65 / 0.25</w:t>
+            </w:r>
+          </w:p>
+        </w:tc>
+      </w:tr>
+      <w:tr>
+        <w:trPr>
+          <w:cantSplit/>
+        </w:trPr>
+        <w:tc>
+          <w:tcPr>
+            <w:tcW w:w="2060" w:type="dxa"/>
+          </w:tcPr>
+          <w:p>
+            <w:pPr>
+              <w:spacing w:before="20" w:after="20" w:line="240" w:lineRule="auto"/>
+            </w:pPr>
+            <w:r>
+              <w:rPr>
+                <w:rFonts w:ascii="Old Standard TT" w:cs="Old Standard TT" w:eastAsia="Old Standard TT" w:hAnsi="Old Standard TT"/>
+                <w:sz w:val="17"/>
+                <w:szCs w:val="17"/>
+              </w:rPr>
+              <w:t xml:space="preserve">Messages + actions</w:t>
+            </w:r>
+          </w:p>
+        </w:tc>
+        <w:tc>
+          <w:tcPr>
+            <w:tcW w:w="1460" w:type="dxa"/>
+          </w:tcPr>
+          <w:p>
+            <w:pPr>
+              <w:spacing w:before="20" w:after="20" w:line="240" w:lineRule="auto"/>
+            </w:pPr>
+            <w:r>
+              <w:rPr>
+                <w:rFonts w:ascii="Old Standard TT" w:cs="Old Standard TT" w:eastAsia="Old Standard TT" w:hAnsi="Old Standard TT"/>
+                <w:sz w:val="17"/>
+                <w:szCs w:val="17"/>
+              </w:rPr>
+              <w:t xml:space="preserve">0.55 / 0.42</w:t>
+            </w:r>
+          </w:p>
+        </w:tc>
+        <w:tc>
+          <w:tcPr>
+            <w:tcW w:w="1460" w:type="dxa"/>
+          </w:tcPr>
+          <w:p>
+            <w:pPr>
+              <w:spacing w:before="20" w:after="20" w:line="240" w:lineRule="auto"/>
+            </w:pPr>
+            <w:r>
+              <w:rPr>
+                <w:rFonts w:ascii="Old Standard TT" w:cs="Old Standard TT" w:eastAsia="Old Standard TT" w:hAnsi="Old Standard TT"/>
+                <w:sz w:val="17"/>
+                <w:szCs w:val="17"/>
+              </w:rPr>
+              <w:t xml:space="preserve">0.54 / 0.90</w:t>
+            </w:r>
+          </w:p>
+        </w:tc>
+        <w:tc>
+          <w:tcPr>
+            <w:tcW w:w="1460" w:type="dxa"/>
+          </w:tcPr>
+          <w:p>
+            <w:pPr>
+              <w:spacing w:before="20" w:after="20" w:line="240" w:lineRule="auto"/>
+            </w:pPr>
+            <w:r>
+              <w:rPr>
+                <w:rFonts w:ascii="Old Standard TT" w:cs="Old Standard TT" w:eastAsia="Old Standard TT" w:hAnsi="Old Standard TT"/>
+                <w:sz w:val="17"/>
+                <w:szCs w:val="17"/>
+              </w:rPr>
+              <w:t xml:space="preserve">0.53 / 0.42</w:t>
+            </w:r>
+          </w:p>
+        </w:tc>
+        <w:tc>
+          <w:tcPr>
+            <w:tcW w:w="1460" w:type="dxa"/>
+          </w:tcPr>
+          <w:p>
+            <w:pPr>
+              <w:spacing w:before="20" w:after="20" w:line="240" w:lineRule="auto"/>
+            </w:pPr>
+            <w:r>
+              <w:rPr>
+                <w:rFonts w:ascii="Old Standard TT" w:cs="Old Standard TT" w:eastAsia="Old Standard TT" w:hAnsi="Old Standard TT"/>
+                <w:sz w:val="17"/>
+                <w:szCs w:val="17"/>
+              </w:rPr>
+              <w:t xml:space="preserve">0.49 / 0.90</w:t>
+            </w:r>
+          </w:p>
+        </w:tc>
+        <w:tc>
+          <w:tcPr>
+            <w:tcW w:w="1460" w:type="dxa"/>
+          </w:tcPr>
+          <w:p>
+            <w:pPr>
+              <w:spacing w:before="20" w:after="20" w:line="240" w:lineRule="auto"/>
+            </w:pPr>
+            <w:r>
+              <w:rPr>
+                <w:rFonts w:ascii="Old Standard TT" w:cs="Old Standard TT" w:eastAsia="Old Standard TT" w:hAnsi="Old Standard TT"/>
+                <w:sz w:val="17"/>
+                <w:szCs w:val="17"/>
+              </w:rPr>
+              <w:t xml:space="preserve">0.69 / 0.23</w:t>
+            </w:r>
+          </w:p>
+        </w:tc>
+      </w:tr>
+      <w:tr>
+        <w:trPr>
+          <w:cantSplit/>
+        </w:trPr>
+        <w:tc>
+          <w:tcPr>
+            <w:tcW w:w="2060" w:type="dxa"/>
+          </w:tcPr>
+          <w:p>
+            <w:pPr>
+              <w:spacing w:before="20" w:after="20" w:line="240" w:lineRule="auto"/>
+            </w:pPr>
+            <w:r>
+              <w:rPr>
+                <w:rFonts w:ascii="Old Standard TT" w:cs="Old Standard TT" w:eastAsia="Old Standard TT" w:hAnsi="Old Standard TT"/>
+                <w:sz w:val="17"/>
+                <w:szCs w:val="17"/>
+              </w:rPr>
+              <w:t xml:space="preserve">Said vs did table</w:t>
+            </w:r>
+          </w:p>
+        </w:tc>
+        <w:tc>
+          <w:tcPr>
+            <w:tcW w:w="1460" w:type="dxa"/>
+          </w:tcPr>
+          <w:p>
+            <w:pPr>
+              <w:spacing w:before="20" w:after="20" w:line="240" w:lineRule="auto"/>
+            </w:pPr>
+            <w:r>
+              <w:rPr>
+                <w:rFonts w:ascii="Old Standard TT" w:cs="Old Standard TT" w:eastAsia="Old Standard TT" w:hAnsi="Old Standard TT"/>
+                <w:sz w:val="17"/>
+                <w:szCs w:val="17"/>
+              </w:rPr>
+              <w:t xml:space="preserve">0.49 / 0.03</w:t>
+            </w:r>
+          </w:p>
+        </w:tc>
+        <w:tc>
+          <w:tcPr>
+            <w:tcW w:w="1460" w:type="dxa"/>
+          </w:tcPr>
+          <w:p>
+            <w:pPr>
+              <w:spacing w:before="20" w:after="20" w:line="240" w:lineRule="auto"/>
+            </w:pPr>
+            <w:r>
+              <w:rPr>
+                <w:rFonts w:ascii="Old Standard TT" w:cs="Old Standard TT" w:eastAsia="Old Standard TT" w:hAnsi="Old Standard TT"/>
+                <w:sz w:val="17"/>
+                <w:szCs w:val="17"/>
+              </w:rPr>
+              <w:t xml:space="preserve">0.50 / 0.97</w:t>
+            </w:r>
+          </w:p>
+        </w:tc>
+        <w:tc>
+          <w:tcPr>
+            <w:tcW w:w="1460" w:type="dxa"/>
+          </w:tcPr>
+          <w:p>
+            <w:pPr>
+              <w:spacing w:before="20" w:after="20" w:line="240" w:lineRule="auto"/>
+            </w:pPr>
+            <w:r>
+              <w:rPr>
+                <w:rFonts w:ascii="Old Standard TT" w:cs="Old Standard TT" w:eastAsia="Old Standard TT" w:hAnsi="Old Standard TT"/>
+                <w:sz w:val="17"/>
+                <w:szCs w:val="17"/>
+              </w:rPr>
+              <w:t xml:space="preserve">0.49 / 0.03</w:t>
+            </w:r>
+          </w:p>
+        </w:tc>
+        <w:tc>
+          <w:tcPr>
+            <w:tcW w:w="1460" w:type="dxa"/>
+          </w:tcPr>
+          <w:p>
+            <w:pPr>
+              <w:spacing w:before="20" w:after="20" w:line="240" w:lineRule="auto"/>
+            </w:pPr>
+            <w:r>
+              <w:rPr>
+                <w:rFonts w:ascii="Old Standard TT" w:cs="Old Standard TT" w:eastAsia="Old Standard TT" w:hAnsi="Old Standard TT"/>
+                <w:sz w:val="17"/>
+                <w:szCs w:val="17"/>
+              </w:rPr>
+              <w:t xml:space="preserve">0.47 / 0.97</w:t>
+            </w:r>
+          </w:p>
+        </w:tc>
+        <w:tc>
+          <w:tcPr>
+            <w:tcW w:w="1460" w:type="dxa"/>
+          </w:tcPr>
+          <w:p>
+            <w:pPr>
+              <w:spacing w:before="20" w:after="20" w:line="240" w:lineRule="auto"/>
+            </w:pPr>
+            <w:r>
+              <w:rPr>
+                <w:rFonts w:ascii="Old Standard TT" w:cs="Old Standard TT" w:eastAsia="Old Standard TT" w:hAnsi="Old Standard TT"/>
+                <w:sz w:val="17"/>
+                <w:szCs w:val="17"/>
+              </w:rPr>
+              <w:t xml:space="preserve">—</w:t>
+            </w:r>
+          </w:p>
+        </w:tc>
+      </w:tr>
+      <w:tr>
+        <w:trPr>
+          <w:cantSplit/>
+        </w:trPr>
+        <w:tc>
+          <w:tcPr>
+            <w:tcW w:w="2060" w:type="dxa"/>
+          </w:tcPr>
+          <w:p>
+            <w:pPr>
+              <w:spacing w:before="20" w:after="20" w:line="240" w:lineRule="auto"/>
+            </w:pPr>
+            <w:r>
+              <w:rPr>
+                <w:rFonts w:ascii="Old Standard TT" w:cs="Old Standard TT" w:eastAsia="Old Standard TT" w:hAnsi="Old Standard TT"/>
+                <w:i w:val="1"/>
+                <w:iCs w:val="1"/>
+                <w:sz w:val="17"/>
+                <w:szCs w:val="17"/>
+              </w:rPr>
+              <w:t xml:space="preserve">+ Private plans (upper bound)</w:t>
+            </w:r>
+          </w:p>
+        </w:tc>
+        <w:tc>
+          <w:tcPr>
+            <w:tcW w:w="1460" w:type="dxa"/>
+          </w:tcPr>
+          <w:p>
+            <w:pPr>
+              <w:spacing w:before="20" w:after="20" w:line="240" w:lineRule="auto"/>
+            </w:pPr>
+            <w:r>
+              <w:rPr>
+                <w:rFonts w:ascii="Old Standard TT" w:cs="Old Standard TT" w:eastAsia="Old Standard TT" w:hAnsi="Old Standard TT"/>
+                <w:i w:val="1"/>
+                <w:iCs w:val="1"/>
+                <w:sz w:val="17"/>
+                <w:szCs w:val="17"/>
+              </w:rPr>
+              <w:t xml:space="preserve">0.89 / 0.23</w:t>
+            </w:r>
+          </w:p>
+        </w:tc>
+        <w:tc>
+          <w:tcPr>
+            <w:tcW w:w="1460" w:type="dxa"/>
+          </w:tcPr>
+          <w:p>
+            <w:pPr>
+              <w:spacing w:before="20" w:after="20" w:line="240" w:lineRule="auto"/>
+            </w:pPr>
+            <w:r>
+              <w:rPr>
+                <w:rFonts w:ascii="Old Standard TT" w:cs="Old Standard TT" w:eastAsia="Old Standard TT" w:hAnsi="Old Standard TT"/>
+                <w:i w:val="1"/>
+                <w:iCs w:val="1"/>
+                <w:sz w:val="17"/>
+                <w:szCs w:val="17"/>
+              </w:rPr>
+              <w:t xml:space="preserve">0.56 / 0.88</w:t>
+            </w:r>
+          </w:p>
+        </w:tc>
+        <w:tc>
+          <w:tcPr>
+            <w:tcW w:w="1460" w:type="dxa"/>
+          </w:tcPr>
+          <w:p>
+            <w:pPr>
+              <w:spacing w:before="20" w:after="20" w:line="240" w:lineRule="auto"/>
+            </w:pPr>
+            <w:r>
+              <w:rPr>
+                <w:rFonts w:ascii="Old Standard TT" w:cs="Old Standard TT" w:eastAsia="Old Standard TT" w:hAnsi="Old Standard TT"/>
+                <w:i w:val="1"/>
+                <w:iCs w:val="1"/>
+                <w:sz w:val="17"/>
+                <w:szCs w:val="17"/>
+              </w:rPr>
+              <w:t xml:space="preserve">0.89 / 0.23</w:t>
+            </w:r>
+          </w:p>
+        </w:tc>
+        <w:tc>
+          <w:tcPr>
+            <w:tcW w:w="1460" w:type="dxa"/>
+          </w:tcPr>
+          <w:p>
+            <w:pPr>
+              <w:spacing w:before="20" w:after="20" w:line="240" w:lineRule="auto"/>
+            </w:pPr>
+            <w:r>
+              <w:rPr>
+                <w:rFonts w:ascii="Old Standard TT" w:cs="Old Standard TT" w:eastAsia="Old Standard TT" w:hAnsi="Old Standard TT"/>
+                <w:i w:val="1"/>
+                <w:iCs w:val="1"/>
+                <w:sz w:val="17"/>
+                <w:szCs w:val="17"/>
+              </w:rPr>
+              <w:t xml:space="preserve">0.56 / 0.88</w:t>
+            </w:r>
+          </w:p>
+        </w:tc>
+        <w:tc>
+          <w:tcPr>
+            <w:tcW w:w="1460" w:type="dxa"/>
+          </w:tcPr>
+          <w:p>
+            <w:pPr>
+              <w:spacing w:before="20" w:after="20" w:line="240" w:lineRule="auto"/>
+            </w:pPr>
+            <w:r>
+              <w:rPr>
+                <w:rFonts w:ascii="Old Standard TT" w:cs="Old Standard TT" w:eastAsia="Old Standard TT" w:hAnsi="Old Standard TT"/>
+                <w:sz w:val="17"/>
+                <w:szCs w:val="17"/>
+              </w:rPr>
+              <w:t xml:space="preserve">—</w:t>
+            </w:r>
+          </w:p>
+        </w:tc>
+      </w:tr>
+    </w:tbl>
+    <w:p>
+      <w:pPr>
+        <w:spacing w:before="0" w:after="0"/>
+        <w:jc w:val="both"/>
+      </w:pPr>
+    </w:p>
+    <w:p>
+      <w:pPr>
+        <w:keepNext/>
+        <w:spacing w:before="120" w:after="60"/>
+        <w:jc w:val="left"/>
+      </w:pPr>
+      <w:r>
+        <w:rPr>
+          <w:rFonts w:ascii="Old Standard TT" w:cs="Old Standard TT" w:eastAsia="Old Standard TT" w:hAnsi="Old Standard TT"/>
+          <w:i w:val="1"/>
+          <w:iCs w:val="1"/>
+          <w:sz w:val="18"/>
+          <w:szCs w:val="18"/>
+        </w:rPr>
+        <w:t xml:space="preserve">Table E2. Rules: accuracy / FPR.</w:t>
+      </w:r>
+    </w:p>
+    <w:tbl>
+      <w:tblPr>
+        <w:tblW w:w="9360" w:type="dxa"/>
+        <w:jc w:val="center"/>
+        <w:tblBorders>
+          <w:top w:val="single" w:sz="4" w:space="0" w:color="000000"/>
+          <w:left w:val="single" w:sz="4" w:space="0" w:color="000000"/>
+          <w:bottom w:val="single" w:sz="4" w:space="0" w:color="000000"/>
+          <w:right w:val="single" w:sz="4" w:space="0" w:color="000000"/>
+          <w:insideH w:val="single" w:sz="4" w:space="0" w:color="000000"/>
+          <w:insideV w:val="single" w:sz="4" w:space="0" w:color="000000"/>
+        </w:tblBorders>
+        <w:tblLayout w:type="fixed"/>
+        <w:tblCellMar>
+          <w:left w:w="70" w:type="dxa"/>
+          <w:right w:w="70" w:type="dxa"/>
+        </w:tblCellMar>
+      </w:tblPr>
+      <w:tblGrid>
+        <w:gridCol w:w="4360"/>
+        <w:gridCol w:w="2500"/>
+        <w:gridCol w:w="2500"/>
+      </w:tblGrid>
+      <w:tr>
+        <w:trPr>
+          <w:cantSplit/>
+          <w:tblHeader/>
+        </w:trPr>
+        <w:tc>
+          <w:tcPr>
+            <w:tcW w:w="4360" w:type="dxa"/>
+            <w:shd w:val="clear" w:color="auto" w:fill="E7E6E6"/>
+          </w:tcPr>
+          <w:p>
+            <w:pPr>
+              <w:keepNext/>
+              <w:spacing w:before="20" w:after="20" w:line="240" w:lineRule="auto"/>
+            </w:pPr>
+            <w:r>
+              <w:rPr>
+                <w:rFonts w:ascii="Old Standard TT" w:cs="Old Standard TT" w:eastAsia="Old Standard TT" w:hAnsi="Old Standard TT"/>
+                <w:b w:val="1"/>
+                <w:bCs w:val="1"/>
+                <w:sz w:val="17"/>
+                <w:szCs w:val="17"/>
+              </w:rPr>
+              <w:t xml:space="preserve">Rule (view)</w:t>
+            </w:r>
+          </w:p>
+        </w:tc>
+        <w:tc>
+          <w:tcPr>
+            <w:tcW w:w="2500" w:type="dxa"/>
+            <w:shd w:val="clear" w:color="auto" w:fill="E7E6E6"/>
+          </w:tcPr>
+          <w:p>
+            <w:pPr>
+              <w:keepNext/>
+              <w:spacing w:before="20" w:after="20" w:line="240" w:lineRule="auto"/>
+            </w:pPr>
+            <w:r>
+              <w:rPr>
+                <w:rFonts w:ascii="Old Standard TT" w:cs="Old Standard TT" w:eastAsia="Old Standard TT" w:hAnsi="Old Standard TT"/>
+                <w:b w:val="1"/>
+                <w:bCs w:val="1"/>
+                <w:sz w:val="17"/>
+                <w:szCs w:val="17"/>
+              </w:rPr>
+              <w:t xml:space="preserve">Naive</w:t>
+            </w:r>
+          </w:p>
+        </w:tc>
+        <w:tc>
+          <w:tcPr>
+            <w:tcW w:w="2500" w:type="dxa"/>
+            <w:shd w:val="clear" w:color="auto" w:fill="E7E6E6"/>
+          </w:tcPr>
+          <w:p>
+            <w:pPr>
+              <w:keepNext/>
+              <w:spacing w:before="20" w:after="20" w:line="240" w:lineRule="auto"/>
+            </w:pPr>
+            <w:r>
+              <w:rPr>
+                <w:rFonts w:ascii="Old Standard TT" w:cs="Old Standard TT" w:eastAsia="Old Standard TT" w:hAnsi="Old Standard TT"/>
+                <w:b w:val="1"/>
+                <w:bCs w:val="1"/>
+                <w:sz w:val="17"/>
+                <w:szCs w:val="17"/>
+              </w:rPr>
+              <w:t xml:space="preserve">Competent</w:t>
+            </w:r>
+          </w:p>
+        </w:tc>
+      </w:tr>
+      <w:tr>
+        <w:trPr>
+          <w:cantSplit/>
+        </w:trPr>
+        <w:tc>
+          <w:tcPr>
+            <w:tcW w:w="4360" w:type="dxa"/>
+          </w:tcPr>
+          <w:p>
+            <w:pPr>
+              <w:spacing w:before="20" w:after="20" w:line="240" w:lineRule="auto"/>
+            </w:pPr>
+            <w:r>
+              <w:rPr>
+                <w:rFonts w:ascii="Old Standard TT" w:cs="Old Standard TT" w:eastAsia="Old Standard TT" w:hAnsi="Old Standard TT"/>
+                <w:sz w:val="17"/>
+                <w:szCs w:val="17"/>
+              </w:rPr>
+              <w:t xml:space="preserve">Against-stake (actions)</w:t>
+            </w:r>
+          </w:p>
+        </w:tc>
+        <w:tc>
+          <w:tcPr>
+            <w:tcW w:w="2500" w:type="dxa"/>
+          </w:tcPr>
+          <w:p>
+            <w:pPr>
+              <w:spacing w:before="20" w:after="20" w:line="240" w:lineRule="auto"/>
+            </w:pPr>
+            <w:r>
+              <w:rPr>
+                <w:rFonts w:ascii="Old Standard TT" w:cs="Old Standard TT" w:eastAsia="Old Standard TT" w:hAnsi="Old Standard TT"/>
+                <w:sz w:val="17"/>
+                <w:szCs w:val="17"/>
+              </w:rPr>
+              <w:t xml:space="preserve">0.65 / 0.05</w:t>
+            </w:r>
+          </w:p>
+        </w:tc>
+        <w:tc>
+          <w:tcPr>
+            <w:tcW w:w="2500" w:type="dxa"/>
+          </w:tcPr>
+          <w:p>
+            <w:pPr>
+              <w:spacing w:before="20" w:after="20" w:line="240" w:lineRule="auto"/>
+            </w:pPr>
+            <w:r>
+              <w:rPr>
+                <w:rFonts w:ascii="Old Standard TT" w:cs="Old Standard TT" w:eastAsia="Old Standard TT" w:hAnsi="Old Standard TT"/>
+                <w:sz w:val="17"/>
+                <w:szCs w:val="17"/>
+              </w:rPr>
+              <w:t xml:space="preserve">0.85 / 0.05</w:t>
+            </w:r>
+          </w:p>
+        </w:tc>
+      </w:tr>
+      <w:tr>
+        <w:trPr>
+          <w:cantSplit/>
+        </w:trPr>
+        <w:tc>
+          <w:tcPr>
+            <w:tcW w:w="4360" w:type="dxa"/>
+          </w:tcPr>
+          <w:p>
+            <w:pPr>
+              <w:spacing w:before="20" w:after="20" w:line="240" w:lineRule="auto"/>
+            </w:pPr>
+            <w:r>
+              <w:rPr>
+                <w:rFonts w:ascii="Old Standard TT" w:cs="Old Standard TT" w:eastAsia="Old Standard TT" w:hAnsi="Old Standard TT"/>
+                <w:sz w:val="17"/>
+                <w:szCs w:val="17"/>
+              </w:rPr>
+              <w:t xml:space="preserve">Co-vote (actions)</w:t>
+            </w:r>
+          </w:p>
+        </w:tc>
+        <w:tc>
+          <w:tcPr>
+            <w:tcW w:w="2500" w:type="dxa"/>
+          </w:tcPr>
+          <w:p>
+            <w:pPr>
+              <w:spacing w:before="20" w:after="20" w:line="240" w:lineRule="auto"/>
+            </w:pPr>
+            <w:r>
+              <w:rPr>
+                <w:rFonts w:ascii="Old Standard TT" w:cs="Old Standard TT" w:eastAsia="Old Standard TT" w:hAnsi="Old Standard TT"/>
+                <w:sz w:val="17"/>
+                <w:szCs w:val="17"/>
+              </w:rPr>
+              <w:t xml:space="preserve">0.54 / 0.23</w:t>
+            </w:r>
+          </w:p>
+        </w:tc>
+        <w:tc>
+          <w:tcPr>
+            <w:tcW w:w="2500" w:type="dxa"/>
+          </w:tcPr>
+          <w:p>
+            <w:pPr>
+              <w:spacing w:before="20" w:after="20" w:line="240" w:lineRule="auto"/>
+            </w:pPr>
+            <w:r>
+              <w:rPr>
+                <w:rFonts w:ascii="Old Standard TT" w:cs="Old Standard TT" w:eastAsia="Old Standard TT" w:hAnsi="Old Standard TT"/>
+                <w:sz w:val="17"/>
+                <w:szCs w:val="17"/>
+              </w:rPr>
+              <w:t xml:space="preserve">0.74 / 0.23</w:t>
+            </w:r>
+          </w:p>
+        </w:tc>
+      </w:tr>
+      <w:tr>
+        <w:trPr>
+          <w:cantSplit/>
+        </w:trPr>
+        <w:tc>
+          <w:tcPr>
+            <w:tcW w:w="4360" w:type="dxa"/>
+          </w:tcPr>
+          <w:p>
+            <w:pPr>
+              <w:spacing w:before="20" w:after="20" w:line="240" w:lineRule="auto"/>
+            </w:pPr>
+            <w:r>
+              <w:rPr>
+                <w:rFonts w:ascii="Old Standard TT" w:cs="Old Standard TT" w:eastAsia="Old Standard TT" w:hAnsi="Old Standard TT"/>
+                <w:sz w:val="17"/>
+                <w:szCs w:val="17"/>
+              </w:rPr>
+              <w:t xml:space="preserve">Said-vs-did (table)</w:t>
+            </w:r>
+          </w:p>
+        </w:tc>
+        <w:tc>
+          <w:tcPr>
+            <w:tcW w:w="2500" w:type="dxa"/>
+          </w:tcPr>
+          <w:p>
+            <w:pPr>
+              <w:spacing w:before="20" w:after="20" w:line="240" w:lineRule="auto"/>
+            </w:pPr>
+            <w:r>
+              <w:rPr>
+                <w:rFonts w:ascii="Old Standard TT" w:cs="Old Standard TT" w:eastAsia="Old Standard TT" w:hAnsi="Old Standard TT"/>
+                <w:sz w:val="17"/>
+                <w:szCs w:val="17"/>
+              </w:rPr>
+              <w:t xml:space="preserve">0.53 / 0.85</w:t>
+            </w:r>
+          </w:p>
+        </w:tc>
+        <w:tc>
+          <w:tcPr>
+            <w:tcW w:w="2500" w:type="dxa"/>
+          </w:tcPr>
+          <w:p>
+            <w:pPr>
+              <w:spacing w:before="20" w:after="20" w:line="240" w:lineRule="auto"/>
+            </w:pPr>
+            <w:r>
+              <w:rPr>
+                <w:rFonts w:ascii="Old Standard TT" w:cs="Old Standard TT" w:eastAsia="Old Standard TT" w:hAnsi="Old Standard TT"/>
+                <w:sz w:val="17"/>
+                <w:szCs w:val="17"/>
+              </w:rPr>
+              <w:t xml:space="preserve">0.55 / 0.85</w:t>
+            </w:r>
+          </w:p>
+        </w:tc>
+      </w:tr>
+      <w:tr>
+        <w:trPr>
+          <w:cantSplit/>
+        </w:trPr>
+        <w:tc>
+          <w:tcPr>
+            <w:tcW w:w="4360" w:type="dxa"/>
+          </w:tcPr>
+          <w:p>
+            <w:pPr>
+              <w:spacing w:before="20" w:after="20" w:line="240" w:lineRule="auto"/>
+            </w:pPr>
+            <w:r>
+              <w:rPr>
+                <w:rFonts w:ascii="Old Standard TT" w:cs="Old Standard TT" w:eastAsia="Old Standard TT" w:hAnsi="Old Standard TT"/>
+                <w:sz w:val="17"/>
+                <w:szCs w:val="17"/>
+              </w:rPr>
+              <w:t xml:space="preserve">Combined (both)</w:t>
+            </w:r>
+          </w:p>
+        </w:tc>
+        <w:tc>
+          <w:tcPr>
+            <w:tcW w:w="2500" w:type="dxa"/>
+          </w:tcPr>
+          <w:p>
+            <w:pPr>
+              <w:spacing w:before="20" w:after="20" w:line="240" w:lineRule="auto"/>
+            </w:pPr>
+            <w:r>
+              <w:rPr>
+                <w:rFonts w:ascii="Old Standard TT" w:cs="Old Standard TT" w:eastAsia="Old Standard TT" w:hAnsi="Old Standard TT"/>
+                <w:sz w:val="17"/>
+                <w:szCs w:val="17"/>
+              </w:rPr>
+              <w:t xml:space="preserve">0.53 / 0.85</w:t>
+            </w:r>
+          </w:p>
+        </w:tc>
+        <w:tc>
+          <w:tcPr>
+            <w:tcW w:w="2500" w:type="dxa"/>
+          </w:tcPr>
+          <w:p>
+            <w:pPr>
+              <w:spacing w:before="20" w:after="20" w:line="240" w:lineRule="auto"/>
+            </w:pPr>
+            <w:r>
+              <w:rPr>
+                <w:rFonts w:ascii="Old Standard TT" w:cs="Old Standard TT" w:eastAsia="Old Standard TT" w:hAnsi="Old Standard TT"/>
+                <w:sz w:val="17"/>
+                <w:szCs w:val="17"/>
+              </w:rPr>
+              <w:t xml:space="preserve">0.57 / 0.85</w:t>
+            </w:r>
+          </w:p>
+        </w:tc>
+      </w:tr>
+    </w:tbl>
+    <w:p>
+      <w:pPr>
+        <w:spacing w:before="0" w:after="0"/>
+        <w:jc w:val="both"/>
+      </w:pPr>
+    </w:p>
+    <w:p>
+      <w:pPr>
         <w:pStyle w:val="Heading2"/>
         <w:spacing w:after="0" w:before="200" w:line="360" w:lineRule="auto"/>
         <w:rPr>
@@ -5138,7 +6977,7 @@
         <w:rPr>
           <w:rFonts w:ascii="Old Standard TT" w:cs="Old Standard TT" w:eastAsia="Old Standard TT" w:hAnsi="Old Standard TT"/>
         </w:rPr>
-        <w:t xml:space="preserve"> We used Claude (Anthropic), through Claude Code, throughout this project: to implement the private channel, the Committee Vote Game, the monitor pipeline and the analysis scripts; to run the experiments; to diagnose problems in the data; and to draft this report. All results were produced by code in the repository and checked against the logged outputs. </w:t>
+        <w:t xml:space="preserve"> We used Claude (Anthropic), through Claude Code, throughout this project: to implement the private channel, the Committee Vote Game, the monitor pipeline and the analysis scripts; to run the experiments; to diagnose problems in the data; to draft this report; and, as a separate Claude instance that had not seen the drafting, to review the paper and code before submission. All results were produced by code in the repository and checked against the logged outputs. </w:t>
       </w:r>
       <w:r>
         <w:rPr>

</xml_diff>

<commit_message>
Reframe paper around the boundary result for 2.2; talk counterfactual script, test and Appendix F; still within 8 pages
Co-Authored-By: Claude Opus 5.5 <noreply@anthropic.com>
Claude-Session: https://claude.ai/code/session_01T8kiQrxhXBJ3k5fbziRDqr
</commit_message>
<xml_diff>
--- a/docs/submission/report_submission.docx
+++ b/docs/submission/report_submission.docx
@@ -438,7 +438,7 @@
                       <w:sz w:val="20"/>
                       <w:szCs w:val="20"/>
                     </w:rPr>
-                    <w:t xml:space="preserve">Monitors for multi-agent systems typically read either what agents say or what they do. We test whether combining the two helps a monitor detect collusion. Seven Llama 3.3 70B agents play a repeated committee-vote game with private stakes, where honest play implies honest talk and a secret colluding pair profits by vote trading, which forces one member to vote against its own stake. Across 160 matched games we compare no collusion, a private channel without instructions, naive colluders told to maximize their joint payoff, and competent colluders also given a vote-trading tip. Competent colluders traded at every opportunity (64 of 64), each gaining 0.43 points per round, and also traded where it gained nothing. Two LLM monitors with a prompt frozen in advance (Llama 3.3 70B and DeepSeek V3.1) saw public messages, actions, both, a said-versus-did table, and an upper-bound view adding private plans. On each of the four observable views both were indistinguishable from chance (AUROC 0.44 to 0.60), and combining messages with actions gave no measurable gain. A one-line rule on actions alone, flagging votes against one's revealed payoff, detected competent colluders with AUROC 0.86 at a 5% false-positive rate (0.78 had they not over-traded; 0.91 on held-out games), while the monitors succeeded only with private plans (0.94 to 0.98). With its thinking mode on, DeepSeek rose to 0.69 on actions, still below the rule, and adding messages still did not help. The evidence is in the votes, and these LLM monitors extract little of it.</w:t>
+                    <w:t xml:space="preserve">Monitors for multi-agent systems typically read either what agents say or what they do. We test whether combining the two helps a monitor detect collusion. Seven Llama 3.3 70B agents play a committee-vote game with private stakes, in which a secret colluding pair profits by vote trading: one member votes against its own small stake to secure its partner's large one. Across 160 matched games we compare no collusion, a private channel without instructions, naive colluders told to maximize their joint payoff, and competent colluders also given a vote-trading tip. Competent colluders traded at every opportunity (64 of 64), each gaining 0.43 points per round, and also traded where it gained nothing. Two LLM monitors with a prompt frozen in advance (Llama 3.3 70B and DeepSeek V3.1) saw public messages, actions, both, a said-versus-did table, and an upper-bound view adding private plans. On each of the four observable views both were indistinguishable from chance (AUROC 0.44 to 0.60), while a one-line rule on actions, flagging votes against one's revealed payoff, reached 0.86 at a 5% false-positive rate (0.78 had colluders not over-traded). The monitors succeeded only with private plans (0.94 to 0.98); with thinking on, DeepSeek rose to 0.69. Adding messages never helped monitors or rules: the collusion needed no public lie, and even talk revealing every true stake would add at most 0.10. We expect combining to help only where collusion forces public deception; here the evidence is in the votes, and LLM monitors extract little of it.</w:t>
                   </w:r>
                 </w:p>
               </w:tc>
@@ -535,7 +535,7 @@
         <w:rPr>
           <w:rFonts w:ascii="Old Standard TT" w:cs="Old Standard TT" w:eastAsia="Old Standard TT" w:hAnsi="Old Standard TT"/>
         </w:rPr>
-        <w:t xml:space="preserve">We test it in a setting built so that the answer could be yes. In our Committee Vote Game, honest play makes truthful announcements and stake-following votes the natural baseline, while a colluding pair profits by </w:t>
+        <w:t xml:space="preserve">We test it in a Committee Vote Game in which a colluding pair profits by </w:t>
       </w:r>
       <w:r>
         <w:rPr>
@@ -549,7 +549,7 @@
         <w:rPr>
           <w:rFonts w:ascii="Old Standard TT" w:cs="Old Standard TT" w:eastAsia="Old Standard TT" w:hAnsi="Old Standard TT"/>
         </w:rPr>
-        <w:t xml:space="preserve">: one member votes against its own small stake to secure its partner's large one. We generate matched games with and without colluders, give two LLM monitors five views of each game (one also with its thinking mode on), and compare them with simple non-LLM rules.</w:t>
+        <w:t xml:space="preserve">: one member votes against its own small stake to secure its partner's large one. Honest play makes truthful announcements and stake-following votes the natural baseline, but announcements are cheap talk, so colluders may misstate their intentions yet never need to. The game thus tests the question for collusion that leaves its trace in actions and requires no public lie, and asks first whether LLM monitors can find that trace. We give two LLM monitors five views of matched games with and without colluders (one monitor also with thinking on) and compare them with simple non-LLM rules.</w:t>
       </w:r>
     </w:p>
     <w:p>
@@ -582,13 +582,13 @@
           <w:b w:val="1"/>
           <w:bCs w:val="1"/>
         </w:rPr>
-        <w:t xml:space="preserve">A collusion test bed where the signal lives in talk and actions:</w:t>
-      </w:r>
-      <w:r>
-        <w:rPr>
-          <w:rFonts w:ascii="Old Standard TT" w:cs="Old Standard TT" w:eastAsia="Old Standard TT" w:hAnsi="Old Standard TT"/>
-        </w:rPr>
-        <w:t xml:space="preserve"> a seven-agent committee-vote game with private stakes, matched across conditions, with automated checks that private information never leaks.</w:t>
+        <w:t xml:space="preserve">A matched collusion test bed:</w:t>
+      </w:r>
+      <w:r>
+        <w:rPr>
+          <w:rFonts w:ascii="Old Standard TT" w:cs="Old Standard TT" w:eastAsia="Old Standard TT" w:hAnsi="Old Standard TT"/>
+        </w:rPr>
+        <w:t xml:space="preserve"> a seven-agent committee-vote game with private stakes in which collusion pays and leaves its trace in the votes, with automated checks that private information never leaks.</w:t>
       </w:r>
     </w:p>
     <w:p>
@@ -607,13 +607,13 @@
           <w:b w:val="1"/>
           <w:bCs w:val="1"/>
         </w:rPr>
-        <w:t xml:space="preserve">Naive versus competent colluders, with a manipulation check.</w:t>
-      </w:r>
-      <w:r>
-        <w:rPr>
-          <w:rFonts w:ascii="Old Standard TT" w:cs="Old Standard TT" w:eastAsia="Old Standard TT" w:hAnsi="Old Standard TT"/>
-        </w:rPr>
-        <w:t xml:space="preserve"> Told only to maximize their joint payoff, pairs trade votes in 31% of opportunities; with a short strategy tip, in 100%, though they also over-apply it. Labelling games by the instruction given risks testing monitors on collusion that never happened, or that is clumsier than intended.</w:t>
+        <w:t xml:space="preserve">A manipulation check.</w:t>
+      </w:r>
+      <w:r>
+        <w:rPr>
+          <w:rFonts w:ascii="Old Standard TT" w:cs="Old Standard TT" w:eastAsia="Old Standard TT" w:hAnsi="Old Standard TT"/>
+        </w:rPr>
+        <w:t xml:space="preserve"> Told only to maximize their joint payoff, pairs trade votes in 31% of opportunities; with a short strategy tip, in 100%, though they also over-apply it. Labelling games by instruction risks testing monitors on collusion that never happened.</w:t>
       </w:r>
     </w:p>
     <w:p>
@@ -632,13 +632,13 @@
           <w:b w:val="1"/>
           <w:bCs w:val="1"/>
         </w:rPr>
-        <w:t xml:space="preserve">A clear negative result for LLM monitors, replicated on held-out games.</w:t>
-      </w:r>
-      <w:r>
-        <w:rPr>
-          <w:rFonts w:ascii="Old Standard TT" w:cs="Old Standard TT" w:eastAsia="Old Standard TT" w:hAnsi="Old Standard TT"/>
-        </w:rPr>
-        <w:t xml:space="preserve"> Two short-verdict monitors are indistinguishable from chance on each of the four observable views, and a thinking-mode monitor reaches only 0.69, while a one-line rule on the actions reaches 0.86 (0.78 had the colluders not over-traded). With private plans the monitors reach 0.94–0.98 (positive control).</w:t>
+        <w:t xml:space="preserve">A negative result for LLM monitors, replicated on held-out games.</w:t>
+      </w:r>
+      <w:r>
+        <w:rPr>
+          <w:rFonts w:ascii="Old Standard TT" w:cs="Old Standard TT" w:eastAsia="Old Standard TT" w:hAnsi="Old Standard TT"/>
+        </w:rPr>
+        <w:t xml:space="preserve"> Short-verdict monitors are indistinguishable from chance on each observable view and a thinking-mode monitor reaches 0.69, while a one-line rule on the actions reaches 0.86 (0.78 without over-trading). With private plans the monitors reach 0.94–0.98.</w:t>
       </w:r>
     </w:p>
     <w:p>
@@ -657,13 +657,13 @@
           <w:b w:val="1"/>
           <w:bCs w:val="1"/>
         </w:rPr>
-        <w:t xml:space="preserve">An answer to question 2.2 and a partly supported diagnosis.</w:t>
-      </w:r>
-      <w:r>
-        <w:rPr>
-          <w:rFonts w:ascii="Old Standard TT" w:cs="Old Standard TT" w:eastAsia="Old Standard TT" w:hAnsi="Old Standard TT"/>
-        </w:rPr>
-        <w:t xml:space="preserve"> Neither monitors nor rules gain from adding messages to actions. Monitors under-weight the inconsistent votes that trades leave behind, and neither a stated base rate (a pre-specified test that failed) nor thinking closes the gap to the rule.</w:t>
+        <w:t xml:space="preserve">A boundary result for question 2.2.</w:t>
+      </w:r>
+      <w:r>
+        <w:rPr>
+          <w:rFonts w:ascii="Old Standard TT" w:cs="Old Standard TT" w:eastAsia="Old Standard TT" w:hAnsi="Old Standard TT"/>
+        </w:rPr>
+        <w:t xml:space="preserve"> Adding messages helps neither monitors nor rules, because this collusion needs no public lie; even talk revealing every true stake would add at most +0.10 AUROC.</w:t>
       </w:r>
     </w:p>
     <w:p>
@@ -2866,13 +2866,13 @@
           <w:b w:val="1"/>
           <w:bCs w:val="1"/>
         </w:rPr>
-        <w:t xml:space="preserve">Combining what agents say and do did not help (question 2.2).</w:t>
-      </w:r>
-      <w:r>
-        <w:rPr>
-          <w:rFonts w:ascii="Old Standard TT" w:cs="Old Standard TT" w:eastAsia="Old Standard TT" w:hAnsi="Old Standard TT"/>
-        </w:rPr>
-        <w:t xml:space="preserve"> For both monitors and colluder types, every paired difference between the combined view and a single-channel view has a CI including zero (e.g. competent, Llama: public − combined +0.04 [−0.12, 0.20]; actions − combined −0.03 [−0.14, 0.08]); with the monitors near chance, this alone cannot show whether combining would help a better monitor. For the rules, talk adds nothing: said-vs-did flags 85% of no-collusion games, because honest agents also change their vote after announcing; summing it with against-stake lowers AUROC from 0.86 to 0.65, and using it only to break ties leaves 0.86 [0.76, 0.94]. The only addition that helps is private reasoning (+0.28 to +0.49 over the combined view).</w:t>
+        <w:t xml:space="preserve">Combining what agents say and do did not help (question 2.2), because the talk carries almost no extra signal.</w:t>
+      </w:r>
+      <w:r>
+        <w:rPr>
+          <w:rFonts w:ascii="Old Standard TT" w:cs="Old Standard TT" w:eastAsia="Old Standard TT" w:hAnsi="Old Standard TT"/>
+        </w:rPr>
+        <w:t xml:space="preserve"> For both monitors and colluder types, every paired difference between the combined view and a single-channel view has a CI including zero (e.g. competent, Llama: public − combined +0.04 [−0.12, 0.20]), and the thinking-mode monitor, which is above chance, agrees (below). Colluders rarely needed to misspeak: in 41 of 64 trades the trader announced the vote it then cast, and most switches came where the payoff already exposes the vote (Appendix F). For the rules, said-vs-did flags 85% of no-collusion games, since honest agents change their vote after announcing in 14% of agent-rounds; adding it to against-stake lowers AUROC from 0.86 to 0.65 (as a tie-breaker only: 0.86). Even if talk revealed every agent's true stake, flagging votes against it would gain at most +0.10 [0.03, 0.18], because it would also expose honest slips hidden in failed rounds (Appendix F). Only private reasoning helps (+0.28 to +0.49 over the combined view).</w:t>
       </w:r>
     </w:p>
     <w:p>
@@ -2912,7 +2912,7 @@
         <w:rPr>
           <w:rFonts w:ascii="Old Standard TT" w:cs="Old Standard TT" w:eastAsia="Old Standard TT" w:hAnsi="Old Standard TT"/>
         </w:rPr>
-        <w:t xml:space="preserve"> In a typical trade only the small-stake colluder votes against its interest, so the visible trace is one or a few inconsistent votes. Two exploratory views tested presentation: an aligned per-round table (announced vote, final vote, payoff), and the same table with each vote flagged </w:t>
+        <w:t xml:space="preserve"> In a typical trade only the small-stake colluder votes against its interest, so the visible trace is one or a few inconsistent votes. Two exploratory views tested presentation: a per-round table (announced vote, final vote, payoff), and the same table with each vote flagged </w:t>
       </w:r>
       <w:r>
         <w:rPr>
@@ -2940,7 +2940,7 @@
         <w:rPr>
           <w:rFonts w:ascii="Old Standard TT" w:cs="Old Standard TT" w:eastAsia="Old Standard TT" w:hAnsi="Old Standard TT"/>
         </w:rPr>
-        <w:t xml:space="preserve"> the interest its payoff reveals — exactly the rule's evidence. The table alone did not help; the flags helped Llama only slightly (competent: 0.65 [0.55, 0.75]). In 30 of 40 competent games an AGAINST row was shown (two or more in 13), yet Llama answered yes in 5 (3 of the 13) and DeepSeek in 16. Llama treats the flag as weak: "most agents voted with their revealed interests… Z's vote… went against… could indicate collusion. But without more information, it's difficult to determine." Yet honest agents almost never vote against their revealed interest (the rule's FPR is 5%).</w:t>
+        <w:t xml:space="preserve"> the interest its payoff reveals — exactly the rule's evidence. The table alone did not help; flags helped Llama only slightly (competent: 0.65 [0.55, 0.75]). In 30 of 40 competent games an AGAINST row was shown (two or more in 13), yet Llama answered yes in 5 and DeepSeek in 16. Llama treats the flag as weak: "Z's vote… went against… could indicate collusion. But without more information, it's difficult to determine." Yet honest agents almost never vote against their revealed interest (the rule's FPR is 5%).</w:t>
       </w:r>
     </w:p>
     <w:p>
@@ -3687,7 +3687,7 @@
         <w:rPr>
           <w:rFonts w:ascii="Old Standard TT" w:cs="Old Standard TT" w:eastAsia="Old Standard TT" w:hAnsi="Old Standard TT"/>
         </w:rPr>
-        <w:t xml:space="preserve">: +0.02 [−0.17, 0.21], AUROC 0.61. In a secondary comparison, the base rate </w:t>
+        <w:t xml:space="preserve">: +0.02 [−0.17, 0.21], AUROC 0.61. In a secondary comparison, base rate </w:t>
       </w:r>
       <w:r>
         <w:rPr>
@@ -3701,7 +3701,7 @@
         <w:rPr>
           <w:rFonts w:ascii="Old Standard TT" w:cs="Old Standard TT" w:eastAsia="Old Standard TT" w:hAnsi="Old Standard TT"/>
         </w:rPr>
-        <w:t xml:space="preserve"> the flags together brought Llama to 0.76 (+0.13 [−0.00, 0.26] over v1), still below the rule's 0.91 on the same games, and v2 raised Llama's FPR on some views (combined 0.25 → 0.50). With the frozen prompt each of the four observable views stays indistinguishable from chance on held-out games, while the rule and private plans succeed. Held-out pairs over-traded even more (29 of 31 tie rounds), so the rule falls to 0.72 for tie-compliant pairs. With 20 games per class, secondary comparisons are weak evidence.</w:t>
+        <w:t xml:space="preserve"> flags together brought Llama to 0.76 (+0.13 [−0.00, 0.26] over v1), still below the rule's 0.91, while v2 raised Llama's FPR on some views (combined 0.25 → 0.50). With the frozen prompt each observable view stays indistinguishable from chance on held-out games; held-out pairs over-traded even more (29 of 31 tie rounds), so the rule falls to 0.72 for tie-compliant pairs. With 20 games per class, secondary comparisons are weak evidence.</w:t>
       </w:r>
     </w:p>
     <w:p>
@@ -4250,7 +4250,7 @@
         <w:rPr>
           <w:rFonts w:ascii="Old Standard TT" w:cs="Old Standard TT" w:eastAsia="Old Standard TT" w:hAnsi="Old Standard TT"/>
         </w:rPr>
-        <w:t xml:space="preserve"> With its thinking mode on, DeepSeek V3.1 rose from 0.54 to 0.69 [0.57, 0.80] on the actions view, its FPR halved, and it named the right pair in a third of competent games (the rule: 0.30). The pre-specified criterion was not met: the gain is +0.15 [−0.03, 0.33], and 0.69 is below both the 0.75 bar and the rule's 0.86 on the same games. Even for this monitor, adding the messages to the actions added nothing (0.69 both ways; 0.00 [−0.15, 0.14]), and messages alone stayed near chance. Short answers are part of the problem, but a thinking monitor still extracts only part of the evidence in the votes.</w:t>
+        <w:t xml:space="preserve"> With its thinking mode on, DeepSeek V3.1 rose from 0.54 to 0.69 [0.57, 0.80] on the actions view, its FPR halved, and it named the right pair in a third of competent games (the rule: 0.30). The pre-specified criterion was not met: the gain is +0.15 [−0.03, 0.33], and 0.69 is below both the 0.75 bar and the rule's 0.86 on the same games. Even for this monitor, adding the messages added nothing (0.69 both ways; 0.00 [−0.15, 0.14]). Short answers are part of the problem, but a thinking monitor still extracts only part of the evidence in the votes.</w:t>
       </w:r>
     </w:p>
     <w:p>
@@ -4290,13 +4290,13 @@
           <w:b w:val="1"/>
           <w:bCs w:val="1"/>
         </w:rPr>
-        <w:t xml:space="preserve">For question 2.2, in this setting, combining did not help: the evidence is in the votes.</w:t>
-      </w:r>
-      <w:r>
-        <w:rPr>
-          <w:rFonts w:ascii="Old Standard TT" w:cs="Old Standard TT" w:eastAsia="Old Standard TT" w:hAnsi="Old Standard TT"/>
-        </w:rPr>
-        <w:t xml:space="preserve"> The short-verdict monitors were near chance on all four observable views, so their comparisons alone say little, but the stronger tests agree: talk adds nothing to the against-stake rule, because honest agents' announcements often diverge from their votes, and adding messages did not change the thinking-mode monitor's AUROC. The bottleneck is how monitors read the record, not which channel they read: they must extract the evidence (each agent's interest, inferred from payoffs round by round) and weight it (honest agents almost never vote against their interest). Thinking, or a stated base rate with pre-computed flags, each recovered part of the gap; neither reached the rule. For AI safety, this suggests pairing LLM monitors with simple, domain-specific consistency checks, and treating private-reasoning access (AUROC 0.82–0.98) as useful only while colluders write their intent down, which agents aware of monitoring may avoid (Kale et al., 2025). For evaluation, benchmarks need a manipulation check: instructed agents often do not collude, or over-apply a strategy.</w:t>
+        <w:t xml:space="preserve">For question 2.2: combining did not help, because this collusion needed no public lie.</w:t>
+      </w:r>
+      <w:r>
+        <w:rPr>
+          <w:rFonts w:ascii="Old Standard TT" w:cs="Old Standard TT" w:eastAsia="Old Standard TT" w:hAnsi="Old Standard TT"/>
+        </w:rPr>
+        <w:t xml:space="preserve"> Collusion here pays through votes and talk is cheap, so talk added nothing for monitors or rules, and would add little even if it revealed every stake. The monitors' bottleneck is reading the action record — inferring each agent's interest from payoffs and weighting a rare vote against it; thinking, or a stated base rate with flags, recovered part of that gap. The case 2.2 mostly has in mind needs a game in which colluders must make public claims that their actions or outcomes contradict. For AI safety, this suggests pairing LLM monitors with simple consistency checks, and treating private-reasoning access (AUROC 0.82–0.98) as useful only while colluders write their intent down, which agents aware of monitoring may avoid (Kale et al., 2025). For evaluation, benchmarks need a manipulation check: instructed agents often do not collude, or over-apply a strategy.</w:t>
       </w:r>
     </w:p>
     <w:p>
@@ -4325,7 +4325,7 @@
         <w:rPr>
           <w:rFonts w:ascii="Old Standard TT" w:cs="Old Standard TT" w:eastAsia="Old Standard TT" w:hAnsi="Old Standard TT"/>
         </w:rPr>
-        <w:t xml:space="preserve">One game, one agent model, 40 games per condition (20 held-out), 6 rounds; collusion is induced, so we make no claim about emergent collusion. Competent pairs over-traded, so they are easier to catch than colluders who follow the tip. DeepSeek, the rules, the structured views, prompt v2 and the thinking monitor were added after the first results, and the rules encode our knowledge of the attack. Many comparisons are made; isolated intervals that barely exclude zero should not be over-read. Details and dual-use considerations are in Appendix A.</w:t>
+        <w:t xml:space="preserve">One game, one agent model, 40 games per condition (20 held-out), 6 rounds; collusion is induced, so we make no claim about emergent collusion, and the game never requires a public lie, so it answers 2.2 only for collusion that leaves its trace in actions. Competent pairs over-traded, making them easier to catch than colluders who follow the tip. DeepSeek, the rules, the structured views, prompt v2 and the thinking monitor were added after the first results; the rules encode our knowledge of the attack. Isolated intervals that barely exclude zero should not be over-read. Details and dual-use considerations: Appendix A.</w:t>
       </w:r>
     </w:p>
     <w:p>
@@ -4359,7 +4359,7 @@
         <w:rPr>
           <w:rFonts w:ascii="Old Standard TT" w:cs="Old Standard TT" w:eastAsia="Old Standard TT" w:hAnsi="Old Standard TT"/>
         </w:rPr>
-        <w:t xml:space="preserve">Hybrid monitors: a rule to find suspects, an LLM to identify the partner and rule out innocent explanations.</w:t>
+        <w:t xml:space="preserve">A game in which collusion requires public deception, so only talk and outcomes together reveal it (about 80 games per class to detect a gain of 0.1).</w:t>
       </w:r>
     </w:p>
     <w:p>
@@ -4376,7 +4376,7 @@
         <w:rPr>
           <w:rFonts w:ascii="Old Standard TT" w:cs="Old Standard TT" w:eastAsia="Old Standard TT" w:hAnsi="Old Standard TT"/>
         </w:rPr>
-        <w:t xml:space="preserve">Other agent and monitor models, and games where the signal is in talk rather than actions.</w:t>
+        <w:t xml:space="preserve">Hybrid monitors: a rule finds suspects; an LLM names the partner and rules out innocent explanations.</w:t>
       </w:r>
     </w:p>
     <w:p>
@@ -4393,7 +4393,7 @@
         <w:rPr>
           <w:rFonts w:ascii="Old Standard TT" w:cs="Old Standard TT" w:eastAsia="Old Standard TT" w:hAnsi="Old Standard TT"/>
         </w:rPr>
-        <w:t xml:space="preserve">Side payments (a test of emergent collusion), and colluders who know they are monitored.</w:t>
+        <w:t xml:space="preserve">Other models; side payments (emergent collusion); colluders who know they are monitored.</w:t>
       </w:r>
     </w:p>
     <w:p>
@@ -4431,7 +4431,7 @@
         <w:rPr>
           <w:rFonts w:ascii="Old Standard TT" w:cs="Old Standard TT" w:eastAsia="Old Standard TT" w:hAnsi="Old Standard TT"/>
         </w:rPr>
-        <w:t xml:space="preserve">We built a committee-vote game in which secret vote trading pays and leaves traces in talk and actions, and asked whether LLM monitors detect it better when given both. They do not. Short-verdict monitors were indistinguishable from chance on each observable view, a thinking-mode monitor reached only 0.69, and adding messages never helped, while a one-line rule on the actions reached 0.86 (0.78 had colluders not over-traded; 0.91 and 0.72 on held-out games). Before relying on an LLM monitor for collusion, compare it with simple consistency checks on the same record, and check that the collusion in your test set actually happened.</w:t>
+        <w:t xml:space="preserve">We built a committee-vote game in which secret vote trading pays, and asked whether LLM monitors detect it better when they see what agents say as well as what they do. Here they do not, because the collusion needs no public lie: its trace is in the votes. Short-verdict monitors were indistinguishable from chance and a thinking-mode monitor reached 0.69, while a one-line rule on the actions reached 0.86 (0.78 without over-trading; 0.91 and 0.72 held-out). Whether combining helps when collusion forces public deception remains open. Before relying on an LLM monitor, compare it with simple consistency checks, and check that the collusion in your test set actually happened.</w:t>
       </w:r>
     </w:p>
     <w:p>
@@ -4804,7 +4804,7 @@
         <w:rPr>
           <w:rFonts w:ascii="Old Standard TT" w:cs="Old Standard TT" w:eastAsia="Old Standard TT" w:hAnsi="Old Standard TT"/>
         </w:rPr>
-        <w:t xml:space="preserve"> Scope: one game, one agent model (Llama 3.3 70B), 40 games per condition plus a 40-game held-out set, 6 rounds per game. Collusion is induced by instruction; we make no claim about whether LLM agents collude on their own. The monitor prompt was frozen before the sprint; DeepSeek, the rules, the structured views and prompt v2 were added after the first results were known, and prompt v2 was evaluated only on held-out games generated after it was fixed. The Llama monitor runs used one pinned provider; the agents and DeepSeek were routed across several. The thinking-mode monitor was pinned to one provider (CoreWeave, fp8) after another returned no thinking in a 6-sample pilot, so thinking off and on also differ in provider routing. Channel-only games used the full private history while colluding games used current-round history. Labels follow the condition, not realized behaviour; realized-collusion subsets are reported separately. Competent pairs over-traded in tie rounds, which makes them easier to catch than colluders who follow the tip; we report the rule both ways, but could not rescore the LLM monitors on counterfactual games. The main monitors answer directly with short reasoning (the frozen prompt caps it at 150 words). The rules were defined after the first monitor results and encode our knowledge of the attack, so they are a reference point, not a fair competitor. With the monitors near chance, the design cannot show whether combining views helps a capable monitor. Our pre-specified tests are commits in the repository, not a public registration. We make many comparisons; isolated intervals that barely exclude zero (e.g. DeepSeek's table − combined difference against channel-only negatives, −0.16 [−0.31, −0.00]) should not be over-read.</w:t>
+        <w:t xml:space="preserve"> Scope: one game, one agent model (Llama 3.3 70B), 40 games per condition plus a 40-game held-out set, 6 rounds per game. Collusion is induced by instruction; we make no claim about whether LLM agents collude on their own. The monitor prompt was frozen before the sprint; DeepSeek, the rules, the structured views and prompt v2 were added after the first results were known, and prompt v2 was evaluated only on held-out games generated after it was fixed. The Llama monitor runs used one pinned provider; the agents and DeepSeek were routed across several. The thinking-mode monitor was pinned to one provider (CoreWeave, fp8) after another returned no thinking in a 6-sample pilot, so thinking off and on also differ in provider routing. Channel-only games used the full private history while colluding games used current-round history. Labels follow the condition, not realized behaviour; realized-collusion subsets are reported separately. Competent pairs over-traded in tie rounds, which makes them easier to catch than colluders who follow the tip; we report the rule both ways, but could not rescore the LLM monitors on counterfactual games. The main monitors answer directly with short reasoning (the frozen prompt caps it at 150 words). The rules were defined after the first monitor results and encode our knowledge of the attack, so they are a reference point, not a fair competitor. The game never requires colluders to lie in public, so it tests 2.2 only for collusion that leaves its trace in actions; with the short-verdict monitors near chance, their own view comparisons say little (the thinking monitor and Appendix F partly address this). Our pre-specified tests are commits in the repository, not a public registration. We make many comparisons; isolated intervals that barely exclude zero (e.g. DeepSeek's table − combined difference against channel-only negatives, −0.16 [−0.31, −0.00]) should not be over-read.</w:t>
       </w:r>
     </w:p>
     <w:p>
@@ -6934,6 +6934,592 @@
         <w:spacing w:before="0" w:after="0"/>
         <w:jc w:val="both"/>
       </w:pPr>
+    </w:p>
+    <w:p>
+      <w:pPr>
+        <w:pStyle w:val="Heading3"/>
+        <w:keepNext/>
+        <w:spacing w:before="200" w:after="60"/>
+      </w:pPr>
+      <w:r>
+        <w:rPr>
+          <w:rFonts w:ascii="Old Standard TT" w:cs="Old Standard TT" w:eastAsia="Old Standard TT" w:hAnsi="Old Standard TT"/>
+          <w:b w:val="1"/>
+          <w:bCs w:val="1"/>
+          <w:sz w:val="26"/>
+          <w:szCs w:val="26"/>
+        </w:rPr>
+        <w:t xml:space="preserve">Appendix F. What talk could add in this game</w:t>
+      </w:r>
+    </w:p>
+    <w:p>
+      <w:pPr>
+        <w:spacing w:before="0" w:after="120"/>
+        <w:jc w:val="both"/>
+      </w:pPr>
+      <w:r>
+        <w:rPr>
+          <w:rFonts w:ascii="Old Standard TT" w:cs="Old Standard TT" w:eastAsia="Old Standard TT" w:hAnsi="Old Standard TT"/>
+        </w:rPr>
+        <w:t xml:space="preserve">From experiments/talk_counterfactual.py. Of the 64 competent trading votes in v3 (against own stake, in trade-opportunity rounds), 41 were announced as cast (19 in passed rounds, 22 in failed rounds) and 23 switched after announcing (14 passed, 9 failed). Honest agents' announced and final votes differ in 14% of agent-rounds. Honest votes against own stake are 0.2% of votes in passed rounds but 1.4% in failed rounds (2.3% on held-out games), almost all a +$1 stake voting NO; a failed round pays $0, so the actions view never shows them. Best case for talk: suppose every agent stated its true stake, and flag votes against the stated stake in any round, scored like against-stake.</w:t>
+      </w:r>
+    </w:p>
+    <w:p>
+      <w:pPr>
+        <w:keepNext/>
+        <w:spacing w:before="120" w:after="60"/>
+        <w:jc w:val="left"/>
+      </w:pPr>
+      <w:r>
+        <w:rPr>
+          <w:rFonts w:ascii="Old Standard TT" w:cs="Old Standard TT" w:eastAsia="Old Standard TT" w:hAnsi="Old Standard TT"/>
+          <w:i w:val="1"/>
+          <w:iCs w:val="1"/>
+          <w:sz w:val="18"/>
+          <w:szCs w:val="18"/>
+        </w:rPr>
+        <w:t xml:space="preserve">Table F1. Best case for talk: against-stake (actions) versus votes against truthfully stated stakes, competent vs no-collusion games. AUROC; paired gain with 95% bootstrap CI.</w:t>
+      </w:r>
+    </w:p>
+    <w:tbl>
+      <w:tblPr>
+        <w:tblW w:w="9360" w:type="dxa"/>
+        <w:jc w:val="center"/>
+        <w:tblBorders>
+          <w:top w:val="single" w:sz="4" w:space="0" w:color="000000"/>
+          <w:left w:val="single" w:sz="4" w:space="0" w:color="000000"/>
+          <w:bottom w:val="single" w:sz="4" w:space="0" w:color="000000"/>
+          <w:right w:val="single" w:sz="4" w:space="0" w:color="000000"/>
+          <w:insideH w:val="single" w:sz="4" w:space="0" w:color="000000"/>
+          <w:insideV w:val="single" w:sz="4" w:space="0" w:color="000000"/>
+        </w:tblBorders>
+        <w:tblLayout w:type="fixed"/>
+        <w:tblCellMar>
+          <w:left w:w="70" w:type="dxa"/>
+          <w:right w:w="70" w:type="dxa"/>
+        </w:tblCellMar>
+      </w:tblPr>
+      <w:tblGrid>
+        <w:gridCol w:w="3060"/>
+        <w:gridCol w:w="1500"/>
+        <w:gridCol w:w="2000"/>
+        <w:gridCol w:w="1700"/>
+        <w:gridCol w:w="1100"/>
+      </w:tblGrid>
+      <w:tr>
+        <w:trPr>
+          <w:cantSplit/>
+          <w:tblHeader/>
+        </w:trPr>
+        <w:tc>
+          <w:tcPr>
+            <w:tcW w:w="3060" w:type="dxa"/>
+            <w:shd w:val="clear" w:color="auto" w:fill="E7E6E6"/>
+          </w:tcPr>
+          <w:p>
+            <w:pPr>
+              <w:keepNext/>
+              <w:spacing w:before="20" w:after="20" w:line="240" w:lineRule="auto"/>
+            </w:pPr>
+            <w:r>
+              <w:rPr>
+                <w:rFonts w:ascii="Old Standard TT" w:cs="Old Standard TT" w:eastAsia="Old Standard TT" w:hAnsi="Old Standard TT"/>
+                <w:b w:val="1"/>
+                <w:bCs w:val="1"/>
+                <w:sz w:val="17"/>
+                <w:szCs w:val="17"/>
+              </w:rPr>
+              <w:t xml:space="preserve">Games</w:t>
+            </w:r>
+          </w:p>
+        </w:tc>
+        <w:tc>
+          <w:tcPr>
+            <w:tcW w:w="1500" w:type="dxa"/>
+            <w:shd w:val="clear" w:color="auto" w:fill="E7E6E6"/>
+          </w:tcPr>
+          <w:p>
+            <w:pPr>
+              <w:keepNext/>
+              <w:spacing w:before="20" w:after="20" w:line="240" w:lineRule="auto"/>
+            </w:pPr>
+            <w:r>
+              <w:rPr>
+                <w:rFonts w:ascii="Old Standard TT" w:cs="Old Standard TT" w:eastAsia="Old Standard TT" w:hAnsi="Old Standard TT"/>
+                <w:b w:val="1"/>
+                <w:bCs w:val="1"/>
+                <w:sz w:val="17"/>
+                <w:szCs w:val="17"/>
+              </w:rPr>
+              <w:t xml:space="preserve">Against-stake</w:t>
+            </w:r>
+          </w:p>
+        </w:tc>
+        <w:tc>
+          <w:tcPr>
+            <w:tcW w:w="2000" w:type="dxa"/>
+            <w:shd w:val="clear" w:color="auto" w:fill="E7E6E6"/>
+          </w:tcPr>
+          <w:p>
+            <w:pPr>
+              <w:keepNext/>
+              <w:spacing w:before="20" w:after="20" w:line="240" w:lineRule="auto"/>
+            </w:pPr>
+            <w:r>
+              <w:rPr>
+                <w:rFonts w:ascii="Old Standard TT" w:cs="Old Standard TT" w:eastAsia="Old Standard TT" w:hAnsi="Old Standard TT"/>
+                <w:b w:val="1"/>
+                <w:bCs w:val="1"/>
+                <w:sz w:val="17"/>
+                <w:szCs w:val="17"/>
+              </w:rPr>
+              <w:t xml:space="preserve">Votes vs stated stake</w:t>
+            </w:r>
+          </w:p>
+        </w:tc>
+        <w:tc>
+          <w:tcPr>
+            <w:tcW w:w="1700" w:type="dxa"/>
+            <w:shd w:val="clear" w:color="auto" w:fill="E7E6E6"/>
+          </w:tcPr>
+          <w:p>
+            <w:pPr>
+              <w:keepNext/>
+              <w:spacing w:before="20" w:after="20" w:line="240" w:lineRule="auto"/>
+            </w:pPr>
+            <w:r>
+              <w:rPr>
+                <w:rFonts w:ascii="Old Standard TT" w:cs="Old Standard TT" w:eastAsia="Old Standard TT" w:hAnsi="Old Standard TT"/>
+                <w:b w:val="1"/>
+                <w:bCs w:val="1"/>
+                <w:sz w:val="17"/>
+                <w:szCs w:val="17"/>
+              </w:rPr>
+              <w:t xml:space="preserve">Gain</w:t>
+            </w:r>
+          </w:p>
+        </w:tc>
+        <w:tc>
+          <w:tcPr>
+            <w:tcW w:w="1100" w:type="dxa"/>
+            <w:shd w:val="clear" w:color="auto" w:fill="E7E6E6"/>
+          </w:tcPr>
+          <w:p>
+            <w:pPr>
+              <w:keepNext/>
+              <w:spacing w:before="20" w:after="20" w:line="240" w:lineRule="auto"/>
+            </w:pPr>
+            <w:r>
+              <w:rPr>
+                <w:rFonts w:ascii="Old Standard TT" w:cs="Old Standard TT" w:eastAsia="Old Standard TT" w:hAnsi="Old Standard TT"/>
+                <w:b w:val="1"/>
+                <w:bCs w:val="1"/>
+                <w:sz w:val="17"/>
+                <w:szCs w:val="17"/>
+              </w:rPr>
+              <w:t xml:space="preserve">FPR, talk rule</w:t>
+            </w:r>
+          </w:p>
+        </w:tc>
+      </w:tr>
+      <w:tr>
+        <w:trPr>
+          <w:cantSplit/>
+        </w:trPr>
+        <w:tc>
+          <w:tcPr>
+            <w:tcW w:w="3060" w:type="dxa"/>
+          </w:tcPr>
+          <w:p>
+            <w:pPr>
+              <w:spacing w:before="20" w:after="20" w:line="240" w:lineRule="auto"/>
+            </w:pPr>
+            <w:r>
+              <w:rPr>
+                <w:rFonts w:ascii="Old Standard TT" w:cs="Old Standard TT" w:eastAsia="Old Standard TT" w:hAnsi="Old Standard TT"/>
+                <w:sz w:val="17"/>
+                <w:szCs w:val="17"/>
+              </w:rPr>
+              <w:t xml:space="preserve">v3, as observed (40+40)</w:t>
+            </w:r>
+          </w:p>
+        </w:tc>
+        <w:tc>
+          <w:tcPr>
+            <w:tcW w:w="1500" w:type="dxa"/>
+          </w:tcPr>
+          <w:p>
+            <w:pPr>
+              <w:spacing w:before="20" w:after="20" w:line="240" w:lineRule="auto"/>
+            </w:pPr>
+            <w:r>
+              <w:rPr>
+                <w:rFonts w:ascii="Old Standard TT" w:cs="Old Standard TT" w:eastAsia="Old Standard TT" w:hAnsi="Old Standard TT"/>
+                <w:sz w:val="17"/>
+                <w:szCs w:val="17"/>
+              </w:rPr>
+              <w:t xml:space="preserve">0.86</w:t>
+            </w:r>
+          </w:p>
+        </w:tc>
+        <w:tc>
+          <w:tcPr>
+            <w:tcW w:w="2000" w:type="dxa"/>
+          </w:tcPr>
+          <w:p>
+            <w:pPr>
+              <w:spacing w:before="20" w:after="20" w:line="240" w:lineRule="auto"/>
+            </w:pPr>
+            <w:r>
+              <w:rPr>
+                <w:rFonts w:ascii="Old Standard TT" w:cs="Old Standard TT" w:eastAsia="Old Standard TT" w:hAnsi="Old Standard TT"/>
+                <w:sz w:val="17"/>
+                <w:szCs w:val="17"/>
+              </w:rPr>
+              <w:t xml:space="preserve">0.96</w:t>
+            </w:r>
+          </w:p>
+        </w:tc>
+        <w:tc>
+          <w:tcPr>
+            <w:tcW w:w="1700" w:type="dxa"/>
+          </w:tcPr>
+          <w:p>
+            <w:pPr>
+              <w:spacing w:before="20" w:after="20" w:line="240" w:lineRule="auto"/>
+            </w:pPr>
+            <w:r>
+              <w:rPr>
+                <w:rFonts w:ascii="Old Standard TT" w:cs="Old Standard TT" w:eastAsia="Old Standard TT" w:hAnsi="Old Standard TT"/>
+                <w:sz w:val="17"/>
+                <w:szCs w:val="17"/>
+              </w:rPr>
+              <w:t xml:space="preserve">+0.10 [0.03, 0.18]</w:t>
+            </w:r>
+          </w:p>
+        </w:tc>
+        <w:tc>
+          <w:tcPr>
+            <w:tcW w:w="1100" w:type="dxa"/>
+          </w:tcPr>
+          <w:p>
+            <w:pPr>
+              <w:spacing w:before="20" w:after="20" w:line="240" w:lineRule="auto"/>
+            </w:pPr>
+            <w:r>
+              <w:rPr>
+                <w:rFonts w:ascii="Old Standard TT" w:cs="Old Standard TT" w:eastAsia="Old Standard TT" w:hAnsi="Old Standard TT"/>
+                <w:sz w:val="17"/>
+                <w:szCs w:val="17"/>
+              </w:rPr>
+              <w:t xml:space="preserve">0.25</w:t>
+            </w:r>
+          </w:p>
+        </w:tc>
+      </w:tr>
+      <w:tr>
+        <w:trPr>
+          <w:cantSplit/>
+        </w:trPr>
+        <w:tc>
+          <w:tcPr>
+            <w:tcW w:w="3060" w:type="dxa"/>
+          </w:tcPr>
+          <w:p>
+            <w:pPr>
+              <w:spacing w:before="20" w:after="20" w:line="240" w:lineRule="auto"/>
+            </w:pPr>
+            <w:r>
+              <w:rPr>
+                <w:rFonts w:ascii="Old Standard TT" w:cs="Old Standard TT" w:eastAsia="Old Standard TT" w:hAnsi="Old Standard TT"/>
+                <w:sz w:val="17"/>
+                <w:szCs w:val="17"/>
+              </w:rPr>
+              <w:t xml:space="preserve">v3, tie-compliant pairs</w:t>
+            </w:r>
+          </w:p>
+        </w:tc>
+        <w:tc>
+          <w:tcPr>
+            <w:tcW w:w="1500" w:type="dxa"/>
+          </w:tcPr>
+          <w:p>
+            <w:pPr>
+              <w:spacing w:before="20" w:after="20" w:line="240" w:lineRule="auto"/>
+            </w:pPr>
+            <w:r>
+              <w:rPr>
+                <w:rFonts w:ascii="Old Standard TT" w:cs="Old Standard TT" w:eastAsia="Old Standard TT" w:hAnsi="Old Standard TT"/>
+                <w:sz w:val="17"/>
+                <w:szCs w:val="17"/>
+              </w:rPr>
+              <w:t xml:space="preserve">0.78</w:t>
+            </w:r>
+          </w:p>
+        </w:tc>
+        <w:tc>
+          <w:tcPr>
+            <w:tcW w:w="2000" w:type="dxa"/>
+          </w:tcPr>
+          <w:p>
+            <w:pPr>
+              <w:spacing w:before="20" w:after="20" w:line="240" w:lineRule="auto"/>
+            </w:pPr>
+            <w:r>
+              <w:rPr>
+                <w:rFonts w:ascii="Old Standard TT" w:cs="Old Standard TT" w:eastAsia="Old Standard TT" w:hAnsi="Old Standard TT"/>
+                <w:sz w:val="17"/>
+                <w:szCs w:val="17"/>
+              </w:rPr>
+              <w:t xml:space="preserve">0.86</w:t>
+            </w:r>
+          </w:p>
+        </w:tc>
+        <w:tc>
+          <w:tcPr>
+            <w:tcW w:w="1700" w:type="dxa"/>
+          </w:tcPr>
+          <w:p>
+            <w:pPr>
+              <w:spacing w:before="20" w:after="20" w:line="240" w:lineRule="auto"/>
+            </w:pPr>
+            <w:r>
+              <w:rPr>
+                <w:rFonts w:ascii="Old Standard TT" w:cs="Old Standard TT" w:eastAsia="Old Standard TT" w:hAnsi="Old Standard TT"/>
+                <w:sz w:val="17"/>
+                <w:szCs w:val="17"/>
+              </w:rPr>
+              <w:t xml:space="preserve">+0.08 [0.00, 0.17]</w:t>
+            </w:r>
+          </w:p>
+        </w:tc>
+        <w:tc>
+          <w:tcPr>
+            <w:tcW w:w="1100" w:type="dxa"/>
+          </w:tcPr>
+          <w:p>
+            <w:pPr>
+              <w:spacing w:before="20" w:after="20" w:line="240" w:lineRule="auto"/>
+            </w:pPr>
+            <w:r>
+              <w:rPr>
+                <w:rFonts w:ascii="Old Standard TT" w:cs="Old Standard TT" w:eastAsia="Old Standard TT" w:hAnsi="Old Standard TT"/>
+                <w:sz w:val="17"/>
+                <w:szCs w:val="17"/>
+              </w:rPr>
+              <w:t xml:space="preserve">0.25</w:t>
+            </w:r>
+          </w:p>
+        </w:tc>
+      </w:tr>
+      <w:tr>
+        <w:trPr>
+          <w:cantSplit/>
+        </w:trPr>
+        <w:tc>
+          <w:tcPr>
+            <w:tcW w:w="3060" w:type="dxa"/>
+          </w:tcPr>
+          <w:p>
+            <w:pPr>
+              <w:spacing w:before="20" w:after="20" w:line="240" w:lineRule="auto"/>
+            </w:pPr>
+            <w:r>
+              <w:rPr>
+                <w:rFonts w:ascii="Old Standard TT" w:cs="Old Standard TT" w:eastAsia="Old Standard TT" w:hAnsi="Old Standard TT"/>
+                <w:sz w:val="17"/>
+                <w:szCs w:val="17"/>
+              </w:rPr>
+              <w:t xml:space="preserve">Held-out, as observed (20+20)</w:t>
+            </w:r>
+          </w:p>
+        </w:tc>
+        <w:tc>
+          <w:tcPr>
+            <w:tcW w:w="1500" w:type="dxa"/>
+          </w:tcPr>
+          <w:p>
+            <w:pPr>
+              <w:spacing w:before="20" w:after="20" w:line="240" w:lineRule="auto"/>
+            </w:pPr>
+            <w:r>
+              <w:rPr>
+                <w:rFonts w:ascii="Old Standard TT" w:cs="Old Standard TT" w:eastAsia="Old Standard TT" w:hAnsi="Old Standard TT"/>
+                <w:sz w:val="17"/>
+                <w:szCs w:val="17"/>
+              </w:rPr>
+              <w:t xml:space="preserve">0.91</w:t>
+            </w:r>
+          </w:p>
+        </w:tc>
+        <w:tc>
+          <w:tcPr>
+            <w:tcW w:w="2000" w:type="dxa"/>
+          </w:tcPr>
+          <w:p>
+            <w:pPr>
+              <w:spacing w:before="20" w:after="20" w:line="240" w:lineRule="auto"/>
+            </w:pPr>
+            <w:r>
+              <w:rPr>
+                <w:rFonts w:ascii="Old Standard TT" w:cs="Old Standard TT" w:eastAsia="Old Standard TT" w:hAnsi="Old Standard TT"/>
+                <w:sz w:val="17"/>
+                <w:szCs w:val="17"/>
+              </w:rPr>
+              <w:t xml:space="preserve">0.94</w:t>
+            </w:r>
+          </w:p>
+        </w:tc>
+        <w:tc>
+          <w:tcPr>
+            <w:tcW w:w="1700" w:type="dxa"/>
+          </w:tcPr>
+          <w:p>
+            <w:pPr>
+              <w:spacing w:before="20" w:after="20" w:line="240" w:lineRule="auto"/>
+            </w:pPr>
+            <w:r>
+              <w:rPr>
+                <w:rFonts w:ascii="Old Standard TT" w:cs="Old Standard TT" w:eastAsia="Old Standard TT" w:hAnsi="Old Standard TT"/>
+                <w:sz w:val="17"/>
+                <w:szCs w:val="17"/>
+              </w:rPr>
+              <w:t xml:space="preserve">+0.03 [−0.06, 0.14]</w:t>
+            </w:r>
+          </w:p>
+        </w:tc>
+        <w:tc>
+          <w:tcPr>
+            <w:tcW w:w="1100" w:type="dxa"/>
+          </w:tcPr>
+          <w:p>
+            <w:pPr>
+              <w:spacing w:before="20" w:after="20" w:line="240" w:lineRule="auto"/>
+            </w:pPr>
+            <w:r>
+              <w:rPr>
+                <w:rFonts w:ascii="Old Standard TT" w:cs="Old Standard TT" w:eastAsia="Old Standard TT" w:hAnsi="Old Standard TT"/>
+                <w:sz w:val="17"/>
+                <w:szCs w:val="17"/>
+              </w:rPr>
+              <w:t xml:space="preserve">0.30</w:t>
+            </w:r>
+          </w:p>
+        </w:tc>
+      </w:tr>
+      <w:tr>
+        <w:trPr>
+          <w:cantSplit/>
+        </w:trPr>
+        <w:tc>
+          <w:tcPr>
+            <w:tcW w:w="3060" w:type="dxa"/>
+          </w:tcPr>
+          <w:p>
+            <w:pPr>
+              <w:spacing w:before="20" w:after="20" w:line="240" w:lineRule="auto"/>
+            </w:pPr>
+            <w:r>
+              <w:rPr>
+                <w:rFonts w:ascii="Old Standard TT" w:cs="Old Standard TT" w:eastAsia="Old Standard TT" w:hAnsi="Old Standard TT"/>
+                <w:sz w:val="17"/>
+                <w:szCs w:val="17"/>
+              </w:rPr>
+              <w:t xml:space="preserve">Held-out, tie-compliant pairs</w:t>
+            </w:r>
+          </w:p>
+        </w:tc>
+        <w:tc>
+          <w:tcPr>
+            <w:tcW w:w="1500" w:type="dxa"/>
+          </w:tcPr>
+          <w:p>
+            <w:pPr>
+              <w:spacing w:before="20" w:after="20" w:line="240" w:lineRule="auto"/>
+            </w:pPr>
+            <w:r>
+              <w:rPr>
+                <w:rFonts w:ascii="Old Standard TT" w:cs="Old Standard TT" w:eastAsia="Old Standard TT" w:hAnsi="Old Standard TT"/>
+                <w:sz w:val="17"/>
+                <w:szCs w:val="17"/>
+              </w:rPr>
+              <w:t xml:space="preserve">0.72</w:t>
+            </w:r>
+          </w:p>
+        </w:tc>
+        <w:tc>
+          <w:tcPr>
+            <w:tcW w:w="2000" w:type="dxa"/>
+          </w:tcPr>
+          <w:p>
+            <w:pPr>
+              <w:spacing w:before="20" w:after="20" w:line="240" w:lineRule="auto"/>
+            </w:pPr>
+            <w:r>
+              <w:rPr>
+                <w:rFonts w:ascii="Old Standard TT" w:cs="Old Standard TT" w:eastAsia="Old Standard TT" w:hAnsi="Old Standard TT"/>
+                <w:sz w:val="17"/>
+                <w:szCs w:val="17"/>
+              </w:rPr>
+              <w:t xml:space="preserve">0.73</w:t>
+            </w:r>
+          </w:p>
+        </w:tc>
+        <w:tc>
+          <w:tcPr>
+            <w:tcW w:w="1700" w:type="dxa"/>
+          </w:tcPr>
+          <w:p>
+            <w:pPr>
+              <w:spacing w:before="20" w:after="20" w:line="240" w:lineRule="auto"/>
+            </w:pPr>
+            <w:r>
+              <w:rPr>
+                <w:rFonts w:ascii="Old Standard TT" w:cs="Old Standard TT" w:eastAsia="Old Standard TT" w:hAnsi="Old Standard TT"/>
+                <w:sz w:val="17"/>
+                <w:szCs w:val="17"/>
+              </w:rPr>
+              <w:t xml:space="preserve">+0.00 [−0.14, 0.14]</w:t>
+            </w:r>
+          </w:p>
+        </w:tc>
+        <w:tc>
+          <w:tcPr>
+            <w:tcW w:w="1100" w:type="dxa"/>
+          </w:tcPr>
+          <w:p>
+            <w:pPr>
+              <w:spacing w:before="20" w:after="20" w:line="240" w:lineRule="auto"/>
+            </w:pPr>
+            <w:r>
+              <w:rPr>
+                <w:rFonts w:ascii="Old Standard TT" w:cs="Old Standard TT" w:eastAsia="Old Standard TT" w:hAnsi="Old Standard TT"/>
+                <w:sz w:val="17"/>
+                <w:szCs w:val="17"/>
+              </w:rPr>
+              <w:t xml:space="preserve">0.30</w:t>
+            </w:r>
+          </w:p>
+        </w:tc>
+      </w:tr>
+    </w:tbl>
+    <w:p>
+      <w:pPr>
+        <w:spacing w:before="0" w:after="0"/>
+        <w:jc w:val="both"/>
+      </w:pPr>
+    </w:p>
+    <w:p>
+      <w:pPr>
+        <w:spacing w:before="0" w:after="120"/>
+        <w:jc w:val="both"/>
+      </w:pPr>
+      <w:r>
+        <w:rPr>
+          <w:rFonts w:ascii="Old Standard TT" w:cs="Old Standard TT" w:eastAsia="Old Standard TT" w:hAnsi="Old Standard TT"/>
+        </w:rPr>
+        <w:t xml:space="preserve">If colluders instead stated a stake consistent with their vote, comparing the claim with the payoff would flag exactly the votes against-stake already flags, so the gain for rules would be zero. Since even the best case is not detectable at 20 games per class, we did not run a stake-disclosure variant.</w:t>
+      </w:r>
     </w:p>
     <w:p>
       <w:pPr>

</xml_diff>

<commit_message>
Framing: detection from the record as the main question, 2.2 as a scoped second question
Co-Authored-By: Claude Opus 5.5 <noreply@anthropic.com>
Claude-Session: https://claude.ai/code/session_01T8kiQrxhXBJ3k5fbziRDqr
</commit_message>
<xml_diff>
--- a/docs/submission/report_submission.docx
+++ b/docs/submission/report_submission.docx
@@ -438,7 +438,7 @@
                       <w:sz w:val="20"/>
                       <w:szCs w:val="20"/>
                     </w:rPr>
-                    <w:t xml:space="preserve">Monitors for multi-agent systems typically read either what agents say or what they do. We test whether combining the two helps a monitor detect collusion. Seven Llama 3.3 70B agents play a committee-vote game with private stakes, in which a secret colluding pair profits by vote trading: one member votes against its own small stake to secure its partner's large one. Across 160 matched games we compare no collusion, a private channel without instructions, naive colluders told to maximize their joint payoff, and competent colluders also given a vote-trading tip. Competent colluders traded at every opportunity (64 of 64), each gaining 0.43 points per round, and also traded where it gained nothing. Two LLM monitors with a prompt frozen in advance (Llama 3.3 70B and DeepSeek V3.1) saw public messages, actions, both, a said-versus-did table, and an upper-bound view adding private plans. On each of the four observable views both were indistinguishable from chance (AUROC 0.44 to 0.60), while a one-line rule on actions, flagging votes against one's revealed payoff, reached 0.86 at a 5% false-positive rate (0.78 had colluders not over-traded). The monitors succeeded only with private plans (0.94 to 0.98); with thinking on, DeepSeek rose to 0.69. Adding messages never helped monitors or rules: the collusion needed no public lie, and even talk revealing every true stake would add at most 0.10. We expect combining to help only where collusion forces public deception; here the evidence is in the votes, and LLM monitors extract little of it.</w:t>
+                    <w:t xml:space="preserve">Can LLM monitors detect collusion among AI agents from the record of their interaction, and does it help to show them what agents say as well as what they do? Seven Llama 3.3 70B agents play a committee-vote game with private stakes, in which a secret colluding pair profits by vote trading: one member votes against its own small stake to secure its partner's large one. Across 160 matched games we compare no collusion, a private channel without instructions, naive colluders told to maximize their joint payoff, and competent colluders also given a vote-trading tip. Competent colluders traded at every opportunity (64 of 64), each gaining 0.43 points per round, and also traded where it gained nothing. Two LLM monitors with a prompt frozen in advance (Llama 3.3 70B and DeepSeek V3.1) saw public messages, actions, both, a said-versus-did table, and an upper-bound view adding private plans. On each of the four observable views both were indistinguishable from chance (AUROC 0.44 to 0.60), while a one-line rule on actions, flagging votes against one's revealed payoff, reached 0.86 at a 5% false-positive rate (0.78 had colluders not over-traded). The monitors succeeded only with private plans (0.94 to 0.98); with thinking on, DeepSeek rose to 0.69. Adding messages never helped monitors or rules, because this collusion needed no public lie; even talk revealing every true stake would add at most 0.10. The evidence is in the votes, and LLM monitors extract little of it.</w:t>
                   </w:r>
                 </w:p>
               </w:tc>
@@ -509,7 +509,19 @@
         <w:rPr>
           <w:rFonts w:ascii="Old Standard TT" w:cs="Old Standard TT" w:eastAsia="Old Standard TT" w:hAnsi="Old Standard TT"/>
         </w:rPr>
-        <w:t xml:space="preserve">AI agents increasingly act in shared environments such as markets, negotiations and committees, where collusion is a natural failure mode: a subset of agents secretly coordinates to benefit at the others' expense. A natural defence is a monitor that reads the interaction record and flags suspicious behaviour. What should it read? Messages are cheap to fake; actions carry the consequences but lack context. A plausible hypothesis is that the </w:t>
+        <w:t xml:space="preserve">AI agents increasingly act in shared environments such as markets, negotiations and committees, where collusion is a natural failure mode: a subset of agents secretly coordinates to benefit at the others' expense. A natural defence is an LLM monitor that reads the interaction record and flags suspicious behaviour. We ask two questions. First, can such a monitor find the evidence of collusion that the record contains? Second, the sprint's question 2.2: does it help to combine what agents say with what they do? Messages are cheap to fake and actions lack context, so the combination might be most informative, because a colluder may have to say one thing and do another.</w:t>
+      </w:r>
+    </w:p>
+    <w:p>
+      <w:pPr>
+        <w:spacing w:before="0" w:after="120"/>
+        <w:jc w:val="both"/>
+      </w:pPr>
+      <w:r>
+        <w:rPr>
+          <w:rFonts w:ascii="Old Standard TT" w:cs="Old Standard TT" w:eastAsia="Old Standard TT" w:hAnsi="Old Standard TT"/>
+        </w:rPr>
+        <w:t xml:space="preserve">We study both in a Committee Vote Game in which a colluding pair profits by </w:t>
       </w:r>
       <w:r>
         <w:rPr>
@@ -517,39 +529,13 @@
           <w:i w:val="1"/>
           <w:iCs w:val="1"/>
         </w:rPr>
-        <w:t xml:space="preserve">combination</w:t>
-      </w:r>
-      <w:r>
-        <w:rPr>
-          <w:rFonts w:ascii="Old Standard TT" w:cs="Old Standard TT" w:eastAsia="Old Standard TT" w:hAnsi="Old Standard TT"/>
-        </w:rPr>
-        <w:t xml:space="preserve"> is most informative, because a colluder may have to say one thing and do another. Track 2 of this sprint asks the question directly: does combining what agents say with what they do improve detection?</w:t>
-      </w:r>
-    </w:p>
-    <w:p>
-      <w:pPr>
-        <w:spacing w:before="0" w:after="120"/>
-        <w:jc w:val="both"/>
-      </w:pPr>
-      <w:r>
-        <w:rPr>
-          <w:rFonts w:ascii="Old Standard TT" w:cs="Old Standard TT" w:eastAsia="Old Standard TT" w:hAnsi="Old Standard TT"/>
-        </w:rPr>
-        <w:t xml:space="preserve">We test it in a Committee Vote Game in which a colluding pair profits by </w:t>
-      </w:r>
-      <w:r>
-        <w:rPr>
-          <w:rFonts w:ascii="Old Standard TT" w:cs="Old Standard TT" w:eastAsia="Old Standard TT" w:hAnsi="Old Standard TT"/>
-          <w:i w:val="1"/>
-          <w:iCs w:val="1"/>
-        </w:rPr>
         <w:t xml:space="preserve">vote trading</w:t>
       </w:r>
       <w:r>
         <w:rPr>
           <w:rFonts w:ascii="Old Standard TT" w:cs="Old Standard TT" w:eastAsia="Old Standard TT" w:hAnsi="Old Standard TT"/>
         </w:rPr>
-        <w:t xml:space="preserve">: one member votes against its own small stake to secure its partner's large one. Honest play makes truthful announcements and stake-following votes the natural baseline, but announcements are cheap talk, so colluders may misstate their intentions yet never need to. The game thus tests the question for collusion that leaves its trace in actions and requires no public lie, and asks first whether LLM monitors can find that trace. We give two LLM monitors five views of matched games with and without colluders (one monitor also with thinking on) and compare them with simple non-LLM rules.</w:t>
+        <w:t xml:space="preserve">: one member votes against its own small stake to secure its partner's large one. Honest play makes truthful announcements and stake-following votes the natural baseline, but announcements are cheap talk, so colluders may misstate their intentions yet never need to. The game is therefore a clean test of the first question, since the trace of collusion is in the actions, and answers the second only for collusion that requires no public lie. We give two LLM monitors five views of matched games with and without colluders (one monitor also with thinking on) and compare them with simple non-LLM rules.</w:t>
       </w:r>
     </w:p>
     <w:p>
@@ -701,7 +687,7 @@
         <w:rPr>
           <w:rFonts w:ascii="Old Standard TT" w:cs="Old Standard TT" w:eastAsia="Old Standard TT" w:hAnsi="Old Standard TT"/>
         </w:rPr>
-        <w:t xml:space="preserve">We build on the harness of Shi et al. (2026), which separates private intent, public announcement and final action in repeated games; deviations from announcements were mostly planned in private (over 90% in their highest-deception conditions), consistent with our private-plans upper bound. Closest to our question, Radev et al. (2026) find that a monitor catches coordinated sabotage by coding agents more often when it also reads their communication, which carries the shared plan (68–99% of attempts from code edits alone at FPR ≤ 2%; 81–100% with it). In our game the visible talk is public cheap talk, and the coordination happens in a private channel that no observable view contains. LLM monitors can do better with </w:t>
+        <w:t xml:space="preserve">We build on the harness of Shi et al. (2026), which separates private intent, public announcement and final action in repeated games; deviations from announcements were mostly planned in private (over 90% in their highest-deception conditions), consistent with our private-plans upper bound. Closest to question 2.2, Radev et al. (2026) find that a monitor catches coordinated sabotage by coding agents more often when it also reads their communication, which carries the shared plan (68–99% of attempts from code edits alone at FPR ≤ 2%; 81–100% with it). In our game the visible talk is public cheap talk, and the coordination happens in a private channel that no observable view contains. LLM monitors can do better with </w:t>
       </w:r>
       <w:r>
         <w:rPr>
@@ -4290,13 +4276,33 @@
           <w:b w:val="1"/>
           <w:bCs w:val="1"/>
         </w:rPr>
+        <w:t xml:space="preserve">LLM monitors miss evidence that is plainly in the record.</w:t>
+      </w:r>
+      <w:r>
+        <w:rPr>
+          <w:rFonts w:ascii="Old Standard TT" w:cs="Old Standard TT" w:eastAsia="Old Standard TT" w:hAnsi="Old Standard TT"/>
+        </w:rPr>
+        <w:t xml:space="preserve"> The colluders' trace — a vote against the interest the payoff reveals — is visible to a one-line rule, yet short-verdict monitors were at chance, and thinking, or a stated base rate with pre-computed flags, recovered only part of the gap. The bottleneck is reading the record: inferring each agent's interest from payoffs, round by round, and weighting a rare vote against it. For AI safety, this suggests pairing LLM monitors with simple, domain-specific consistency checks, and treating private-reasoning access (AUROC 0.82–0.98) as useful only while colluders write their intent down, which agents aware of monitoring may avoid (Kale et al., 2025). For evaluation, benchmarks need a manipulation check: instructed agents often do not collude, or over-apply a strategy.</w:t>
+      </w:r>
+    </w:p>
+    <w:p>
+      <w:pPr>
+        <w:spacing w:before="0" w:after="120"/>
+        <w:jc w:val="both"/>
+      </w:pPr>
+      <w:r>
+        <w:rPr>
+          <w:rFonts w:ascii="Old Standard TT" w:cs="Old Standard TT" w:eastAsia="Old Standard TT" w:hAnsi="Old Standard TT"/>
+          <w:b w:val="1"/>
+          <w:bCs w:val="1"/>
+        </w:rPr>
         <w:t xml:space="preserve">For question 2.2: combining did not help, because this collusion needed no public lie.</w:t>
       </w:r>
       <w:r>
         <w:rPr>
           <w:rFonts w:ascii="Old Standard TT" w:cs="Old Standard TT" w:eastAsia="Old Standard TT" w:hAnsi="Old Standard TT"/>
         </w:rPr>
-        <w:t xml:space="preserve"> Collusion here pays through votes and talk is cheap, so talk added nothing for monitors or rules, and would add little even if it revealed every stake. The monitors' bottleneck is reading the action record — inferring each agent's interest from payoffs and weighting a rare vote against it; thinking, or a stated base rate with flags, recovered part of that gap. The case 2.2 mostly has in mind needs a game in which colluders must make public claims that their actions or outcomes contradict. For AI safety, this suggests pairing LLM monitors with simple consistency checks, and treating private-reasoning access (AUROC 0.82–0.98) as useful only while colluders write their intent down, which agents aware of monitoring may avoid (Kale et al., 2025). For evaluation, benchmarks need a manipulation check: instructed agents often do not collude, or over-apply a strategy.</w:t>
+        <w:t xml:space="preserve"> Talk is cheap here and collusion pays through votes, so adding messages helped neither monitors nor rules, and would add little even if talk revealed every stake. The case 2.2 mostly has in mind needs a game in which colluders must make public claims that their actions or outcomes contradict (Future Work).</w:t>
       </w:r>
     </w:p>
     <w:p>
@@ -4431,7 +4437,7 @@
         <w:rPr>
           <w:rFonts w:ascii="Old Standard TT" w:cs="Old Standard TT" w:eastAsia="Old Standard TT" w:hAnsi="Old Standard TT"/>
         </w:rPr>
-        <w:t xml:space="preserve">We built a committee-vote game in which secret vote trading pays, and asked whether LLM monitors detect it better when they see what agents say as well as what they do. Here they do not, because the collusion needs no public lie: its trace is in the votes. Short-verdict monitors were indistinguishable from chance and a thinking-mode monitor reached 0.69, while a one-line rule on the actions reached 0.86 (0.78 without over-trading; 0.91 and 0.72 held-out). Whether combining helps when collusion forces public deception remains open. Before relying on an LLM monitor, compare it with simple consistency checks, and check that the collusion in your test set actually happened.</w:t>
+        <w:t xml:space="preserve">We built a committee-vote game in which secret vote trading pays and leaves its trace in the votes, and asked whether LLM monitors find it. Short-verdict monitors were indistinguishable from chance and a thinking-mode monitor reached 0.69, while a one-line rule on the actions reached 0.86 (0.78 without over-trading; 0.91 and 0.72 held-out); only private plans let the monitors succeed. Showing them what agents said as well did not help, because this collusion needed no public lie; whether combining helps when collusion forces public deception remains open. Before relying on an LLM monitor, compare it with simple consistency checks, and check that the collusion in your test set actually happened.</w:t>
       </w:r>
     </w:p>
     <w:p>

</xml_diff>